<commit_message>
Add Tower of Hanoi feature and improve Fibonacci timing
Introduced TowerOfHanoi and TowerOfHanoiScreen classes to demonstrate the Tower of Hanoi problem with 3, 4, and 5 disks. Updated MainScreen to launch the new TowerOfHanoiScreen. Refactored Fibonacci.compareFibonacciMethodTimes to run timing comparisons in parallel threads for better performance measurement, and adjusted the test value in FibonacciScreen from 60 to 40 for practicality. Updated .gitignore to exclude a new temp file.
</commit_message>
<xml_diff>
--- a/Modules/Semester_1/Modern Code/Aufgaben/06_Recursion/Protocol.docx
+++ b/Modules/Semester_1/Modern Code/Aufgaben/06_Recursion/Protocol.docx
@@ -3149,6 +3149,21 @@
       <w:bookmarkEnd w:id="3"/>
     </w:p>
     <w:p>
+      <w:r>
+        <w:t xml:space="preserve">The iterative approach to Fibonacci is simple, just set up the starting variables, then loop and add the previous results. </w:t>
+      </w:r>
+    </w:p>
+    <w:p>
+      <w:r>
+        <w:t>The recursive approach is also really simple. The base case is n &lt;= 1 and I return the recursive method with n -1 added with n – 2.</w:t>
+      </w:r>
+    </w:p>
+    <w:p>
+      <w:r>
+        <w:t>The memoized approach uses an external array that gets passed along. First I check if n is outside the bounds of the array, then I check is the value for n is already calculated, otherwise is calculate the value and add it to the array.</w:t>
+      </w:r>
+    </w:p>
+    <w:p>
       <w:pPr>
         <w:pStyle w:val="Heading2"/>
       </w:pPr>
@@ -3160,12 +3175,755 @@
     </w:p>
     <w:p>
       <w:pPr>
+        <w:pStyle w:val="Pseoudocode"/>
+      </w:pPr>
+      <w:r>
+        <w:t>public int fibonacciIterative(int n)</w:t>
+      </w:r>
+      <w:r>
+        <w:br/>
+        <w:t>{</w:t>
+      </w:r>
+      <w:r>
+        <w:br/>
+        <w:t xml:space="preserve">    int a = 0, b = 1, c = 1;</w:t>
+      </w:r>
+      <w:r>
+        <w:br/>
+      </w:r>
+      <w:r>
+        <w:br/>
+        <w:t xml:space="preserve">    if (n == 0)</w:t>
+      </w:r>
+      <w:r>
+        <w:br/>
+        <w:t xml:space="preserve">        return a;</w:t>
+      </w:r>
+      <w:r>
+        <w:br/>
+      </w:r>
+      <w:r>
+        <w:br/>
+        <w:t xml:space="preserve">    if (n == 1)</w:t>
+      </w:r>
+      <w:r>
+        <w:br/>
+        <w:t xml:space="preserve">        return b;</w:t>
+      </w:r>
+      <w:r>
+        <w:br/>
+      </w:r>
+      <w:r>
+        <w:br/>
+        <w:t xml:space="preserve">    for (int i = 2; i &lt;= n; i++)</w:t>
+      </w:r>
+      <w:r>
+        <w:br/>
+        <w:t xml:space="preserve">    {</w:t>
+      </w:r>
+      <w:r>
+        <w:br/>
+        <w:t xml:space="preserve">        c = a + b;</w:t>
+      </w:r>
+      <w:r>
+        <w:br/>
+        <w:t xml:space="preserve">        a = b;</w:t>
+      </w:r>
+      <w:r>
+        <w:br/>
+        <w:t xml:space="preserve">        b = c;</w:t>
+      </w:r>
+      <w:r>
+        <w:br/>
+        <w:t xml:space="preserve">    }</w:t>
+      </w:r>
+      <w:r>
+        <w:br/>
+      </w:r>
+      <w:r>
+        <w:br/>
+        <w:t xml:space="preserve">    return c;</w:t>
+      </w:r>
+      <w:r>
+        <w:br/>
+        <w:t>}</w:t>
+      </w:r>
+    </w:p>
+    <w:p>
+      <w:pPr>
+        <w:pStyle w:val="Caption"/>
+        <w:rPr>
+          <w:lang w:val="en-AT"/>
+        </w:rPr>
+      </w:pPr>
+      <w:r>
+        <w:t xml:space="preserve">Figure </w:t>
+      </w:r>
+      <w:r>
+        <w:fldChar w:fldCharType="begin"/>
+      </w:r>
+      <w:r>
+        <w:instrText xml:space="preserve"> SEQ Figure \* ARABIC </w:instrText>
+      </w:r>
+      <w:r>
+        <w:fldChar w:fldCharType="separate"/>
+      </w:r>
+      <w:r>
+        <w:rPr>
+          <w:noProof/>
+        </w:rPr>
+        <w:t>1</w:t>
+      </w:r>
+      <w:r>
+        <w:fldChar w:fldCharType="end"/>
+      </w:r>
+      <w:r>
+        <w:t>: fibonacci iterative</w:t>
+      </w:r>
+    </w:p>
+    <w:p>
+      <w:pPr>
+        <w:rPr>
+          <w:lang w:val="en-AT"/>
+        </w:rPr>
+      </w:pPr>
+    </w:p>
+    <w:p>
+      <w:pPr>
+        <w:pStyle w:val="Pseoudocode"/>
+      </w:pPr>
+      <w:r>
+        <w:t>public int fibonacciRecursive(int n)</w:t>
+      </w:r>
+      <w:r>
+        <w:br/>
+        <w:t>{</w:t>
+      </w:r>
+      <w:r>
+        <w:br/>
+      </w:r>
+      <w:r>
+        <w:lastRenderedPageBreak/>
+        <w:t xml:space="preserve">    if (n &lt;= 1)</w:t>
+      </w:r>
+      <w:r>
+        <w:br/>
+        <w:t xml:space="preserve">    {</w:t>
+      </w:r>
+      <w:r>
+        <w:br/>
+        <w:t xml:space="preserve">        return n;</w:t>
+      </w:r>
+      <w:r>
+        <w:br/>
+        <w:t xml:space="preserve">    }</w:t>
+      </w:r>
+      <w:r>
+        <w:br/>
+      </w:r>
+      <w:r>
+        <w:br/>
+        <w:t xml:space="preserve">    return fibonacciRecursive(n - 1) + fibonacciRecursive(n - 2);</w:t>
+      </w:r>
+      <w:r>
+        <w:br/>
+        <w:t>}</w:t>
+      </w:r>
+    </w:p>
+    <w:p>
+      <w:pPr>
+        <w:pStyle w:val="Caption"/>
+      </w:pPr>
+      <w:r>
+        <w:t xml:space="preserve">Figure </w:t>
+      </w:r>
+      <w:r>
+        <w:fldChar w:fldCharType="begin"/>
+      </w:r>
+      <w:r>
+        <w:instrText xml:space="preserve"> SEQ Figure \* ARABIC </w:instrText>
+      </w:r>
+      <w:r>
+        <w:fldChar w:fldCharType="separate"/>
+      </w:r>
+      <w:r>
+        <w:rPr>
+          <w:noProof/>
+        </w:rPr>
+        <w:t>2</w:t>
+      </w:r>
+      <w:r>
+        <w:fldChar w:fldCharType="end"/>
+      </w:r>
+      <w:r>
+        <w:t>: Fibonacci Recursive</w:t>
+      </w:r>
+    </w:p>
+    <w:p>
+      <w:pPr>
+        <w:rPr>
+          <w:lang w:val="en-AT"/>
+        </w:rPr>
+      </w:pPr>
+    </w:p>
+    <w:p>
+      <w:pPr>
+        <w:pStyle w:val="Pseoudocode"/>
+      </w:pPr>
+      <w:r>
+        <w:t>public int fibonacciMemoized(int n, int memoSize)</w:t>
+      </w:r>
+      <w:r>
+        <w:br/>
+        <w:t>{</w:t>
+      </w:r>
+      <w:r>
+        <w:br/>
+        <w:t xml:space="preserve">    int[] memo = new int[memoSize];</w:t>
+      </w:r>
+      <w:r>
+        <w:br/>
+      </w:r>
+      <w:r>
+        <w:br/>
+        <w:t xml:space="preserve">    return fibonacciMemoized(n, memo);</w:t>
+      </w:r>
+      <w:r>
+        <w:br/>
+        <w:t>}</w:t>
+      </w:r>
+      <w:r>
+        <w:br/>
+      </w:r>
+      <w:r>
+        <w:br/>
+        <w:t>private int fibonacciMemoized(int n, int[] memo)</w:t>
+      </w:r>
+      <w:r>
+        <w:br/>
+        <w:t>{</w:t>
+      </w:r>
+      <w:r>
+        <w:br/>
+        <w:t xml:space="preserve">    if (n &lt;= 1)</w:t>
+      </w:r>
+      <w:r>
+        <w:br/>
+        <w:t xml:space="preserve">    {</w:t>
+      </w:r>
+      <w:r>
+        <w:br/>
+        <w:t xml:space="preserve">        return n;</w:t>
+      </w:r>
+      <w:r>
+        <w:br/>
+        <w:t xml:space="preserve">    }</w:t>
+      </w:r>
+      <w:r>
+        <w:br/>
+      </w:r>
+      <w:r>
+        <w:br/>
+        <w:t xml:space="preserve">    if (n &gt;= memo.length)</w:t>
+      </w:r>
+      <w:r>
+        <w:br/>
+        <w:t xml:space="preserve">    {</w:t>
+      </w:r>
+      <w:r>
+        <w:br/>
+        <w:t xml:space="preserve">        return fibonacciMemoized(n - 1, memo) + fibonacciMemoized(n - 2, memo);</w:t>
+      </w:r>
+      <w:r>
+        <w:br/>
+        <w:t xml:space="preserve">    }</w:t>
+      </w:r>
+      <w:r>
+        <w:br/>
+        <w:t xml:space="preserve">    if (memo[n] != 0)</w:t>
+      </w:r>
+      <w:r>
+        <w:br/>
+        <w:t xml:space="preserve">    {</w:t>
+      </w:r>
+      <w:r>
+        <w:br/>
+        <w:t xml:space="preserve">        return memo[n];</w:t>
+      </w:r>
+      <w:r>
+        <w:br/>
+        <w:t xml:space="preserve">    }</w:t>
+      </w:r>
+      <w:r>
+        <w:br/>
+        <w:t xml:space="preserve">    else</w:t>
+      </w:r>
+      <w:r>
+        <w:br/>
+        <w:t xml:space="preserve">    {</w:t>
+      </w:r>
+      <w:r>
+        <w:br/>
+        <w:t xml:space="preserve">        memo[n] = fibonacciMemoized(n - 1, memo) + fibonacciMemoized(n - 2, memo);</w:t>
+      </w:r>
+      <w:r>
+        <w:br/>
+        <w:t xml:space="preserve">        return memo[n];</w:t>
+      </w:r>
+      <w:r>
+        <w:br/>
+        <w:t xml:space="preserve">    }</w:t>
+      </w:r>
+      <w:r>
+        <w:br/>
+        <w:t>}</w:t>
+      </w:r>
+      <w:r>
+        <w:br/>
+      </w:r>
+      <w:r>
+        <w:lastRenderedPageBreak/>
+        <w:br/>
+        <w:t>public int fibonacciMemoized(int n)</w:t>
+      </w:r>
+      <w:r>
+        <w:br/>
+        <w:t>{</w:t>
+      </w:r>
+      <w:r>
+        <w:br/>
+        <w:t xml:space="preserve">    return fibonacciMemoized(n, n + 1);</w:t>
+      </w:r>
+      <w:r>
+        <w:br/>
+        <w:t>}</w:t>
+      </w:r>
+    </w:p>
+    <w:p>
+      <w:pPr>
+        <w:pStyle w:val="Caption"/>
+        <w:rPr>
+          <w:lang w:val="en-AT"/>
+        </w:rPr>
+      </w:pPr>
+      <w:r>
+        <w:t xml:space="preserve">Figure </w:t>
+      </w:r>
+      <w:r>
+        <w:fldChar w:fldCharType="begin"/>
+      </w:r>
+      <w:r>
+        <w:instrText xml:space="preserve"> SEQ Figure \* ARABIC </w:instrText>
+      </w:r>
+      <w:r>
+        <w:fldChar w:fldCharType="separate"/>
+      </w:r>
+      <w:r>
+        <w:rPr>
+          <w:noProof/>
+        </w:rPr>
+        <w:t>3</w:t>
+      </w:r>
+      <w:r>
+        <w:fldChar w:fldCharType="end"/>
+      </w:r>
+      <w:r>
+        <w:t>: memoized</w:t>
+      </w:r>
+    </w:p>
+    <w:p>
+      <w:pPr>
         <w:pStyle w:val="Heading2"/>
       </w:pPr>
       <w:r>
         <w:t>Test</w:t>
       </w:r>
     </w:p>
+    <w:p/>
+    <w:p>
+      <w:pPr>
+        <w:pStyle w:val="Pseoudocode"/>
+      </w:pPr>
+      <w:r>
+        <w:t>=== Fibonacci ===</w:t>
+      </w:r>
+    </w:p>
+    <w:p>
+      <w:pPr>
+        <w:pStyle w:val="Pseoudocode"/>
+      </w:pPr>
+    </w:p>
+    <w:p>
+      <w:pPr>
+        <w:pStyle w:val="Pseoudocode"/>
+      </w:pPr>
+      <w:r>
+        <w:t>Iterative Approach:</w:t>
+      </w:r>
+    </w:p>
+    <w:p>
+      <w:pPr>
+        <w:pStyle w:val="Pseoudocode"/>
+      </w:pPr>
+      <w:r>
+        <w:t>F(8) = 21</w:t>
+      </w:r>
+    </w:p>
+    <w:p>
+      <w:pPr>
+        <w:pStyle w:val="Pseoudocode"/>
+      </w:pPr>
+      <w:r>
+        <w:t>F(7) = 13</w:t>
+      </w:r>
+    </w:p>
+    <w:p>
+      <w:pPr>
+        <w:pStyle w:val="Pseoudocode"/>
+      </w:pPr>
+      <w:r>
+        <w:t>F(6) = 8</w:t>
+      </w:r>
+    </w:p>
+    <w:p>
+      <w:pPr>
+        <w:pStyle w:val="Pseoudocode"/>
+      </w:pPr>
+      <w:r>
+        <w:t>F(5) = 5</w:t>
+      </w:r>
+    </w:p>
+    <w:p>
+      <w:pPr>
+        <w:pStyle w:val="Pseoudocode"/>
+      </w:pPr>
+      <w:r>
+        <w:t>F(4) = 3</w:t>
+      </w:r>
+    </w:p>
+    <w:p>
+      <w:pPr>
+        <w:pStyle w:val="Pseoudocode"/>
+      </w:pPr>
+      <w:r>
+        <w:t>F(3) = 2</w:t>
+      </w:r>
+    </w:p>
+    <w:p>
+      <w:pPr>
+        <w:pStyle w:val="Pseoudocode"/>
+      </w:pPr>
+      <w:r>
+        <w:t>F(2) = 1</w:t>
+      </w:r>
+    </w:p>
+    <w:p>
+      <w:pPr>
+        <w:pStyle w:val="Pseoudocode"/>
+      </w:pPr>
+      <w:r>
+        <w:t>F(1) = 1</w:t>
+      </w:r>
+    </w:p>
+    <w:p>
+      <w:pPr>
+        <w:pStyle w:val="Pseoudocode"/>
+      </w:pPr>
+      <w:r>
+        <w:t>F(0) = 0</w:t>
+      </w:r>
+    </w:p>
+    <w:p>
+      <w:pPr>
+        <w:pStyle w:val="Pseoudocode"/>
+      </w:pPr>
+    </w:p>
+    <w:p>
+      <w:pPr>
+        <w:pStyle w:val="Pseoudocode"/>
+      </w:pPr>
+      <w:r>
+        <w:t>Recursive Approach:</w:t>
+      </w:r>
+    </w:p>
+    <w:p>
+      <w:pPr>
+        <w:pStyle w:val="Pseoudocode"/>
+      </w:pPr>
+      <w:r>
+        <w:t>F(8) = 21</w:t>
+      </w:r>
+    </w:p>
+    <w:p>
+      <w:pPr>
+        <w:pStyle w:val="Pseoudocode"/>
+      </w:pPr>
+      <w:r>
+        <w:t>F(7) = 13</w:t>
+      </w:r>
+    </w:p>
+    <w:p>
+      <w:pPr>
+        <w:pStyle w:val="Pseoudocode"/>
+      </w:pPr>
+      <w:r>
+        <w:t>F(6) = 8</w:t>
+      </w:r>
+    </w:p>
+    <w:p>
+      <w:pPr>
+        <w:pStyle w:val="Pseoudocode"/>
+      </w:pPr>
+      <w:r>
+        <w:t>F(5) = 5</w:t>
+      </w:r>
+    </w:p>
+    <w:p>
+      <w:pPr>
+        <w:pStyle w:val="Pseoudocode"/>
+      </w:pPr>
+      <w:r>
+        <w:t>F(4) = 3</w:t>
+      </w:r>
+    </w:p>
+    <w:p>
+      <w:pPr>
+        <w:pStyle w:val="Pseoudocode"/>
+      </w:pPr>
+      <w:r>
+        <w:t>F(3) = 2</w:t>
+      </w:r>
+    </w:p>
+    <w:p>
+      <w:pPr>
+        <w:pStyle w:val="Pseoudocode"/>
+      </w:pPr>
+      <w:r>
+        <w:t>F(2) = 1</w:t>
+      </w:r>
+    </w:p>
+    <w:p>
+      <w:pPr>
+        <w:pStyle w:val="Pseoudocode"/>
+      </w:pPr>
+      <w:r>
+        <w:t>F(1) = 1</w:t>
+      </w:r>
+    </w:p>
+    <w:p>
+      <w:pPr>
+        <w:pStyle w:val="Pseoudocode"/>
+      </w:pPr>
+      <w:r>
+        <w:t>F(0) = 0</w:t>
+      </w:r>
+    </w:p>
+    <w:p>
+      <w:pPr>
+        <w:pStyle w:val="Pseoudocode"/>
+      </w:pPr>
+    </w:p>
+    <w:p>
+      <w:pPr>
+        <w:pStyle w:val="Pseoudocode"/>
+      </w:pPr>
+      <w:r>
+        <w:t>Memoized Approach:</w:t>
+      </w:r>
+    </w:p>
+    <w:p>
+      <w:pPr>
+        <w:pStyle w:val="Pseoudocode"/>
+      </w:pPr>
+      <w:r>
+        <w:t>F(8) = 21</w:t>
+      </w:r>
+    </w:p>
+    <w:p>
+      <w:pPr>
+        <w:pStyle w:val="Pseoudocode"/>
+      </w:pPr>
+      <w:r>
+        <w:t>F(7) = 13</w:t>
+      </w:r>
+    </w:p>
+    <w:p>
+      <w:pPr>
+        <w:pStyle w:val="Pseoudocode"/>
+      </w:pPr>
+      <w:r>
+        <w:t>F(6) = 8</w:t>
+      </w:r>
+    </w:p>
+    <w:p>
+      <w:pPr>
+        <w:pStyle w:val="Pseoudocode"/>
+      </w:pPr>
+      <w:r>
+        <w:t>F(5) = 5</w:t>
+      </w:r>
+    </w:p>
+    <w:p>
+      <w:pPr>
+        <w:pStyle w:val="Pseoudocode"/>
+      </w:pPr>
+      <w:r>
+        <w:t>F(4) = 3</w:t>
+      </w:r>
+    </w:p>
+    <w:p>
+      <w:pPr>
+        <w:pStyle w:val="Pseoudocode"/>
+      </w:pPr>
+      <w:r>
+        <w:t>F(3) = 2</w:t>
+      </w:r>
+    </w:p>
+    <w:p>
+      <w:pPr>
+        <w:pStyle w:val="Pseoudocode"/>
+      </w:pPr>
+      <w:r>
+        <w:lastRenderedPageBreak/>
+        <w:t>F(2) = 1</w:t>
+      </w:r>
+    </w:p>
+    <w:p>
+      <w:pPr>
+        <w:pStyle w:val="Pseoudocode"/>
+      </w:pPr>
+      <w:r>
+        <w:t>F(1) = 1</w:t>
+      </w:r>
+    </w:p>
+    <w:p>
+      <w:pPr>
+        <w:pStyle w:val="Pseoudocode"/>
+      </w:pPr>
+      <w:r>
+        <w:t>F(0) = 0</w:t>
+      </w:r>
+    </w:p>
+    <w:p>
+      <w:pPr>
+        <w:pStyle w:val="Pseoudocode"/>
+      </w:pPr>
+    </w:p>
+    <w:p>
+      <w:pPr>
+        <w:pStyle w:val="Pseoudocode"/>
+      </w:pPr>
+      <w:r>
+        <w:t>Time Comparison:</w:t>
+      </w:r>
+    </w:p>
+    <w:p>
+      <w:pPr>
+        <w:pStyle w:val="Pseoudocode"/>
+      </w:pPr>
+      <w:r>
+        <w:t>Fibonacci method times for n = 40:</w:t>
+      </w:r>
+    </w:p>
+    <w:p>
+      <w:pPr>
+        <w:pStyle w:val="Pseoudocode"/>
+      </w:pPr>
+      <w:r>
+        <w:t>**************************************************</w:t>
+      </w:r>
+    </w:p>
+    <w:p>
+      <w:pPr>
+        <w:pStyle w:val="Pseoudocode"/>
+      </w:pPr>
+      <w:r>
+        <w:t>Iterative result: 102334155, Time: 1500 ns</w:t>
+      </w:r>
+    </w:p>
+    <w:p>
+      <w:pPr>
+        <w:pStyle w:val="Pseoudocode"/>
+      </w:pPr>
+      <w:r>
+        <w:t>Memoized (medium memo : 15) result: 102334155, Time: 1867100 ns</w:t>
+      </w:r>
+    </w:p>
+    <w:p>
+      <w:pPr>
+        <w:pStyle w:val="Pseoudocode"/>
+      </w:pPr>
+      <w:r>
+        <w:t>Memoized result (n + 1 memo): 102334155, Time: 16800 ns</w:t>
+      </w:r>
+    </w:p>
+    <w:p>
+      <w:pPr>
+        <w:pStyle w:val="Pseoudocode"/>
+      </w:pPr>
+      <w:r>
+        <w:t>Memoized (large memo : 30) result: 102334155, Time: 134300 ns</w:t>
+      </w:r>
+    </w:p>
+    <w:p>
+      <w:pPr>
+        <w:pStyle w:val="Pseoudocode"/>
+      </w:pPr>
+      <w:r>
+        <w:t>Memoized (small memo : 5) result: 102334155, Time: 56583400 ns</w:t>
+      </w:r>
+    </w:p>
+    <w:p>
+      <w:pPr>
+        <w:pStyle w:val="Pseoudocode"/>
+      </w:pPr>
+      <w:r>
+        <w:t>Recursive result: 102334155, Time: 165721100 ns</w:t>
+      </w:r>
+    </w:p>
+    <w:p>
+      <w:pPr>
+        <w:pStyle w:val="Pseoudocode"/>
+      </w:pPr>
+      <w:r>
+        <w:t>**************************************************</w:t>
+      </w:r>
+    </w:p>
+    <w:p>
+      <w:pPr>
+        <w:pStyle w:val="Caption"/>
+      </w:pPr>
+      <w:r>
+        <w:t xml:space="preserve">Figure </w:t>
+      </w:r>
+      <w:r>
+        <w:fldChar w:fldCharType="begin"/>
+      </w:r>
+      <w:r>
+        <w:instrText xml:space="preserve"> SEQ Figure \* ARABIC </w:instrText>
+      </w:r>
+      <w:r>
+        <w:fldChar w:fldCharType="separate"/>
+      </w:r>
+      <w:r>
+        <w:rPr>
+          <w:noProof/>
+        </w:rPr>
+        <w:t>4</w:t>
+      </w:r>
+      <w:r>
+        <w:fldChar w:fldCharType="end"/>
+      </w:r>
+      <w:r>
+        <w:t>: Results of Fibonacci</w:t>
+      </w:r>
+    </w:p>
+    <w:p>
+      <w:r>
+        <w:t>As expected, the iterative result is the most efficient. Memoization helps a lot with the recursive solution.</w:t>
+      </w:r>
+    </w:p>
+    <w:p/>
     <w:p>
       <w:pPr>
         <w:jc w:val="left"/>
@@ -3201,6 +3959,14 @@
       </w:r>
     </w:p>
     <w:p>
+      <w:r>
+        <w:t>The recursive Tower of Hanoi solution uses two recursive steps. The first step is to move the top disks away, by alternating between the auxiliary and destination peg.</w:t>
+      </w:r>
+      <w:r>
+        <w:t xml:space="preserve"> Then it prints out the moves, in reverse, before continuing with the second recursive step to move the smaller disks back on top of the moved larger disk on the destination peg.</w:t>
+      </w:r>
+    </w:p>
+    <w:p>
       <w:pPr>
         <w:pStyle w:val="Heading2"/>
       </w:pPr>
@@ -3208,12 +3974,638 @@
         <w:t>Code</w:t>
       </w:r>
     </w:p>
+    <w:p/>
+    <w:p>
+      <w:pPr>
+        <w:pStyle w:val="Pseoudocode"/>
+      </w:pPr>
+      <w:r>
+        <w:t>public TowerOfHanoi(int disks)</w:t>
+      </w:r>
+      <w:r>
+        <w:br/>
+        <w:t>{</w:t>
+      </w:r>
+      <w:r>
+        <w:br/>
+        <w:t xml:space="preserve">    setDisks(disks);</w:t>
+      </w:r>
+      <w:r>
+        <w:br/>
+      </w:r>
+      <w:r>
+        <w:br/>
+        <w:t xml:space="preserve">    UI.</w:t>
+      </w:r>
+      <w:r>
+        <w:rPr>
+          <w:i/>
+          <w:iCs/>
+        </w:rPr>
+        <w:t>printlnBlue</w:t>
+      </w:r>
+      <w:r>
+        <w:t>("Solving Tower of Hanoi with " + getDisks() + " disks:");</w:t>
+      </w:r>
+      <w:r>
+        <w:br/>
+        <w:t xml:space="preserve">    solve(getDisks(), 'A', 'C', 'B');</w:t>
+      </w:r>
+      <w:r>
+        <w:br/>
+        <w:t>}</w:t>
+      </w:r>
+      <w:r>
+        <w:br/>
+      </w:r>
+      <w:r>
+        <w:br/>
+        <w:t>private void solve(int n, char fromPeg, char toPeg, char auxPeg)</w:t>
+      </w:r>
+      <w:r>
+        <w:br/>
+        <w:t>{</w:t>
+      </w:r>
+      <w:r>
+        <w:br/>
+        <w:t xml:space="preserve">    if (n == 0)</w:t>
+      </w:r>
+      <w:r>
+        <w:br/>
+        <w:t xml:space="preserve">    {</w:t>
+      </w:r>
+      <w:r>
+        <w:br/>
+        <w:t xml:space="preserve">        return;</w:t>
+      </w:r>
+      <w:r>
+        <w:br/>
+        <w:t xml:space="preserve">    }</w:t>
+      </w:r>
+      <w:r>
+        <w:br/>
+      </w:r>
+      <w:r>
+        <w:br/>
+        <w:t xml:space="preserve">    solve(n - 1, fromPeg, auxPeg, toPeg);</w:t>
+      </w:r>
+      <w:r>
+        <w:br/>
+      </w:r>
+      <w:r>
+        <w:br/>
+        <w:t xml:space="preserve">    UI.</w:t>
+      </w:r>
+      <w:r>
+        <w:rPr>
+          <w:i/>
+          <w:iCs/>
+        </w:rPr>
+        <w:t>printlnGreen</w:t>
+      </w:r>
+      <w:r>
+        <w:t>("Move disk " + n + " from peg " + fromPeg + " to peg " + toPeg);</w:t>
+      </w:r>
+      <w:r>
+        <w:br/>
+      </w:r>
+      <w:r>
+        <w:br/>
+        <w:t xml:space="preserve">    solve(n - 1, auxPeg, toPeg, fromPeg);</w:t>
+      </w:r>
+      <w:r>
+        <w:br/>
+        <w:t>}</w:t>
+      </w:r>
+    </w:p>
+    <w:p>
+      <w:pPr>
+        <w:pStyle w:val="Caption"/>
+        <w:rPr>
+          <w:lang w:val="en-AT"/>
+        </w:rPr>
+      </w:pPr>
+      <w:r>
+        <w:t xml:space="preserve">Figure </w:t>
+      </w:r>
+      <w:r>
+        <w:fldChar w:fldCharType="begin"/>
+      </w:r>
+      <w:r>
+        <w:instrText xml:space="preserve"> SEQ Figure \* ARABIC </w:instrText>
+      </w:r>
+      <w:r>
+        <w:fldChar w:fldCharType="separate"/>
+      </w:r>
+      <w:r>
+        <w:rPr>
+          <w:noProof/>
+        </w:rPr>
+        <w:t>5</w:t>
+      </w:r>
+      <w:r>
+        <w:fldChar w:fldCharType="end"/>
+      </w:r>
+      <w:r>
+        <w:t>: Tower of Hanoi</w:t>
+      </w:r>
+    </w:p>
+    <w:p/>
     <w:p>
       <w:pPr>
         <w:pStyle w:val="Heading2"/>
       </w:pPr>
       <w:r>
+        <w:lastRenderedPageBreak/>
         <w:t>Test</w:t>
+      </w:r>
+    </w:p>
+    <w:p>
+      <w:pPr>
+        <w:pStyle w:val="Pseoudocode"/>
+      </w:pPr>
+      <w:r>
+        <w:t>Solving Tower of Hanoi with 3 disks:</w:t>
+      </w:r>
+    </w:p>
+    <w:p>
+      <w:pPr>
+        <w:pStyle w:val="Pseoudocode"/>
+      </w:pPr>
+      <w:r>
+        <w:t>Move disk 1 from peg A to peg C</w:t>
+      </w:r>
+    </w:p>
+    <w:p>
+      <w:pPr>
+        <w:pStyle w:val="Pseoudocode"/>
+      </w:pPr>
+      <w:r>
+        <w:t>Move disk 2 from peg A to peg B</w:t>
+      </w:r>
+    </w:p>
+    <w:p>
+      <w:pPr>
+        <w:pStyle w:val="Pseoudocode"/>
+      </w:pPr>
+      <w:r>
+        <w:t>Move disk 1 from peg C to peg B</w:t>
+      </w:r>
+    </w:p>
+    <w:p>
+      <w:pPr>
+        <w:pStyle w:val="Pseoudocode"/>
+      </w:pPr>
+      <w:r>
+        <w:t>Move disk 3 from peg A to peg C</w:t>
+      </w:r>
+    </w:p>
+    <w:p>
+      <w:pPr>
+        <w:pStyle w:val="Pseoudocode"/>
+      </w:pPr>
+      <w:r>
+        <w:t>Move disk 1 from peg B to peg A</w:t>
+      </w:r>
+    </w:p>
+    <w:p>
+      <w:pPr>
+        <w:pStyle w:val="Pseoudocode"/>
+      </w:pPr>
+      <w:r>
+        <w:t>Move disk 2 from peg B to peg C</w:t>
+      </w:r>
+    </w:p>
+    <w:p>
+      <w:pPr>
+        <w:pStyle w:val="Pseoudocode"/>
+      </w:pPr>
+      <w:r>
+        <w:t>Move disk 1 from peg A to peg C</w:t>
+      </w:r>
+    </w:p>
+    <w:p>
+      <w:pPr>
+        <w:pStyle w:val="Pseoudocode"/>
+      </w:pPr>
+    </w:p>
+    <w:p>
+      <w:pPr>
+        <w:pStyle w:val="Pseoudocode"/>
+      </w:pPr>
+      <w:r>
+        <w:t>Solving Tower of Hanoi with 4 disks:</w:t>
+      </w:r>
+    </w:p>
+    <w:p>
+      <w:pPr>
+        <w:pStyle w:val="Pseoudocode"/>
+      </w:pPr>
+      <w:r>
+        <w:t>Move disk 1 from peg A to peg B</w:t>
+      </w:r>
+    </w:p>
+    <w:p>
+      <w:pPr>
+        <w:pStyle w:val="Pseoudocode"/>
+      </w:pPr>
+      <w:r>
+        <w:t>Move disk 2 from peg A to peg C</w:t>
+      </w:r>
+    </w:p>
+    <w:p>
+      <w:pPr>
+        <w:pStyle w:val="Pseoudocode"/>
+      </w:pPr>
+      <w:r>
+        <w:t>Move disk 1 from peg B to peg C</w:t>
+      </w:r>
+    </w:p>
+    <w:p>
+      <w:pPr>
+        <w:pStyle w:val="Pseoudocode"/>
+      </w:pPr>
+      <w:r>
+        <w:t>Move disk 3 from peg A to peg B</w:t>
+      </w:r>
+    </w:p>
+    <w:p>
+      <w:pPr>
+        <w:pStyle w:val="Pseoudocode"/>
+      </w:pPr>
+      <w:r>
+        <w:t>Move disk 1 from peg C to peg A</w:t>
+      </w:r>
+    </w:p>
+    <w:p>
+      <w:pPr>
+        <w:pStyle w:val="Pseoudocode"/>
+      </w:pPr>
+      <w:r>
+        <w:t>Move disk 2 from peg C to peg B</w:t>
+      </w:r>
+    </w:p>
+    <w:p>
+      <w:pPr>
+        <w:pStyle w:val="Pseoudocode"/>
+      </w:pPr>
+      <w:r>
+        <w:t>Move disk 1 from peg A to peg B</w:t>
+      </w:r>
+    </w:p>
+    <w:p>
+      <w:pPr>
+        <w:pStyle w:val="Pseoudocode"/>
+      </w:pPr>
+      <w:r>
+        <w:t>Move disk 4 from peg A to peg C</w:t>
+      </w:r>
+    </w:p>
+    <w:p>
+      <w:pPr>
+        <w:pStyle w:val="Pseoudocode"/>
+      </w:pPr>
+      <w:r>
+        <w:t>Move disk 1 from peg B to peg C</w:t>
+      </w:r>
+    </w:p>
+    <w:p>
+      <w:pPr>
+        <w:pStyle w:val="Pseoudocode"/>
+      </w:pPr>
+      <w:r>
+        <w:t>Move disk 2 from peg B to peg A</w:t>
+      </w:r>
+    </w:p>
+    <w:p>
+      <w:pPr>
+        <w:pStyle w:val="Pseoudocode"/>
+      </w:pPr>
+      <w:r>
+        <w:t>Move disk 1 from peg C to peg A</w:t>
+      </w:r>
+    </w:p>
+    <w:p>
+      <w:pPr>
+        <w:pStyle w:val="Pseoudocode"/>
+      </w:pPr>
+      <w:r>
+        <w:t>Move disk 3 from peg B to peg C</w:t>
+      </w:r>
+    </w:p>
+    <w:p>
+      <w:pPr>
+        <w:pStyle w:val="Pseoudocode"/>
+      </w:pPr>
+      <w:r>
+        <w:t>Move disk 1 from peg A to peg B</w:t>
+      </w:r>
+    </w:p>
+    <w:p>
+      <w:pPr>
+        <w:pStyle w:val="Pseoudocode"/>
+      </w:pPr>
+      <w:r>
+        <w:t>Move disk 2 from peg A to peg C</w:t>
+      </w:r>
+    </w:p>
+    <w:p>
+      <w:pPr>
+        <w:pStyle w:val="Pseoudocode"/>
+      </w:pPr>
+      <w:r>
+        <w:t>Move disk 1 from peg B to peg C</w:t>
+      </w:r>
+    </w:p>
+    <w:p>
+      <w:pPr>
+        <w:pStyle w:val="Pseoudocode"/>
+      </w:pPr>
+    </w:p>
+    <w:p>
+      <w:pPr>
+        <w:pStyle w:val="Pseoudocode"/>
+      </w:pPr>
+      <w:r>
+        <w:t>Solving Tower of Hanoi with 5 disks:</w:t>
+      </w:r>
+    </w:p>
+    <w:p>
+      <w:pPr>
+        <w:pStyle w:val="Pseoudocode"/>
+      </w:pPr>
+      <w:r>
+        <w:t>Move disk 1 from peg A to peg C</w:t>
+      </w:r>
+    </w:p>
+    <w:p>
+      <w:pPr>
+        <w:pStyle w:val="Pseoudocode"/>
+      </w:pPr>
+      <w:r>
+        <w:t>Move disk 2 from peg A to peg B</w:t>
+      </w:r>
+    </w:p>
+    <w:p>
+      <w:pPr>
+        <w:pStyle w:val="Pseoudocode"/>
+      </w:pPr>
+      <w:r>
+        <w:t>Move disk 1 from peg C to peg B</w:t>
+      </w:r>
+    </w:p>
+    <w:p>
+      <w:pPr>
+        <w:pStyle w:val="Pseoudocode"/>
+      </w:pPr>
+      <w:r>
+        <w:t>Move disk 3 from peg A to peg C</w:t>
+      </w:r>
+    </w:p>
+    <w:p>
+      <w:pPr>
+        <w:pStyle w:val="Pseoudocode"/>
+      </w:pPr>
+      <w:r>
+        <w:t>Move disk 1 from peg B to peg A</w:t>
+      </w:r>
+    </w:p>
+    <w:p>
+      <w:pPr>
+        <w:pStyle w:val="Pseoudocode"/>
+      </w:pPr>
+      <w:r>
+        <w:t>Move disk 2 from peg B to peg C</w:t>
+      </w:r>
+    </w:p>
+    <w:p>
+      <w:pPr>
+        <w:pStyle w:val="Pseoudocode"/>
+      </w:pPr>
+      <w:r>
+        <w:t>Move disk 1 from peg A to peg C</w:t>
+      </w:r>
+    </w:p>
+    <w:p>
+      <w:pPr>
+        <w:pStyle w:val="Pseoudocode"/>
+      </w:pPr>
+      <w:r>
+        <w:t>Move disk 4 from peg A to peg B</w:t>
+      </w:r>
+    </w:p>
+    <w:p>
+      <w:pPr>
+        <w:pStyle w:val="Pseoudocode"/>
+      </w:pPr>
+      <w:r>
+        <w:t>Move disk 1 from peg C to peg B</w:t>
+      </w:r>
+    </w:p>
+    <w:p>
+      <w:pPr>
+        <w:pStyle w:val="Pseoudocode"/>
+      </w:pPr>
+      <w:r>
+        <w:t>Move disk 2 from peg C to peg A</w:t>
+      </w:r>
+    </w:p>
+    <w:p>
+      <w:pPr>
+        <w:pStyle w:val="Pseoudocode"/>
+      </w:pPr>
+      <w:r>
+        <w:t>Move disk 1 from peg B to peg A</w:t>
+      </w:r>
+    </w:p>
+    <w:p>
+      <w:pPr>
+        <w:pStyle w:val="Pseoudocode"/>
+      </w:pPr>
+      <w:r>
+        <w:t>Move disk 3 from peg C to peg B</w:t>
+      </w:r>
+    </w:p>
+    <w:p>
+      <w:pPr>
+        <w:pStyle w:val="Pseoudocode"/>
+      </w:pPr>
+      <w:r>
+        <w:t>Move disk 1 from peg A to peg C</w:t>
+      </w:r>
+    </w:p>
+    <w:p>
+      <w:pPr>
+        <w:pStyle w:val="Pseoudocode"/>
+      </w:pPr>
+      <w:r>
+        <w:lastRenderedPageBreak/>
+        <w:t>Move disk 2 from peg A to peg B</w:t>
+      </w:r>
+    </w:p>
+    <w:p>
+      <w:pPr>
+        <w:pStyle w:val="Pseoudocode"/>
+      </w:pPr>
+      <w:r>
+        <w:t>Move disk 1 from peg C to peg B</w:t>
+      </w:r>
+    </w:p>
+    <w:p>
+      <w:pPr>
+        <w:pStyle w:val="Pseoudocode"/>
+      </w:pPr>
+      <w:r>
+        <w:t>Move disk 5 from peg A to peg C</w:t>
+      </w:r>
+    </w:p>
+    <w:p>
+      <w:pPr>
+        <w:pStyle w:val="Pseoudocode"/>
+      </w:pPr>
+      <w:r>
+        <w:t>Move disk 1 from peg B to peg A</w:t>
+      </w:r>
+    </w:p>
+    <w:p>
+      <w:pPr>
+        <w:pStyle w:val="Pseoudocode"/>
+      </w:pPr>
+      <w:r>
+        <w:t>Move disk 2 from peg B to peg C</w:t>
+      </w:r>
+    </w:p>
+    <w:p>
+      <w:pPr>
+        <w:pStyle w:val="Pseoudocode"/>
+      </w:pPr>
+      <w:r>
+        <w:t>Move disk 1 from peg A to peg C</w:t>
+      </w:r>
+    </w:p>
+    <w:p>
+      <w:pPr>
+        <w:pStyle w:val="Pseoudocode"/>
+      </w:pPr>
+      <w:r>
+        <w:t>Move disk 3 from peg B to peg A</w:t>
+      </w:r>
+    </w:p>
+    <w:p>
+      <w:pPr>
+        <w:pStyle w:val="Pseoudocode"/>
+      </w:pPr>
+      <w:r>
+        <w:t>Move disk 1 from peg C to peg B</w:t>
+      </w:r>
+    </w:p>
+    <w:p>
+      <w:pPr>
+        <w:pStyle w:val="Pseoudocode"/>
+      </w:pPr>
+      <w:r>
+        <w:t>Move disk 2 from peg C to peg A</w:t>
+      </w:r>
+    </w:p>
+    <w:p>
+      <w:pPr>
+        <w:pStyle w:val="Pseoudocode"/>
+      </w:pPr>
+      <w:r>
+        <w:t>Move disk 1 from peg B to peg A</w:t>
+      </w:r>
+    </w:p>
+    <w:p>
+      <w:pPr>
+        <w:pStyle w:val="Pseoudocode"/>
+      </w:pPr>
+      <w:r>
+        <w:t>Move disk 4 from peg B to peg C</w:t>
+      </w:r>
+    </w:p>
+    <w:p>
+      <w:pPr>
+        <w:pStyle w:val="Pseoudocode"/>
+      </w:pPr>
+      <w:r>
+        <w:t>Move disk 1 from peg A to peg C</w:t>
+      </w:r>
+    </w:p>
+    <w:p>
+      <w:pPr>
+        <w:pStyle w:val="Pseoudocode"/>
+      </w:pPr>
+      <w:r>
+        <w:t>Move disk 2 from peg A to peg B</w:t>
+      </w:r>
+    </w:p>
+    <w:p>
+      <w:pPr>
+        <w:pStyle w:val="Pseoudocode"/>
+      </w:pPr>
+      <w:r>
+        <w:t>Move disk 1 from peg C to peg B</w:t>
+      </w:r>
+    </w:p>
+    <w:p>
+      <w:pPr>
+        <w:pStyle w:val="Pseoudocode"/>
+      </w:pPr>
+      <w:r>
+        <w:t>Move disk 3 from peg A to peg C</w:t>
+      </w:r>
+    </w:p>
+    <w:p>
+      <w:pPr>
+        <w:pStyle w:val="Pseoudocode"/>
+      </w:pPr>
+      <w:r>
+        <w:t>Move disk 1 from peg B to peg A</w:t>
+      </w:r>
+    </w:p>
+    <w:p>
+      <w:pPr>
+        <w:pStyle w:val="Pseoudocode"/>
+      </w:pPr>
+      <w:r>
+        <w:t>Move disk 2 from peg B to peg C</w:t>
+      </w:r>
+    </w:p>
+    <w:p>
+      <w:pPr>
+        <w:pStyle w:val="Pseoudocode"/>
+      </w:pPr>
+      <w:r>
+        <w:t>Move disk 1 from peg A to peg C</w:t>
+      </w:r>
+    </w:p>
+    <w:p>
+      <w:pPr>
+        <w:pStyle w:val="Caption"/>
+      </w:pPr>
+      <w:r>
+        <w:t xml:space="preserve">Figure </w:t>
+      </w:r>
+      <w:r>
+        <w:fldChar w:fldCharType="begin"/>
+      </w:r>
+      <w:r>
+        <w:instrText xml:space="preserve"> SEQ Figure \* ARABIC </w:instrText>
+      </w:r>
+      <w:r>
+        <w:fldChar w:fldCharType="separate"/>
+      </w:r>
+      <w:r>
+        <w:rPr>
+          <w:noProof/>
+        </w:rPr>
+        <w:t>6</w:t>
+      </w:r>
+      <w:r>
+        <w:fldChar w:fldCharType="end"/>
+      </w:r>
+      <w:r>
+        <w:t>: Tower of Hanoi test</w:t>
       </w:r>
     </w:p>
     <w:p>
@@ -4837,7 +6229,6 @@
   <w:style w:type="character" w:default="1" w:styleId="DefaultParagraphFont">
     <w:name w:val="Default Paragraph Font"/>
     <w:uiPriority w:val="1"/>
-    <w:semiHidden/>
     <w:unhideWhenUsed/>
   </w:style>
   <w:style w:type="table" w:default="1" w:styleId="TableNormal">

</xml_diff>

<commit_message>
idk what im doing rn
</commit_message>
<xml_diff>
--- a/Modules/Semester_1/Modern Code/Aufgaben/06_Recursion/Protocol.docx
+++ b/Modules/Semester_1/Modern Code/Aufgaben/06_Recursion/Protocol.docx
@@ -4643,6 +4643,11 @@
       </w:r>
     </w:p>
     <w:p>
+      <w:r>
+        <w:t>Using a Stringbuilder, I append the modulus of 2 of the decimal number, before recursing using the half of the decimal number. The base case is decimal == 0 and to check for decimal == 0, I first check if the string is empty to return “0”.</w:t>
+      </w:r>
+    </w:p>
+    <w:p>
       <w:pPr>
         <w:pStyle w:val="Heading2"/>
       </w:pPr>
@@ -4652,10 +4657,223 @@
     </w:p>
     <w:p>
       <w:pPr>
+        <w:pStyle w:val="Pseoudocode"/>
+      </w:pPr>
+      <w:r>
+        <w:t>private static String decimalToBinary(int decimal, StringBuilder binary)</w:t>
+      </w:r>
+      <w:r>
+        <w:br/>
+        <w:t>{</w:t>
+      </w:r>
+      <w:r>
+        <w:br/>
+        <w:t xml:space="preserve">    // Base case</w:t>
+      </w:r>
+      <w:r>
+        <w:br/>
+        <w:t xml:space="preserve">    if (decimal == 0)</w:t>
+      </w:r>
+      <w:r>
+        <w:br/>
+        <w:t xml:space="preserve">    {</w:t>
+      </w:r>
+      <w:r>
+        <w:br/>
+        <w:t xml:space="preserve">        // Handle the case where the input decimal number is 0</w:t>
+      </w:r>
+      <w:r>
+        <w:br/>
+        <w:t xml:space="preserve">        if (binary.isEmpty())</w:t>
+      </w:r>
+      <w:r>
+        <w:br/>
+        <w:t xml:space="preserve">        {</w:t>
+      </w:r>
+      <w:r>
+        <w:br/>
+        <w:t xml:space="preserve">            return "0";</w:t>
+      </w:r>
+      <w:r>
+        <w:br/>
+        <w:t xml:space="preserve">        }</w:t>
+      </w:r>
+      <w:r>
+        <w:br/>
+      </w:r>
+      <w:r>
+        <w:br/>
+        <w:t xml:space="preserve">        // Reverse the binary string since its constructed backwards</w:t>
+      </w:r>
+      <w:r>
+        <w:br/>
+        <w:t xml:space="preserve">        return binary.reverse().toString();</w:t>
+      </w:r>
+      <w:r>
+        <w:br/>
+        <w:t xml:space="preserve">    }</w:t>
+      </w:r>
+      <w:r>
+        <w:br/>
+      </w:r>
+      <w:r>
+        <w:br/>
+        <w:t xml:space="preserve">    binary.append(decimal % 2);</w:t>
+      </w:r>
+      <w:r>
+        <w:br/>
+      </w:r>
+      <w:r>
+        <w:br/>
+        <w:t xml:space="preserve">    return </w:t>
+      </w:r>
+      <w:r>
+        <w:rPr>
+          <w:i/>
+          <w:iCs/>
+        </w:rPr>
+        <w:t>decimalToBinary</w:t>
+      </w:r>
+      <w:r>
+        <w:t>(decimal / 2, binary);</w:t>
+      </w:r>
+      <w:r>
+        <w:br/>
+        <w:t>}</w:t>
+      </w:r>
+    </w:p>
+    <w:p>
+      <w:pPr>
+        <w:pStyle w:val="Caption"/>
+        <w:rPr>
+          <w:lang w:val="en-AT"/>
+        </w:rPr>
+      </w:pPr>
+      <w:r>
+        <w:t xml:space="preserve">Figure </w:t>
+      </w:r>
+      <w:r>
+        <w:fldChar w:fldCharType="begin"/>
+      </w:r>
+      <w:r>
+        <w:instrText xml:space="preserve"> SEQ Figure \* ARABIC </w:instrText>
+      </w:r>
+      <w:r>
+        <w:fldChar w:fldCharType="separate"/>
+      </w:r>
+      <w:r>
+        <w:rPr>
+          <w:noProof/>
+        </w:rPr>
+        <w:t>7</w:t>
+      </w:r>
+      <w:r>
+        <w:fldChar w:fldCharType="end"/>
+      </w:r>
+      <w:r>
+        <w:t>: decimalToBinary</w:t>
+      </w:r>
+    </w:p>
+    <w:p>
+      <w:pPr>
         <w:pStyle w:val="Heading2"/>
       </w:pPr>
       <w:r>
         <w:t>Test</w:t>
+      </w:r>
+    </w:p>
+    <w:p>
+      <w:pPr>
+        <w:pStyle w:val="Pseoudocode"/>
+      </w:pPr>
+      <w:r>
+        <w:t>===== Decimal to Binary Converter =====</w:t>
+      </w:r>
+    </w:p>
+    <w:p>
+      <w:pPr>
+        <w:pStyle w:val="Pseoudocode"/>
+      </w:pPr>
+      <w:r>
+        <w:t>Decimal: 0 -&gt; Binary: 0</w:t>
+      </w:r>
+    </w:p>
+    <w:p>
+      <w:pPr>
+        <w:pStyle w:val="Pseoudocode"/>
+      </w:pPr>
+      <w:r>
+        <w:t>Decimal: 1 -&gt; Binary: 1</w:t>
+      </w:r>
+    </w:p>
+    <w:p>
+      <w:pPr>
+        <w:pStyle w:val="Pseoudocode"/>
+      </w:pPr>
+      <w:r>
+        <w:t>Decimal: 5 -&gt; Binary: 101</w:t>
+      </w:r>
+    </w:p>
+    <w:p>
+      <w:pPr>
+        <w:pStyle w:val="Pseoudocode"/>
+      </w:pPr>
+      <w:r>
+        <w:lastRenderedPageBreak/>
+        <w:t>Decimal: 10 -&gt; Binary: 1010</w:t>
+      </w:r>
+    </w:p>
+    <w:p>
+      <w:pPr>
+        <w:pStyle w:val="Pseoudocode"/>
+      </w:pPr>
+      <w:r>
+        <w:t>Decimal: 15 -&gt; Binary: 1111</w:t>
+      </w:r>
+    </w:p>
+    <w:p>
+      <w:pPr>
+        <w:pStyle w:val="Pseoudocode"/>
+      </w:pPr>
+      <w:r>
+        <w:t>Decimal: 42 -&gt; Binary: 101010</w:t>
+      </w:r>
+    </w:p>
+    <w:p>
+      <w:pPr>
+        <w:pStyle w:val="Pseoudocode"/>
+      </w:pPr>
+      <w:r>
+        <w:t>Decimal: 255 -&gt; Binary: 11111111</w:t>
+      </w:r>
+    </w:p>
+    <w:p>
+      <w:pPr>
+        <w:pStyle w:val="Caption"/>
+      </w:pPr>
+      <w:r>
+        <w:t xml:space="preserve">Figure </w:t>
+      </w:r>
+      <w:r>
+        <w:fldChar w:fldCharType="begin"/>
+      </w:r>
+      <w:r>
+        <w:instrText xml:space="preserve"> SEQ Figure \* ARABIC </w:instrText>
+      </w:r>
+      <w:r>
+        <w:fldChar w:fldCharType="separate"/>
+      </w:r>
+      <w:r>
+        <w:rPr>
+          <w:noProof/>
+        </w:rPr>
+        <w:t>8</w:t>
+      </w:r>
+      <w:r>
+        <w:fldChar w:fldCharType="end"/>
+      </w:r>
+      <w:r>
+        <w:t>: Binary Conversion test</w:t>
       </w:r>
     </w:p>
     <w:p>

</xml_diff>

<commit_message>
Refactor number to words conversion logic
Simplified and clarified the recursive logic in NumberToWords.java for converting numbers to words. Added a dedicated method for handling 'teens' (10-19), improved handling of thousands, hundreds, tens, and units, and fixed edge cases for zero. The code is now more readable and robust.
</commit_message>
<xml_diff>
--- a/Modules/Semester_1/Modern Code/Aufgaben/06_Recursion/Protocol.docx
+++ b/Modules/Semester_1/Modern Code/Aufgaben/06_Recursion/Protocol.docx
@@ -4911,6 +4911,11 @@
       </w:r>
     </w:p>
     <w:p>
+      <w:r>
+        <w:t xml:space="preserve">I created methods for converting units to words, tens to words and teens to words. In the recursive method, I check the length of the number and appropriately convert the unit, either add thousand or hundred to the string, and handle the number from 99 – 20 and 19 to 10 separately. The base case is if the number is either a teen or a lower than 10, or equal to zero. Each recursive step, I remove the first digit of the number. </w:t>
+      </w:r>
+    </w:p>
+    <w:p>
       <w:pPr>
         <w:pStyle w:val="Heading2"/>
       </w:pPr>
@@ -4918,12 +4923,844 @@
         <w:t>Code</w:t>
       </w:r>
     </w:p>
+    <w:p/>
+    <w:p>
+      <w:pPr>
+        <w:pStyle w:val="Pseoudocode"/>
+      </w:pPr>
+      <w:r>
+        <w:t>private static String numberToWords(int number, StringBuilder str)</w:t>
+      </w:r>
+      <w:r>
+        <w:br/>
+        <w:t>{</w:t>
+      </w:r>
+      <w:r>
+        <w:br/>
+        <w:t xml:space="preserve">    if (number &lt; 0 || number &gt; </w:t>
+      </w:r>
+      <w:r>
+        <w:rPr>
+          <w:i/>
+          <w:iCs/>
+        </w:rPr>
+        <w:t>MAX_NUMBER</w:t>
+      </w:r>
+      <w:r>
+        <w:t>)</w:t>
+      </w:r>
+      <w:r>
+        <w:br/>
+        <w:t xml:space="preserve">    {</w:t>
+      </w:r>
+      <w:r>
+        <w:br/>
+        <w:t xml:space="preserve">        throw new IllegalArgumentException("Number must be between 0 and " + </w:t>
+      </w:r>
+      <w:r>
+        <w:rPr>
+          <w:i/>
+          <w:iCs/>
+        </w:rPr>
+        <w:t>MAX_NUMBER</w:t>
+      </w:r>
+      <w:r>
+        <w:t>);</w:t>
+      </w:r>
+      <w:r>
+        <w:br/>
+        <w:t xml:space="preserve">    }</w:t>
+      </w:r>
+      <w:r>
+        <w:br/>
+      </w:r>
+      <w:r>
+        <w:br/>
+        <w:t xml:space="preserve">    // thousands</w:t>
+      </w:r>
+      <w:r>
+        <w:br/>
+      </w:r>
+      <w:r>
+        <w:br/>
+        <w:t xml:space="preserve">    if (number &gt;= 1000)</w:t>
+      </w:r>
+      <w:r>
+        <w:br/>
+        <w:t xml:space="preserve">    {</w:t>
+      </w:r>
+      <w:r>
+        <w:br/>
+        <w:t xml:space="preserve">        str.append(</w:t>
+      </w:r>
+      <w:r>
+        <w:rPr>
+          <w:i/>
+          <w:iCs/>
+        </w:rPr>
+        <w:t>convertNumberToWord</w:t>
+      </w:r>
+      <w:r>
+        <w:t>(</w:t>
+      </w:r>
+      <w:r>
+        <w:rPr>
+          <w:i/>
+          <w:iCs/>
+        </w:rPr>
+        <w:t>getFirstDigit</w:t>
+      </w:r>
+      <w:r>
+        <w:t>(number))).append(" Thousand ");</w:t>
+      </w:r>
+      <w:r>
+        <w:br/>
+      </w:r>
+      <w:r>
+        <w:br/>
+        <w:t xml:space="preserve">        return </w:t>
+      </w:r>
+      <w:r>
+        <w:rPr>
+          <w:i/>
+          <w:iCs/>
+        </w:rPr>
+        <w:t>numberToWords</w:t>
+      </w:r>
+      <w:r>
+        <w:t>(</w:t>
+      </w:r>
+      <w:r>
+        <w:rPr>
+          <w:i/>
+          <w:iCs/>
+        </w:rPr>
+        <w:t>removeFirstDigit</w:t>
+      </w:r>
+      <w:r>
+        <w:t>(number), str);</w:t>
+      </w:r>
+      <w:r>
+        <w:br/>
+        <w:t xml:space="preserve">    }</w:t>
+      </w:r>
+      <w:r>
+        <w:br/>
+      </w:r>
+      <w:r>
+        <w:br/>
+        <w:t xml:space="preserve">    // hundreds</w:t>
+      </w:r>
+      <w:r>
+        <w:br/>
+        <w:t xml:space="preserve">    if (number &gt;= 100)</w:t>
+      </w:r>
+      <w:r>
+        <w:br/>
+        <w:t xml:space="preserve">    {</w:t>
+      </w:r>
+      <w:r>
+        <w:br/>
+        <w:t xml:space="preserve">        str.append(</w:t>
+      </w:r>
+      <w:r>
+        <w:rPr>
+          <w:i/>
+          <w:iCs/>
+        </w:rPr>
+        <w:t>convertNumberToWord</w:t>
+      </w:r>
+      <w:r>
+        <w:t>(</w:t>
+      </w:r>
+      <w:r>
+        <w:rPr>
+          <w:i/>
+          <w:iCs/>
+        </w:rPr>
+        <w:t>getFirstDigit</w:t>
+      </w:r>
+      <w:r>
+        <w:t>(number))).append(" Hundred ");</w:t>
+      </w:r>
+      <w:r>
+        <w:br/>
+        <w:t xml:space="preserve">        return </w:t>
+      </w:r>
+      <w:r>
+        <w:rPr>
+          <w:i/>
+          <w:iCs/>
+        </w:rPr>
+        <w:t>numberToWords</w:t>
+      </w:r>
+      <w:r>
+        <w:t>(</w:t>
+      </w:r>
+      <w:r>
+        <w:rPr>
+          <w:i/>
+          <w:iCs/>
+        </w:rPr>
+        <w:t>removeFirstDigit</w:t>
+      </w:r>
+      <w:r>
+        <w:t>(number), str);</w:t>
+      </w:r>
+      <w:r>
+        <w:br/>
+      </w:r>
+      <w:r>
+        <w:lastRenderedPageBreak/>
+        <w:t xml:space="preserve">    }</w:t>
+      </w:r>
+      <w:r>
+        <w:br/>
+      </w:r>
+      <w:r>
+        <w:br/>
+        <w:t xml:space="preserve">    // tens</w:t>
+      </w:r>
+      <w:r>
+        <w:br/>
+        <w:t xml:space="preserve">    if (number &gt;= 20)</w:t>
+      </w:r>
+      <w:r>
+        <w:br/>
+        <w:t xml:space="preserve">    {</w:t>
+      </w:r>
+      <w:r>
+        <w:br/>
+        <w:t xml:space="preserve">        str.append(</w:t>
+      </w:r>
+      <w:r>
+        <w:rPr>
+          <w:i/>
+          <w:iCs/>
+        </w:rPr>
+        <w:t>convertTensToWord</w:t>
+      </w:r>
+      <w:r>
+        <w:t>(number)).append(" ");</w:t>
+      </w:r>
+      <w:r>
+        <w:br/>
+        <w:t xml:space="preserve">        return </w:t>
+      </w:r>
+      <w:r>
+        <w:rPr>
+          <w:i/>
+          <w:iCs/>
+        </w:rPr>
+        <w:t>numberToWords</w:t>
+      </w:r>
+      <w:r>
+        <w:t>(</w:t>
+      </w:r>
+      <w:r>
+        <w:rPr>
+          <w:i/>
+          <w:iCs/>
+        </w:rPr>
+        <w:t>removeFirstDigit</w:t>
+      </w:r>
+      <w:r>
+        <w:t>(number), str);</w:t>
+      </w:r>
+      <w:r>
+        <w:br/>
+        <w:t xml:space="preserve">    }</w:t>
+      </w:r>
+      <w:r>
+        <w:br/>
+      </w:r>
+      <w:r>
+        <w:br/>
+        <w:t xml:space="preserve">    // teens</w:t>
+      </w:r>
+      <w:r>
+        <w:br/>
+        <w:t xml:space="preserve">    if (number &gt;= 10)</w:t>
+      </w:r>
+      <w:r>
+        <w:br/>
+        <w:t xml:space="preserve">    {</w:t>
+      </w:r>
+      <w:r>
+        <w:br/>
+        <w:t xml:space="preserve">        str.append(</w:t>
+      </w:r>
+      <w:r>
+        <w:rPr>
+          <w:i/>
+          <w:iCs/>
+        </w:rPr>
+        <w:t>convertTeensToWord</w:t>
+      </w:r>
+      <w:r>
+        <w:t>(number)).append(" ");</w:t>
+      </w:r>
+      <w:r>
+        <w:br/>
+        <w:t xml:space="preserve">        return str.toString().trim();</w:t>
+      </w:r>
+      <w:r>
+        <w:br/>
+        <w:t xml:space="preserve">    }</w:t>
+      </w:r>
+      <w:r>
+        <w:br/>
+      </w:r>
+      <w:r>
+        <w:br/>
+        <w:t xml:space="preserve">    // units</w:t>
+      </w:r>
+      <w:r>
+        <w:br/>
+        <w:t xml:space="preserve">    if (number &gt; 0)</w:t>
+      </w:r>
+      <w:r>
+        <w:br/>
+        <w:t xml:space="preserve">    {</w:t>
+      </w:r>
+      <w:r>
+        <w:br/>
+        <w:t xml:space="preserve">        str.append(</w:t>
+      </w:r>
+      <w:r>
+        <w:rPr>
+          <w:i/>
+          <w:iCs/>
+        </w:rPr>
+        <w:t>convertNumberToWord</w:t>
+      </w:r>
+      <w:r>
+        <w:t>(number)).append(" ");</w:t>
+      </w:r>
+      <w:r>
+        <w:br/>
+        <w:t xml:space="preserve">        return str.toString().trim();</w:t>
+      </w:r>
+      <w:r>
+        <w:br/>
+        <w:t xml:space="preserve">    }</w:t>
+      </w:r>
+      <w:r>
+        <w:br/>
+      </w:r>
+      <w:r>
+        <w:br/>
+        <w:t xml:space="preserve">    if (str.isEmpty())</w:t>
+      </w:r>
+      <w:r>
+        <w:br/>
+        <w:t xml:space="preserve">    {</w:t>
+      </w:r>
+      <w:r>
+        <w:br/>
+        <w:t xml:space="preserve">        str.append(</w:t>
+      </w:r>
+      <w:r>
+        <w:rPr>
+          <w:i/>
+          <w:iCs/>
+        </w:rPr>
+        <w:t>convertNumberToWord</w:t>
+      </w:r>
+      <w:r>
+        <w:t>(0)).append(" ");</w:t>
+      </w:r>
+      <w:r>
+        <w:br/>
+        <w:t xml:space="preserve">        return str.toString().trim();</w:t>
+      </w:r>
+      <w:r>
+        <w:br/>
+        <w:t xml:space="preserve">    }</w:t>
+      </w:r>
+      <w:r>
+        <w:br/>
+      </w:r>
+      <w:r>
+        <w:br/>
+        <w:t xml:space="preserve">    return str.toString().trim();</w:t>
+      </w:r>
+      <w:r>
+        <w:br/>
+        <w:t>}</w:t>
+      </w:r>
+    </w:p>
+    <w:p>
+      <w:pPr>
+        <w:pStyle w:val="Pseoudocode"/>
+      </w:pPr>
+      <w:r>
+        <w:t>private static String convertNumberToWord(int number)</w:t>
+      </w:r>
+      <w:r>
+        <w:br/>
+        <w:t>{</w:t>
+      </w:r>
+      <w:r>
+        <w:br/>
+        <w:t xml:space="preserve">    if (number &lt; 0 || number &gt; 9)</w:t>
+      </w:r>
+      <w:r>
+        <w:br/>
+        <w:t xml:space="preserve">    {</w:t>
+      </w:r>
+      <w:r>
+        <w:br/>
+        <w:t xml:space="preserve">        throw new IllegalArgumentException("Number must be between 0 and 9");</w:t>
+      </w:r>
+      <w:r>
+        <w:br/>
+        <w:t xml:space="preserve">    }</w:t>
+      </w:r>
+      <w:r>
+        <w:br/>
+      </w:r>
+      <w:r>
+        <w:br/>
+        <w:t xml:space="preserve">    String[] words = {</w:t>
+      </w:r>
+      <w:r>
+        <w:br/>
+        <w:t xml:space="preserve">        "Zero", "One", "Two", "Three", "Four",</w:t>
+      </w:r>
+      <w:r>
+        <w:br/>
+        <w:t xml:space="preserve">        "Five", "Six", "Seven", "Eight", "Nine"</w:t>
+      </w:r>
+      <w:r>
+        <w:br/>
+      </w:r>
+      <w:r>
+        <w:lastRenderedPageBreak/>
+        <w:t xml:space="preserve">    };</w:t>
+      </w:r>
+      <w:r>
+        <w:br/>
+      </w:r>
+      <w:r>
+        <w:br/>
+        <w:t xml:space="preserve">    return words[number];</w:t>
+      </w:r>
+      <w:r>
+        <w:br/>
+        <w:t>}</w:t>
+      </w:r>
+      <w:r>
+        <w:br/>
+      </w:r>
+      <w:r>
+        <w:br/>
+        <w:t>private static String convertTeensToWord(int number)</w:t>
+      </w:r>
+      <w:r>
+        <w:br/>
+        <w:t>{</w:t>
+      </w:r>
+      <w:r>
+        <w:br/>
+        <w:t xml:space="preserve">    if (number &lt; 10 || number &gt; 19)</w:t>
+      </w:r>
+      <w:r>
+        <w:br/>
+        <w:t xml:space="preserve">    {</w:t>
+      </w:r>
+      <w:r>
+        <w:br/>
+        <w:t xml:space="preserve">        throw new IllegalArgumentException("Number must be between 10 and 19");</w:t>
+      </w:r>
+      <w:r>
+        <w:br/>
+        <w:t xml:space="preserve">    }</w:t>
+      </w:r>
+      <w:r>
+        <w:br/>
+      </w:r>
+      <w:r>
+        <w:br/>
+        <w:t xml:space="preserve">    String[] words = {</w:t>
+      </w:r>
+      <w:r>
+        <w:br/>
+        <w:t xml:space="preserve">        "Ten", "Eleven", "Twelve", "Thirteen", "Fourteen",</w:t>
+      </w:r>
+      <w:r>
+        <w:br/>
+        <w:t xml:space="preserve">        "Fifteen", "Sixteen", "Seventeen", "Eighteen", "Nineteen"</w:t>
+      </w:r>
+      <w:r>
+        <w:br/>
+        <w:t xml:space="preserve">    };</w:t>
+      </w:r>
+      <w:r>
+        <w:br/>
+      </w:r>
+      <w:r>
+        <w:br/>
+        <w:t xml:space="preserve">    return words[number - 10];</w:t>
+      </w:r>
+      <w:r>
+        <w:br/>
+        <w:t>}</w:t>
+      </w:r>
+      <w:r>
+        <w:br/>
+      </w:r>
+      <w:r>
+        <w:br/>
+        <w:t>private static String convertTensToWord(int number)</w:t>
+      </w:r>
+      <w:r>
+        <w:br/>
+        <w:t>{</w:t>
+      </w:r>
+      <w:r>
+        <w:br/>
+        <w:t xml:space="preserve">    if (number &lt; 20 || number &gt; 99)</w:t>
+      </w:r>
+      <w:r>
+        <w:br/>
+        <w:t xml:space="preserve">    {</w:t>
+      </w:r>
+      <w:r>
+        <w:br/>
+        <w:t xml:space="preserve">        throw new IllegalArgumentException("Number must be between 10 and 99");</w:t>
+      </w:r>
+      <w:r>
+        <w:br/>
+        <w:t xml:space="preserve">    }</w:t>
+      </w:r>
+      <w:r>
+        <w:br/>
+      </w:r>
+      <w:r>
+        <w:br/>
+        <w:t xml:space="preserve">    String[] words = {</w:t>
+      </w:r>
+      <w:r>
+        <w:br/>
+        <w:t xml:space="preserve">        "Twenty", "Thirty", "Forty", "Fifty", "Sixty",</w:t>
+      </w:r>
+      <w:r>
+        <w:br/>
+        <w:t xml:space="preserve">        "Seventy", "Eighty", "Ninety"</w:t>
+      </w:r>
+      <w:r>
+        <w:br/>
+        <w:t xml:space="preserve">    };</w:t>
+      </w:r>
+      <w:r>
+        <w:br/>
+      </w:r>
+      <w:r>
+        <w:br/>
+        <w:t xml:space="preserve">    return words[(number / 10) - 2];</w:t>
+      </w:r>
+      <w:r>
+        <w:br/>
+        <w:t>}</w:t>
+      </w:r>
+      <w:r>
+        <w:br/>
+      </w:r>
+      <w:r>
+        <w:br/>
+        <w:t>private static int getFirstDigit(int number)</w:t>
+      </w:r>
+      <w:r>
+        <w:br/>
+        <w:t>{</w:t>
+      </w:r>
+      <w:r>
+        <w:br/>
+        <w:t xml:space="preserve">    while (number &gt;= 10)</w:t>
+      </w:r>
+      <w:r>
+        <w:br/>
+        <w:t xml:space="preserve">    {</w:t>
+      </w:r>
+      <w:r>
+        <w:br/>
+      </w:r>
+      <w:r>
+        <w:lastRenderedPageBreak/>
+        <w:t xml:space="preserve">        number /= 10;</w:t>
+      </w:r>
+      <w:r>
+        <w:br/>
+        <w:t xml:space="preserve">    }</w:t>
+      </w:r>
+      <w:r>
+        <w:br/>
+        <w:t xml:space="preserve">    return number;</w:t>
+      </w:r>
+      <w:r>
+        <w:br/>
+        <w:t>}</w:t>
+      </w:r>
+      <w:r>
+        <w:br/>
+      </w:r>
+      <w:r>
+        <w:br/>
+        <w:t>private static int getLastDigit(int number)</w:t>
+      </w:r>
+      <w:r>
+        <w:br/>
+        <w:t>{</w:t>
+      </w:r>
+      <w:r>
+        <w:br/>
+        <w:t xml:space="preserve">    return number % 10;</w:t>
+      </w:r>
+      <w:r>
+        <w:br/>
+        <w:t>}</w:t>
+      </w:r>
+      <w:r>
+        <w:br/>
+      </w:r>
+      <w:r>
+        <w:br/>
+        <w:t>public static int removeFirstDigit(int number)</w:t>
+      </w:r>
+      <w:r>
+        <w:br/>
+        <w:t>{</w:t>
+      </w:r>
+      <w:r>
+        <w:br/>
+        <w:t xml:space="preserve">    int divisor = 1;</w:t>
+      </w:r>
+      <w:r>
+        <w:br/>
+      </w:r>
+      <w:r>
+        <w:br/>
+        <w:t xml:space="preserve">    while (number / divisor &gt;= 10)</w:t>
+      </w:r>
+      <w:r>
+        <w:br/>
+        <w:t xml:space="preserve">    {</w:t>
+      </w:r>
+      <w:r>
+        <w:br/>
+        <w:t xml:space="preserve">        divisor *= 10;</w:t>
+      </w:r>
+      <w:r>
+        <w:br/>
+        <w:t xml:space="preserve">    }</w:t>
+      </w:r>
+      <w:r>
+        <w:br/>
+      </w:r>
+      <w:r>
+        <w:br/>
+        <w:t xml:space="preserve">    return number % divisor;</w:t>
+      </w:r>
+      <w:r>
+        <w:br/>
+        <w:t>}</w:t>
+      </w:r>
+    </w:p>
+    <w:p>
+      <w:pPr>
+        <w:pStyle w:val="Caption"/>
+        <w:rPr>
+          <w:lang w:val="en-AT"/>
+        </w:rPr>
+      </w:pPr>
+      <w:r>
+        <w:t xml:space="preserve">Figure </w:t>
+      </w:r>
+      <w:r>
+        <w:fldChar w:fldCharType="begin"/>
+      </w:r>
+      <w:r>
+        <w:instrText xml:space="preserve"> SEQ Figure \* ARABIC </w:instrText>
+      </w:r>
+      <w:r>
+        <w:fldChar w:fldCharType="separate"/>
+      </w:r>
+      <w:r>
+        <w:rPr>
+          <w:noProof/>
+        </w:rPr>
+        <w:t>9</w:t>
+      </w:r>
+      <w:r>
+        <w:fldChar w:fldCharType="end"/>
+      </w:r>
+      <w:r>
+        <w:t>: Convert number to words</w:t>
+      </w:r>
+    </w:p>
+    <w:p/>
     <w:p>
       <w:pPr>
         <w:pStyle w:val="Heading2"/>
       </w:pPr>
       <w:r>
         <w:t>Test</w:t>
+      </w:r>
+    </w:p>
+    <w:p>
+      <w:pPr>
+        <w:pStyle w:val="Pseoudocode"/>
+      </w:pPr>
+      <w:r>
+        <w:t>==================================================</w:t>
+      </w:r>
+    </w:p>
+    <w:p>
+      <w:pPr>
+        <w:pStyle w:val="Pseoudocode"/>
+      </w:pPr>
+      <w:r>
+        <w:t>=== Number to Words Conversion ===</w:t>
+      </w:r>
+    </w:p>
+    <w:p>
+      <w:pPr>
+        <w:pStyle w:val="Pseoudocode"/>
+      </w:pPr>
+      <w:r>
+        <w:t>==================================================</w:t>
+      </w:r>
+    </w:p>
+    <w:p>
+      <w:pPr>
+        <w:pStyle w:val="Pseoudocode"/>
+      </w:pPr>
+    </w:p>
+    <w:p>
+      <w:pPr>
+        <w:pStyle w:val="Pseoudocode"/>
+      </w:pPr>
+      <w:r>
+        <w:t>0      -&gt; Zero</w:t>
+      </w:r>
+    </w:p>
+    <w:p>
+      <w:pPr>
+        <w:pStyle w:val="Pseoudocode"/>
+      </w:pPr>
+      <w:r>
+        <w:t>5      -&gt; Five</w:t>
+      </w:r>
+    </w:p>
+    <w:p>
+      <w:pPr>
+        <w:pStyle w:val="Pseoudocode"/>
+      </w:pPr>
+      <w:r>
+        <w:t>19     -&gt; Nineteen</w:t>
+      </w:r>
+    </w:p>
+    <w:p>
+      <w:pPr>
+        <w:pStyle w:val="Pseoudocode"/>
+      </w:pPr>
+      <w:r>
+        <w:t>23     -&gt; Twenty Three</w:t>
+      </w:r>
+    </w:p>
+    <w:p>
+      <w:pPr>
+        <w:pStyle w:val="Pseoudocode"/>
+      </w:pPr>
+      <w:r>
+        <w:t>42     -&gt; Forty Two</w:t>
+      </w:r>
+    </w:p>
+    <w:p>
+      <w:pPr>
+        <w:pStyle w:val="Pseoudocode"/>
+      </w:pPr>
+      <w:r>
+        <w:t>100    -&gt; One Hundred</w:t>
+      </w:r>
+    </w:p>
+    <w:p>
+      <w:pPr>
+        <w:pStyle w:val="Pseoudocode"/>
+      </w:pPr>
+      <w:r>
+        <w:t>123    -&gt; One Hundred Twenty Three</w:t>
+      </w:r>
+    </w:p>
+    <w:p>
+      <w:pPr>
+        <w:pStyle w:val="Pseoudocode"/>
+      </w:pPr>
+      <w:r>
+        <w:t>456    -&gt; Four Hundred Fifty Six</w:t>
+      </w:r>
+    </w:p>
+    <w:p>
+      <w:pPr>
+        <w:pStyle w:val="Pseoudocode"/>
+      </w:pPr>
+      <w:r>
+        <w:t>1000   -&gt; One Thousand</w:t>
+      </w:r>
+    </w:p>
+    <w:p>
+      <w:pPr>
+        <w:pStyle w:val="Pseoudocode"/>
+      </w:pPr>
+      <w:r>
+        <w:t>1234   -&gt; One Thousand Two Hundred Thirty Four</w:t>
+      </w:r>
+    </w:p>
+    <w:p>
+      <w:pPr>
+        <w:pStyle w:val="Pseoudocode"/>
+      </w:pPr>
+      <w:r>
+        <w:t>5678   -&gt; Five Thousand Six Hundred Seventy Eight</w:t>
+      </w:r>
+    </w:p>
+    <w:p>
+      <w:pPr>
+        <w:pStyle w:val="Pseoudocode"/>
+      </w:pPr>
+      <w:r>
+        <w:lastRenderedPageBreak/>
+        <w:t>9999   -&gt; Nine Thousand Nine Hundred Ninety Nine</w:t>
+      </w:r>
+    </w:p>
+    <w:p>
+      <w:pPr>
+        <w:pStyle w:val="Caption"/>
+      </w:pPr>
+      <w:r>
+        <w:t xml:space="preserve">Figure </w:t>
+      </w:r>
+      <w:r>
+        <w:fldChar w:fldCharType="begin"/>
+      </w:r>
+      <w:r>
+        <w:instrText xml:space="preserve"> SEQ Figure \* ARABIC </w:instrText>
+      </w:r>
+      <w:r>
+        <w:fldChar w:fldCharType="separate"/>
+      </w:r>
+      <w:r>
+        <w:rPr>
+          <w:noProof/>
+        </w:rPr>
+        <w:t>10</w:t>
+      </w:r>
+      <w:r>
+        <w:fldChar w:fldCharType="end"/>
+      </w:r>
+      <w:r>
+        <w:t>: number conversion test</w:t>
       </w:r>
     </w:p>
     <w:p>

</xml_diff>

<commit_message>
Add Tribonacci sequence feature with UI integration
Implemented a memoized Tribonacci sequence calculator in Tribonacci.java. Added TribonacciScreen to display the sequence in the UI and updated MainScreen to launch the new Tribonacci screen.
</commit_message>
<xml_diff>
--- a/Modules/Semester_1/Modern Code/Aufgaben/06_Recursion/Protocol.docx
+++ b/Modules/Semester_1/Modern Code/Aufgaben/06_Recursion/Protocol.docx
@@ -3160,7 +3160,15 @@
     </w:p>
     <w:p>
       <w:r>
-        <w:t>The memoized approach uses an external array that gets passed along. First I check if n is outside the bounds of the array, then I check is the value for n is already calculated, otherwise is calculate the value and add it to the array.</w:t>
+        <w:t xml:space="preserve">The </w:t>
+      </w:r>
+      <w:proofErr w:type="spellStart"/>
+      <w:r>
+        <w:t>memoized</w:t>
+      </w:r>
+      <w:proofErr w:type="spellEnd"/>
+      <w:r>
+        <w:t xml:space="preserve"> approach uses an external array that gets passed along. First I check if n is outside the bounds of the array, then I check is the value for n is already calculated, otherwise is calculate the value and add it to the array.</w:t>
       </w:r>
     </w:p>
     <w:p>
@@ -3178,7 +3186,15 @@
         <w:pStyle w:val="Pseoudocode"/>
       </w:pPr>
       <w:r>
-        <w:t>public int fibonacciIterative(int n)</w:t>
+        <w:t xml:space="preserve">public int </w:t>
+      </w:r>
+      <w:proofErr w:type="spellStart"/>
+      <w:r>
+        <w:t>fibonacciIterative</w:t>
+      </w:r>
+      <w:proofErr w:type="spellEnd"/>
+      <w:r>
+        <w:t>(int n)</w:t>
       </w:r>
       <w:r>
         <w:br/>
@@ -3278,7 +3294,15 @@
         <w:fldChar w:fldCharType="end"/>
       </w:r>
       <w:r>
-        <w:t>: fibonacci iterative</w:t>
+        <w:t xml:space="preserve">: </w:t>
+      </w:r>
+      <w:proofErr w:type="spellStart"/>
+      <w:r>
+        <w:t>fibonacci</w:t>
+      </w:r>
+      <w:proofErr w:type="spellEnd"/>
+      <w:r>
+        <w:t xml:space="preserve"> iterative</w:t>
       </w:r>
     </w:p>
     <w:p>
@@ -3293,7 +3317,15 @@
         <w:pStyle w:val="Pseoudocode"/>
       </w:pPr>
       <w:r>
-        <w:t>public int fibonacciRecursive(int n)</w:t>
+        <w:t xml:space="preserve">public int </w:t>
+      </w:r>
+      <w:proofErr w:type="spellStart"/>
+      <w:r>
+        <w:t>fibonacciRecursive</w:t>
+      </w:r>
+      <w:proofErr w:type="spellEnd"/>
+      <w:r>
+        <w:t>(int n)</w:t>
       </w:r>
       <w:r>
         <w:br/>
@@ -3323,7 +3355,23 @@
       </w:r>
       <w:r>
         <w:br/>
-        <w:t xml:space="preserve">    return fibonacciRecursive(n - 1) + fibonacciRecursive(n - 2);</w:t>
+        <w:t xml:space="preserve">    return </w:t>
+      </w:r>
+      <w:proofErr w:type="spellStart"/>
+      <w:r>
+        <w:t>fibonacciRecursive</w:t>
+      </w:r>
+      <w:proofErr w:type="spellEnd"/>
+      <w:r>
+        <w:t xml:space="preserve">(n - 1) + </w:t>
+      </w:r>
+      <w:proofErr w:type="spellStart"/>
+      <w:r>
+        <w:t>fibonacciRecursive</w:t>
+      </w:r>
+      <w:proofErr w:type="spellEnd"/>
+      <w:r>
+        <w:t>(n - 2);</w:t>
       </w:r>
       <w:r>
         <w:br/>
@@ -3371,7 +3419,23 @@
         <w:pStyle w:val="Pseoudocode"/>
       </w:pPr>
       <w:r>
-        <w:t>public int fibonacciMemoized(int n, int memoSize)</w:t>
+        <w:t xml:space="preserve">public int </w:t>
+      </w:r>
+      <w:proofErr w:type="spellStart"/>
+      <w:r>
+        <w:t>fibonacciMemoized</w:t>
+      </w:r>
+      <w:proofErr w:type="spellEnd"/>
+      <w:r>
+        <w:t xml:space="preserve">(int n, int </w:t>
+      </w:r>
+      <w:proofErr w:type="spellStart"/>
+      <w:r>
+        <w:t>memoSize</w:t>
+      </w:r>
+      <w:proofErr w:type="spellEnd"/>
+      <w:r>
+        <w:t>)</w:t>
       </w:r>
       <w:r>
         <w:br/>
@@ -3379,14 +3443,38 @@
       </w:r>
       <w:r>
         <w:br/>
-        <w:t xml:space="preserve">    int[] memo = new int[memoSize];</w:t>
-      </w:r>
-      <w:r>
-        <w:br/>
-      </w:r>
-      <w:r>
-        <w:br/>
-        <w:t xml:space="preserve">    return fibonacciMemoized(n, memo);</w:t>
+        <w:t xml:space="preserve">    int[] memo = new </w:t>
+      </w:r>
+      <w:proofErr w:type="spellStart"/>
+      <w:r>
+        <w:t>int</w:t>
+      </w:r>
+      <w:proofErr w:type="spellEnd"/>
+      <w:r>
+        <w:t>[</w:t>
+      </w:r>
+      <w:proofErr w:type="spellStart"/>
+      <w:r>
+        <w:t>memoSize</w:t>
+      </w:r>
+      <w:proofErr w:type="spellEnd"/>
+      <w:r>
+        <w:t>];</w:t>
+      </w:r>
+      <w:r>
+        <w:br/>
+      </w:r>
+      <w:r>
+        <w:br/>
+        <w:t xml:space="preserve">    return </w:t>
+      </w:r>
+      <w:proofErr w:type="spellStart"/>
+      <w:r>
+        <w:t>fibonacciMemoized</w:t>
+      </w:r>
+      <w:proofErr w:type="spellEnd"/>
+      <w:r>
+        <w:t>(n, memo);</w:t>
       </w:r>
       <w:r>
         <w:br/>
@@ -3397,7 +3485,15 @@
       </w:r>
       <w:r>
         <w:br/>
-        <w:t>private int fibonacciMemoized(int n, int[] memo)</w:t>
+        <w:t xml:space="preserve">private int </w:t>
+      </w:r>
+      <w:proofErr w:type="spellStart"/>
+      <w:r>
+        <w:t>fibonacciMemoized</w:t>
+      </w:r>
+      <w:proofErr w:type="spellEnd"/>
+      <w:r>
+        <w:t>(int n, int[] memo)</w:t>
       </w:r>
       <w:r>
         <w:br/>
@@ -3424,7 +3520,15 @@
       </w:r>
       <w:r>
         <w:br/>
-        <w:t xml:space="preserve">    if (n &gt;= memo.length)</w:t>
+        <w:t xml:space="preserve">    if (n &gt;= </w:t>
+      </w:r>
+      <w:proofErr w:type="spellStart"/>
+      <w:r>
+        <w:t>memo.length</w:t>
+      </w:r>
+      <w:proofErr w:type="spellEnd"/>
+      <w:r>
+        <w:t>)</w:t>
       </w:r>
       <w:r>
         <w:br/>
@@ -3432,7 +3536,23 @@
       </w:r>
       <w:r>
         <w:br/>
-        <w:t xml:space="preserve">        return fibonacciMemoized(n - 1, memo) + fibonacciMemoized(n - 2, memo);</w:t>
+        <w:t xml:space="preserve">        return </w:t>
+      </w:r>
+      <w:proofErr w:type="spellStart"/>
+      <w:r>
+        <w:t>fibonacciMemoized</w:t>
+      </w:r>
+      <w:proofErr w:type="spellEnd"/>
+      <w:r>
+        <w:t xml:space="preserve">(n - 1, memo) + </w:t>
+      </w:r>
+      <w:proofErr w:type="spellStart"/>
+      <w:r>
+        <w:t>fibonacciMemoized</w:t>
+      </w:r>
+      <w:proofErr w:type="spellEnd"/>
+      <w:r>
+        <w:t>(n - 2, memo);</w:t>
       </w:r>
       <w:r>
         <w:br/>
@@ -3464,7 +3584,23 @@
       </w:r>
       <w:r>
         <w:br/>
-        <w:t xml:space="preserve">        memo[n] = fibonacciMemoized(n - 1, memo) + fibonacciMemoized(n - 2, memo);</w:t>
+        <w:t xml:space="preserve">        memo[n] = </w:t>
+      </w:r>
+      <w:proofErr w:type="spellStart"/>
+      <w:r>
+        <w:t>fibonacciMemoized</w:t>
+      </w:r>
+      <w:proofErr w:type="spellEnd"/>
+      <w:r>
+        <w:t xml:space="preserve">(n - 1, memo) + </w:t>
+      </w:r>
+      <w:proofErr w:type="spellStart"/>
+      <w:r>
+        <w:t>fibonacciMemoized</w:t>
+      </w:r>
+      <w:proofErr w:type="spellEnd"/>
+      <w:r>
+        <w:t>(n - 2, memo);</w:t>
       </w:r>
       <w:r>
         <w:br/>
@@ -3484,7 +3620,15 @@
       <w:r>
         <w:lastRenderedPageBreak/>
         <w:br/>
-        <w:t>public int fibonacciMemoized(int n)</w:t>
+        <w:t xml:space="preserve">public int </w:t>
+      </w:r>
+      <w:proofErr w:type="spellStart"/>
+      <w:r>
+        <w:t>fibonacciMemoized</w:t>
+      </w:r>
+      <w:proofErr w:type="spellEnd"/>
+      <w:r>
+        <w:t>(int n)</w:t>
       </w:r>
       <w:r>
         <w:br/>
@@ -3492,7 +3636,15 @@
       </w:r>
       <w:r>
         <w:br/>
-        <w:t xml:space="preserve">    return fibonacciMemoized(n, n + 1);</w:t>
+        <w:t xml:space="preserve">    return </w:t>
+      </w:r>
+      <w:proofErr w:type="spellStart"/>
+      <w:r>
+        <w:t>fibonacciMemoized</w:t>
+      </w:r>
+      <w:proofErr w:type="spellEnd"/>
+      <w:r>
+        <w:t>(n, n + 1);</w:t>
       </w:r>
       <w:r>
         <w:br/>
@@ -3528,8 +3680,13 @@
         <w:fldChar w:fldCharType="end"/>
       </w:r>
       <w:r>
-        <w:t>: memoized</w:t>
-      </w:r>
+        <w:t xml:space="preserve">: </w:t>
+      </w:r>
+      <w:proofErr w:type="spellStart"/>
+      <w:r>
+        <w:t>memoized</w:t>
+      </w:r>
+      <w:proofErr w:type="spellEnd"/>
     </w:p>
     <w:p>
       <w:pPr>
@@ -3727,8 +3884,13 @@
       <w:pPr>
         <w:pStyle w:val="Pseoudocode"/>
       </w:pPr>
-      <w:r>
-        <w:t>Memoized Approach:</w:t>
+      <w:proofErr w:type="spellStart"/>
+      <w:r>
+        <w:t>Memoized</w:t>
+      </w:r>
+      <w:proofErr w:type="spellEnd"/>
+      <w:r>
+        <w:t xml:space="preserve"> Approach:</w:t>
       </w:r>
     </w:p>
     <w:p>
@@ -3845,32 +4007,52 @@
       <w:pPr>
         <w:pStyle w:val="Pseoudocode"/>
       </w:pPr>
-      <w:r>
-        <w:t>Memoized (medium memo : 15) result: 102334155, Time: 1867100 ns</w:t>
-      </w:r>
-    </w:p>
-    <w:p>
-      <w:pPr>
-        <w:pStyle w:val="Pseoudocode"/>
-      </w:pPr>
-      <w:r>
-        <w:t>Memoized result (n + 1 memo): 102334155, Time: 16800 ns</w:t>
-      </w:r>
-    </w:p>
-    <w:p>
-      <w:pPr>
-        <w:pStyle w:val="Pseoudocode"/>
-      </w:pPr>
-      <w:r>
-        <w:t>Memoized (large memo : 30) result: 102334155, Time: 134300 ns</w:t>
-      </w:r>
-    </w:p>
-    <w:p>
-      <w:pPr>
-        <w:pStyle w:val="Pseoudocode"/>
-      </w:pPr>
-      <w:r>
-        <w:t>Memoized (small memo : 5) result: 102334155, Time: 56583400 ns</w:t>
+      <w:proofErr w:type="spellStart"/>
+      <w:r>
+        <w:t>Memoized</w:t>
+      </w:r>
+      <w:proofErr w:type="spellEnd"/>
+      <w:r>
+        <w:t xml:space="preserve"> (medium memo : 15) result: 102334155, Time: 1867100 ns</w:t>
+      </w:r>
+    </w:p>
+    <w:p>
+      <w:pPr>
+        <w:pStyle w:val="Pseoudocode"/>
+      </w:pPr>
+      <w:proofErr w:type="spellStart"/>
+      <w:r>
+        <w:t>Memoized</w:t>
+      </w:r>
+      <w:proofErr w:type="spellEnd"/>
+      <w:r>
+        <w:t xml:space="preserve"> result (n + 1 memo): 102334155, Time: 16800 ns</w:t>
+      </w:r>
+    </w:p>
+    <w:p>
+      <w:pPr>
+        <w:pStyle w:val="Pseoudocode"/>
+      </w:pPr>
+      <w:proofErr w:type="spellStart"/>
+      <w:r>
+        <w:t>Memoized</w:t>
+      </w:r>
+      <w:proofErr w:type="spellEnd"/>
+      <w:r>
+        <w:t xml:space="preserve"> (large memo : 30) result: 102334155, Time: 134300 ns</w:t>
+      </w:r>
+    </w:p>
+    <w:p>
+      <w:pPr>
+        <w:pStyle w:val="Pseoudocode"/>
+      </w:pPr>
+      <w:proofErr w:type="spellStart"/>
+      <w:r>
+        <w:t>Memoized</w:t>
+      </w:r>
+      <w:proofErr w:type="spellEnd"/>
+      <w:r>
+        <w:t xml:space="preserve"> (small memo : 5) result: 102334155, Time: 56583400 ns</w:t>
       </w:r>
     </w:p>
     <w:p>
@@ -3920,7 +4102,15 @@
     </w:p>
     <w:p>
       <w:r>
-        <w:t>As expected, the iterative result is the most efficient. Memoization helps a lot with the recursive solution.</w:t>
+        <w:t xml:space="preserve">As expected, the iterative result is the most efficient. </w:t>
+      </w:r>
+      <w:proofErr w:type="spellStart"/>
+      <w:r>
+        <w:t>Memoization</w:t>
+      </w:r>
+      <w:proofErr w:type="spellEnd"/>
+      <w:r>
+        <w:t xml:space="preserve"> helps a lot with the recursive solution.</w:t>
       </w:r>
     </w:p>
     <w:p/>
@@ -3980,7 +4170,15 @@
         <w:pStyle w:val="Pseoudocode"/>
       </w:pPr>
       <w:r>
-        <w:t>public TowerOfHanoi(int disks)</w:t>
+        <w:t xml:space="preserve">public </w:t>
+      </w:r>
+      <w:proofErr w:type="spellStart"/>
+      <w:r>
+        <w:t>TowerOfHanoi</w:t>
+      </w:r>
+      <w:proofErr w:type="spellEnd"/>
+      <w:r>
+        <w:t>(int disks)</w:t>
       </w:r>
       <w:r>
         <w:br/>
@@ -3988,14 +4186,26 @@
       </w:r>
       <w:r>
         <w:br/>
-        <w:t xml:space="preserve">    setDisks(disks);</w:t>
-      </w:r>
-      <w:r>
-        <w:br/>
-      </w:r>
-      <w:r>
-        <w:br/>
-        <w:t xml:space="preserve">    UI.</w:t>
+        <w:t xml:space="preserve">    </w:t>
+      </w:r>
+      <w:proofErr w:type="spellStart"/>
+      <w:r>
+        <w:t>setDisks</w:t>
+      </w:r>
+      <w:proofErr w:type="spellEnd"/>
+      <w:r>
+        <w:t>(disks);</w:t>
+      </w:r>
+      <w:r>
+        <w:br/>
+      </w:r>
+      <w:r>
+        <w:br/>
+        <w:t xml:space="preserve">    </w:t>
+      </w:r>
+      <w:proofErr w:type="spellStart"/>
+      <w:r>
+        <w:t>UI.</w:t>
       </w:r>
       <w:r>
         <w:rPr>
@@ -4004,12 +4214,29 @@
         </w:rPr>
         <w:t>printlnBlue</w:t>
       </w:r>
-      <w:r>
-        <w:t>("Solving Tower of Hanoi with " + getDisks() + " disks:");</w:t>
-      </w:r>
-      <w:r>
-        <w:br/>
-        <w:t xml:space="preserve">    solve(getDisks(), 'A', 'C', 'B');</w:t>
+      <w:proofErr w:type="spellEnd"/>
+      <w:r>
+        <w:t xml:space="preserve">("Solving Tower of Hanoi with " + </w:t>
+      </w:r>
+      <w:proofErr w:type="spellStart"/>
+      <w:r>
+        <w:t>getDisks</w:t>
+      </w:r>
+      <w:proofErr w:type="spellEnd"/>
+      <w:r>
+        <w:t>() + " disks:");</w:t>
+      </w:r>
+      <w:r>
+        <w:br/>
+        <w:t xml:space="preserve">    solve(</w:t>
+      </w:r>
+      <w:proofErr w:type="spellStart"/>
+      <w:r>
+        <w:t>getDisks</w:t>
+      </w:r>
+      <w:proofErr w:type="spellEnd"/>
+      <w:r>
+        <w:t>(), 'A', 'C', 'B');</w:t>
       </w:r>
       <w:r>
         <w:br/>
@@ -4020,7 +4247,31 @@
       </w:r>
       <w:r>
         <w:br/>
-        <w:t>private void solve(int n, char fromPeg, char toPeg, char auxPeg)</w:t>
+        <w:t xml:space="preserve">private void solve(int n, char </w:t>
+      </w:r>
+      <w:proofErr w:type="spellStart"/>
+      <w:r>
+        <w:t>fromPeg</w:t>
+      </w:r>
+      <w:proofErr w:type="spellEnd"/>
+      <w:r>
+        <w:t xml:space="preserve">, char </w:t>
+      </w:r>
+      <w:proofErr w:type="spellStart"/>
+      <w:r>
+        <w:t>toPeg</w:t>
+      </w:r>
+      <w:proofErr w:type="spellEnd"/>
+      <w:r>
+        <w:t xml:space="preserve">, char </w:t>
+      </w:r>
+      <w:proofErr w:type="spellStart"/>
+      <w:r>
+        <w:t>auxPeg</w:t>
+      </w:r>
+      <w:proofErr w:type="spellEnd"/>
+      <w:r>
+        <w:t>)</w:t>
       </w:r>
       <w:r>
         <w:br/>
@@ -4047,14 +4298,42 @@
       </w:r>
       <w:r>
         <w:br/>
-        <w:t xml:space="preserve">    solve(n - 1, fromPeg, auxPeg, toPeg);</w:t>
-      </w:r>
-      <w:r>
-        <w:br/>
-      </w:r>
-      <w:r>
-        <w:br/>
-        <w:t xml:space="preserve">    UI.</w:t>
+        <w:t xml:space="preserve">    solve(n - 1, </w:t>
+      </w:r>
+      <w:proofErr w:type="spellStart"/>
+      <w:r>
+        <w:t>fromPeg</w:t>
+      </w:r>
+      <w:proofErr w:type="spellEnd"/>
+      <w:r>
+        <w:t xml:space="preserve">, </w:t>
+      </w:r>
+      <w:proofErr w:type="spellStart"/>
+      <w:r>
+        <w:t>auxPeg</w:t>
+      </w:r>
+      <w:proofErr w:type="spellEnd"/>
+      <w:r>
+        <w:t xml:space="preserve">, </w:t>
+      </w:r>
+      <w:proofErr w:type="spellStart"/>
+      <w:r>
+        <w:t>toPeg</w:t>
+      </w:r>
+      <w:proofErr w:type="spellEnd"/>
+      <w:r>
+        <w:t>);</w:t>
+      </w:r>
+      <w:r>
+        <w:br/>
+      </w:r>
+      <w:r>
+        <w:br/>
+        <w:t xml:space="preserve">    </w:t>
+      </w:r>
+      <w:proofErr w:type="spellStart"/>
+      <w:r>
+        <w:t>UI.</w:t>
       </w:r>
       <w:r>
         <w:rPr>
@@ -4063,15 +4342,56 @@
         </w:rPr>
         <w:t>printlnGreen</w:t>
       </w:r>
-      <w:r>
-        <w:t>("Move disk " + n + " from peg " + fromPeg + " to peg " + toPeg);</w:t>
-      </w:r>
-      <w:r>
-        <w:br/>
-      </w:r>
-      <w:r>
-        <w:br/>
-        <w:t xml:space="preserve">    solve(n - 1, auxPeg, toPeg, fromPeg);</w:t>
+      <w:proofErr w:type="spellEnd"/>
+      <w:r>
+        <w:t xml:space="preserve">("Move disk " + n + " from peg " + </w:t>
+      </w:r>
+      <w:proofErr w:type="spellStart"/>
+      <w:r>
+        <w:t>fromPeg</w:t>
+      </w:r>
+      <w:proofErr w:type="spellEnd"/>
+      <w:r>
+        <w:t xml:space="preserve"> + " to peg " + </w:t>
+      </w:r>
+      <w:proofErr w:type="spellStart"/>
+      <w:r>
+        <w:t>toPeg</w:t>
+      </w:r>
+      <w:proofErr w:type="spellEnd"/>
+      <w:r>
+        <w:t>);</w:t>
+      </w:r>
+      <w:r>
+        <w:br/>
+      </w:r>
+      <w:r>
+        <w:br/>
+        <w:t xml:space="preserve">    solve(n - 1, </w:t>
+      </w:r>
+      <w:proofErr w:type="spellStart"/>
+      <w:r>
+        <w:t>auxPeg</w:t>
+      </w:r>
+      <w:proofErr w:type="spellEnd"/>
+      <w:r>
+        <w:t xml:space="preserve">, </w:t>
+      </w:r>
+      <w:proofErr w:type="spellStart"/>
+      <w:r>
+        <w:t>toPeg</w:t>
+      </w:r>
+      <w:proofErr w:type="spellEnd"/>
+      <w:r>
+        <w:t xml:space="preserve">, </w:t>
+      </w:r>
+      <w:proofErr w:type="spellStart"/>
+      <w:r>
+        <w:t>fromPeg</w:t>
+      </w:r>
+      <w:proofErr w:type="spellEnd"/>
+      <w:r>
+        <w:t>);</w:t>
       </w:r>
       <w:r>
         <w:br/>
@@ -4576,7 +4896,15 @@
         <w:pStyle w:val="Pseoudocode"/>
       </w:pPr>
       <w:r>
-        <w:t>Move disk 1 from peg A to peg C</w:t>
+        <w:t xml:space="preserve">Move disk 1 from peg A to </w:t>
+      </w:r>
+      <w:proofErr w:type="spellStart"/>
+      <w:r>
+        <w:t>peg</w:t>
+      </w:r>
+      <w:proofErr w:type="spellEnd"/>
+      <w:r>
+        <w:t xml:space="preserve"> C</w:t>
       </w:r>
     </w:p>
     <w:p>
@@ -4644,7 +4972,15 @@
     </w:p>
     <w:p>
       <w:r>
-        <w:t>Using a Stringbuilder, I append the modulus of 2 of the decimal number, before recursing using the half of the decimal number. The base case is decimal == 0 and to check for decimal == 0, I first check if the string is empty to return “0”.</w:t>
+        <w:t xml:space="preserve">Using a </w:t>
+      </w:r>
+      <w:proofErr w:type="spellStart"/>
+      <w:r>
+        <w:t>Stringbuilder</w:t>
+      </w:r>
+      <w:proofErr w:type="spellEnd"/>
+      <w:r>
+        <w:t>, I append the modulus of 2 of the decimal number, before recursing using the half of the decimal number. The base case is decimal == 0 and to check for decimal == 0, I first check if the string is empty to return “0”.</w:t>
       </w:r>
     </w:p>
     <w:p>
@@ -4660,7 +4996,15 @@
         <w:pStyle w:val="Pseoudocode"/>
       </w:pPr>
       <w:r>
-        <w:t>private static String decimalToBinary(int decimal, StringBuilder binary)</w:t>
+        <w:t xml:space="preserve">private static String </w:t>
+      </w:r>
+      <w:proofErr w:type="spellStart"/>
+      <w:r>
+        <w:t>decimalToBinary</w:t>
+      </w:r>
+      <w:proofErr w:type="spellEnd"/>
+      <w:r>
+        <w:t>(int decimal, StringBuilder binary)</w:t>
       </w:r>
       <w:r>
         <w:br/>
@@ -4684,7 +5028,15 @@
       </w:r>
       <w:r>
         <w:br/>
-        <w:t xml:space="preserve">        if (binary.isEmpty())</w:t>
+        <w:t xml:space="preserve">        if (</w:t>
+      </w:r>
+      <w:proofErr w:type="spellStart"/>
+      <w:r>
+        <w:t>binary.isEmpty</w:t>
+      </w:r>
+      <w:proofErr w:type="spellEnd"/>
+      <w:r>
+        <w:t>())</w:t>
       </w:r>
       <w:r>
         <w:br/>
@@ -4707,7 +5059,23 @@
       </w:r>
       <w:r>
         <w:br/>
-        <w:t xml:space="preserve">        return binary.reverse().toString();</w:t>
+        <w:t xml:space="preserve">        return </w:t>
+      </w:r>
+      <w:proofErr w:type="spellStart"/>
+      <w:r>
+        <w:t>binary.reverse</w:t>
+      </w:r>
+      <w:proofErr w:type="spellEnd"/>
+      <w:r>
+        <w:t>().</w:t>
+      </w:r>
+      <w:proofErr w:type="spellStart"/>
+      <w:r>
+        <w:t>toString</w:t>
+      </w:r>
+      <w:proofErr w:type="spellEnd"/>
+      <w:r>
+        <w:t>();</w:t>
       </w:r>
       <w:r>
         <w:br/>
@@ -4718,7 +5086,15 @@
       </w:r>
       <w:r>
         <w:br/>
-        <w:t xml:space="preserve">    binary.append(decimal % 2);</w:t>
+        <w:t xml:space="preserve">    </w:t>
+      </w:r>
+      <w:proofErr w:type="spellStart"/>
+      <w:r>
+        <w:t>binary.append</w:t>
+      </w:r>
+      <w:proofErr w:type="spellEnd"/>
+      <w:r>
+        <w:t>(decimal % 2);</w:t>
       </w:r>
       <w:r>
         <w:br/>
@@ -4727,6 +5103,7 @@
         <w:br/>
         <w:t xml:space="preserve">    return </w:t>
       </w:r>
+      <w:proofErr w:type="spellStart"/>
       <w:r>
         <w:rPr>
           <w:i/>
@@ -4734,6 +5111,7 @@
         </w:rPr>
         <w:t>decimalToBinary</w:t>
       </w:r>
+      <w:proofErr w:type="spellEnd"/>
       <w:r>
         <w:t>(decimal / 2, binary);</w:t>
       </w:r>
@@ -4771,8 +5149,13 @@
         <w:fldChar w:fldCharType="end"/>
       </w:r>
       <w:r>
-        <w:t>: decimalToBinary</w:t>
-      </w:r>
+        <w:t xml:space="preserve">: </w:t>
+      </w:r>
+      <w:proofErr w:type="spellStart"/>
+      <w:r>
+        <w:t>decimalToBinary</w:t>
+      </w:r>
+      <w:proofErr w:type="spellEnd"/>
     </w:p>
     <w:p>
       <w:pPr>
@@ -4844,7 +5227,15 @@
         <w:pStyle w:val="Pseoudocode"/>
       </w:pPr>
       <w:r>
-        <w:t>Decimal: 255 -&gt; Binary: 11111111</w:t>
+        <w:t xml:space="preserve">Decimal: 255 -&gt; </w:t>
+      </w:r>
+      <w:proofErr w:type="spellStart"/>
+      <w:r>
+        <w:t>Binary</w:t>
+      </w:r>
+      <w:proofErr w:type="spellEnd"/>
+      <w:r>
+        <w:t>: 11111111</w:t>
       </w:r>
     </w:p>
     <w:p>
@@ -4929,7 +5320,15 @@
         <w:pStyle w:val="Pseoudocode"/>
       </w:pPr>
       <w:r>
-        <w:t>private static String numberToWords(int number, StringBuilder str)</w:t>
+        <w:t xml:space="preserve">private static String </w:t>
+      </w:r>
+      <w:proofErr w:type="spellStart"/>
+      <w:r>
+        <w:t>numberToWords</w:t>
+      </w:r>
+      <w:proofErr w:type="spellEnd"/>
+      <w:r>
+        <w:t>(int number, StringBuilder str)</w:t>
       </w:r>
       <w:r>
         <w:br/>
@@ -4955,7 +5354,15 @@
       </w:r>
       <w:r>
         <w:br/>
-        <w:t xml:space="preserve">        throw new IllegalArgumentException("Number must be between 0 and " + </w:t>
+        <w:t xml:space="preserve">        throw new </w:t>
+      </w:r>
+      <w:proofErr w:type="spellStart"/>
+      <w:r>
+        <w:t>IllegalArgumentException</w:t>
+      </w:r>
+      <w:proofErr w:type="spellEnd"/>
+      <w:r>
+        <w:t xml:space="preserve">("Number must be between 0 and " + </w:t>
       </w:r>
       <w:r>
         <w:rPr>
@@ -4991,8 +5398,17 @@
       </w:r>
       <w:r>
         <w:br/>
-        <w:t xml:space="preserve">        str.append(</w:t>
-      </w:r>
+        <w:t xml:space="preserve">        </w:t>
+      </w:r>
+      <w:proofErr w:type="spellStart"/>
+      <w:r>
+        <w:t>str.append</w:t>
+      </w:r>
+      <w:proofErr w:type="spellEnd"/>
+      <w:r>
+        <w:t>(</w:t>
+      </w:r>
+      <w:proofErr w:type="spellStart"/>
       <w:r>
         <w:rPr>
           <w:i/>
@@ -5000,9 +5416,11 @@
         </w:rPr>
         <w:t>convertNumberToWord</w:t>
       </w:r>
+      <w:proofErr w:type="spellEnd"/>
       <w:r>
         <w:t>(</w:t>
       </w:r>
+      <w:proofErr w:type="spellStart"/>
       <w:r>
         <w:rPr>
           <w:i/>
@@ -5010,6 +5428,7 @@
         </w:rPr>
         <w:t>getFirstDigit</w:t>
       </w:r>
+      <w:proofErr w:type="spellEnd"/>
       <w:r>
         <w:t>(number))).append(" Thousand ");</w:t>
       </w:r>
@@ -5020,6 +5439,7 @@
         <w:br/>
         <w:t xml:space="preserve">        return </w:t>
       </w:r>
+      <w:proofErr w:type="spellStart"/>
       <w:r>
         <w:rPr>
           <w:i/>
@@ -5027,9 +5447,11 @@
         </w:rPr>
         <w:t>numberToWords</w:t>
       </w:r>
+      <w:proofErr w:type="spellEnd"/>
       <w:r>
         <w:t>(</w:t>
       </w:r>
+      <w:proofErr w:type="spellStart"/>
       <w:r>
         <w:rPr>
           <w:i/>
@@ -5037,6 +5459,7 @@
         </w:rPr>
         <w:t>removeFirstDigit</w:t>
       </w:r>
+      <w:proofErr w:type="spellEnd"/>
       <w:r>
         <w:t>(number), str);</w:t>
       </w:r>
@@ -5061,8 +5484,17 @@
       </w:r>
       <w:r>
         <w:br/>
-        <w:t xml:space="preserve">        str.append(</w:t>
-      </w:r>
+        <w:t xml:space="preserve">        </w:t>
+      </w:r>
+      <w:proofErr w:type="spellStart"/>
+      <w:r>
+        <w:t>str.append</w:t>
+      </w:r>
+      <w:proofErr w:type="spellEnd"/>
+      <w:r>
+        <w:t>(</w:t>
+      </w:r>
+      <w:proofErr w:type="spellStart"/>
       <w:r>
         <w:rPr>
           <w:i/>
@@ -5070,9 +5502,11 @@
         </w:rPr>
         <w:t>convertNumberToWord</w:t>
       </w:r>
+      <w:proofErr w:type="spellEnd"/>
       <w:r>
         <w:t>(</w:t>
       </w:r>
+      <w:proofErr w:type="spellStart"/>
       <w:r>
         <w:rPr>
           <w:i/>
@@ -5080,6 +5514,7 @@
         </w:rPr>
         <w:t>getFirstDigit</w:t>
       </w:r>
+      <w:proofErr w:type="spellEnd"/>
       <w:r>
         <w:t>(number))).append(" Hundred ");</w:t>
       </w:r>
@@ -5087,6 +5522,7 @@
         <w:br/>
         <w:t xml:space="preserve">        return </w:t>
       </w:r>
+      <w:proofErr w:type="spellStart"/>
       <w:r>
         <w:rPr>
           <w:i/>
@@ -5094,9 +5530,11 @@
         </w:rPr>
         <w:t>numberToWords</w:t>
       </w:r>
+      <w:proofErr w:type="spellEnd"/>
       <w:r>
         <w:t>(</w:t>
       </w:r>
+      <w:proofErr w:type="spellStart"/>
       <w:r>
         <w:rPr>
           <w:i/>
@@ -5104,6 +5542,7 @@
         </w:rPr>
         <w:t>removeFirstDigit</w:t>
       </w:r>
+      <w:proofErr w:type="spellEnd"/>
       <w:r>
         <w:t>(number), str);</w:t>
       </w:r>
@@ -5131,8 +5570,17 @@
       </w:r>
       <w:r>
         <w:br/>
-        <w:t xml:space="preserve">        str.append(</w:t>
-      </w:r>
+        <w:t xml:space="preserve">        </w:t>
+      </w:r>
+      <w:proofErr w:type="spellStart"/>
+      <w:r>
+        <w:t>str.append</w:t>
+      </w:r>
+      <w:proofErr w:type="spellEnd"/>
+      <w:r>
+        <w:t>(</w:t>
+      </w:r>
+      <w:proofErr w:type="spellStart"/>
       <w:r>
         <w:rPr>
           <w:i/>
@@ -5140,6 +5588,7 @@
         </w:rPr>
         <w:t>convertTensToWord</w:t>
       </w:r>
+      <w:proofErr w:type="spellEnd"/>
       <w:r>
         <w:t>(number)).append(" ");</w:t>
       </w:r>
@@ -5147,6 +5596,7 @@
         <w:br/>
         <w:t xml:space="preserve">        return </w:t>
       </w:r>
+      <w:proofErr w:type="spellStart"/>
       <w:r>
         <w:rPr>
           <w:i/>
@@ -5154,9 +5604,11 @@
         </w:rPr>
         <w:t>numberToWords</w:t>
       </w:r>
+      <w:proofErr w:type="spellEnd"/>
       <w:r>
         <w:t>(</w:t>
       </w:r>
+      <w:proofErr w:type="spellStart"/>
       <w:r>
         <w:rPr>
           <w:i/>
@@ -5164,6 +5616,7 @@
         </w:rPr>
         <w:t>removeFirstDigit</w:t>
       </w:r>
+      <w:proofErr w:type="spellEnd"/>
       <w:r>
         <w:t>(number), str);</w:t>
       </w:r>
@@ -5188,8 +5641,17 @@
       </w:r>
       <w:r>
         <w:br/>
-        <w:t xml:space="preserve">        str.append(</w:t>
-      </w:r>
+        <w:t xml:space="preserve">        </w:t>
+      </w:r>
+      <w:proofErr w:type="spellStart"/>
+      <w:r>
+        <w:t>str.append</w:t>
+      </w:r>
+      <w:proofErr w:type="spellEnd"/>
+      <w:r>
+        <w:t>(</w:t>
+      </w:r>
+      <w:proofErr w:type="spellStart"/>
       <w:r>
         <w:rPr>
           <w:i/>
@@ -5197,12 +5659,21 @@
         </w:rPr>
         <w:t>convertTeensToWord</w:t>
       </w:r>
+      <w:proofErr w:type="spellEnd"/>
       <w:r>
         <w:t>(number)).append(" ");</w:t>
       </w:r>
       <w:r>
         <w:br/>
-        <w:t xml:space="preserve">        return str.toString().trim();</w:t>
+        <w:t xml:space="preserve">        return </w:t>
+      </w:r>
+      <w:proofErr w:type="spellStart"/>
+      <w:r>
+        <w:t>str.toString</w:t>
+      </w:r>
+      <w:proofErr w:type="spellEnd"/>
+      <w:r>
+        <w:t>().trim();</w:t>
       </w:r>
       <w:r>
         <w:br/>
@@ -5225,8 +5696,17 @@
       </w:r>
       <w:r>
         <w:br/>
-        <w:t xml:space="preserve">        str.append(</w:t>
-      </w:r>
+        <w:t xml:space="preserve">        </w:t>
+      </w:r>
+      <w:proofErr w:type="spellStart"/>
+      <w:r>
+        <w:t>str.append</w:t>
+      </w:r>
+      <w:proofErr w:type="spellEnd"/>
+      <w:r>
+        <w:t>(</w:t>
+      </w:r>
+      <w:proofErr w:type="spellStart"/>
       <w:r>
         <w:rPr>
           <w:i/>
@@ -5234,12 +5714,21 @@
         </w:rPr>
         <w:t>convertNumberToWord</w:t>
       </w:r>
+      <w:proofErr w:type="spellEnd"/>
       <w:r>
         <w:t>(number)).append(" ");</w:t>
       </w:r>
       <w:r>
         <w:br/>
-        <w:t xml:space="preserve">        return str.toString().trim();</w:t>
+        <w:t xml:space="preserve">        return </w:t>
+      </w:r>
+      <w:proofErr w:type="spellStart"/>
+      <w:r>
+        <w:t>str.toString</w:t>
+      </w:r>
+      <w:proofErr w:type="spellEnd"/>
+      <w:r>
+        <w:t>().trim();</w:t>
       </w:r>
       <w:r>
         <w:br/>
@@ -5250,7 +5739,15 @@
       </w:r>
       <w:r>
         <w:br/>
-        <w:t xml:space="preserve">    if (str.isEmpty())</w:t>
+        <w:t xml:space="preserve">    if (</w:t>
+      </w:r>
+      <w:proofErr w:type="spellStart"/>
+      <w:r>
+        <w:t>str.isEmpty</w:t>
+      </w:r>
+      <w:proofErr w:type="spellEnd"/>
+      <w:r>
+        <w:t>())</w:t>
       </w:r>
       <w:r>
         <w:br/>
@@ -5258,8 +5755,17 @@
       </w:r>
       <w:r>
         <w:br/>
-        <w:t xml:space="preserve">        str.append(</w:t>
-      </w:r>
+        <w:t xml:space="preserve">        </w:t>
+      </w:r>
+      <w:proofErr w:type="spellStart"/>
+      <w:r>
+        <w:t>str.append</w:t>
+      </w:r>
+      <w:proofErr w:type="spellEnd"/>
+      <w:r>
+        <w:t>(</w:t>
+      </w:r>
+      <w:proofErr w:type="spellStart"/>
       <w:r>
         <w:rPr>
           <w:i/>
@@ -5267,12 +5773,21 @@
         </w:rPr>
         <w:t>convertNumberToWord</w:t>
       </w:r>
+      <w:proofErr w:type="spellEnd"/>
       <w:r>
         <w:t>(0)).append(" ");</w:t>
       </w:r>
       <w:r>
         <w:br/>
-        <w:t xml:space="preserve">        return str.toString().trim();</w:t>
+        <w:t xml:space="preserve">        return </w:t>
+      </w:r>
+      <w:proofErr w:type="spellStart"/>
+      <w:r>
+        <w:t>str.toString</w:t>
+      </w:r>
+      <w:proofErr w:type="spellEnd"/>
+      <w:r>
+        <w:t>().trim();</w:t>
       </w:r>
       <w:r>
         <w:br/>
@@ -5283,7 +5798,15 @@
       </w:r>
       <w:r>
         <w:br/>
-        <w:t xml:space="preserve">    return str.toString().trim();</w:t>
+        <w:t xml:space="preserve">    return </w:t>
+      </w:r>
+      <w:proofErr w:type="spellStart"/>
+      <w:r>
+        <w:t>str.toString</w:t>
+      </w:r>
+      <w:proofErr w:type="spellEnd"/>
+      <w:r>
+        <w:t>().trim();</w:t>
       </w:r>
       <w:r>
         <w:br/>
@@ -5295,7 +5818,15 @@
         <w:pStyle w:val="Pseoudocode"/>
       </w:pPr>
       <w:r>
-        <w:t>private static String convertNumberToWord(int number)</w:t>
+        <w:t xml:space="preserve">private static String </w:t>
+      </w:r>
+      <w:proofErr w:type="spellStart"/>
+      <w:r>
+        <w:t>convertNumberToWord</w:t>
+      </w:r>
+      <w:proofErr w:type="spellEnd"/>
+      <w:r>
+        <w:t>(int number)</w:t>
       </w:r>
       <w:r>
         <w:br/>
@@ -5311,7 +5842,15 @@
       </w:r>
       <w:r>
         <w:br/>
-        <w:t xml:space="preserve">        throw new IllegalArgumentException("Number must be between 0 and 9");</w:t>
+        <w:t xml:space="preserve">        throw new </w:t>
+      </w:r>
+      <w:proofErr w:type="spellStart"/>
+      <w:r>
+        <w:t>IllegalArgumentException</w:t>
+      </w:r>
+      <w:proofErr w:type="spellEnd"/>
+      <w:r>
+        <w:t>("Number must be between 0 and 9");</w:t>
       </w:r>
       <w:r>
         <w:br/>
@@ -5355,7 +5894,15 @@
       </w:r>
       <w:r>
         <w:br/>
-        <w:t>private static String convertTeensToWord(int number)</w:t>
+        <w:t xml:space="preserve">private static String </w:t>
+      </w:r>
+      <w:proofErr w:type="spellStart"/>
+      <w:r>
+        <w:t>convertTeensToWord</w:t>
+      </w:r>
+      <w:proofErr w:type="spellEnd"/>
+      <w:r>
+        <w:t>(int number)</w:t>
       </w:r>
       <w:r>
         <w:br/>
@@ -5371,7 +5918,15 @@
       </w:r>
       <w:r>
         <w:br/>
-        <w:t xml:space="preserve">        throw new IllegalArgumentException("Number must be between 10 and 19");</w:t>
+        <w:t xml:space="preserve">        throw new </w:t>
+      </w:r>
+      <w:proofErr w:type="spellStart"/>
+      <w:r>
+        <w:t>IllegalArgumentException</w:t>
+      </w:r>
+      <w:proofErr w:type="spellEnd"/>
+      <w:r>
+        <w:t>("Number must be between 10 and 19");</w:t>
       </w:r>
       <w:r>
         <w:br/>
@@ -5412,7 +5967,15 @@
       </w:r>
       <w:r>
         <w:br/>
-        <w:t>private static String convertTensToWord(int number)</w:t>
+        <w:t xml:space="preserve">private static String </w:t>
+      </w:r>
+      <w:proofErr w:type="spellStart"/>
+      <w:r>
+        <w:t>convertTensToWord</w:t>
+      </w:r>
+      <w:proofErr w:type="spellEnd"/>
+      <w:r>
+        <w:t>(int number)</w:t>
       </w:r>
       <w:r>
         <w:br/>
@@ -5428,7 +5991,15 @@
       </w:r>
       <w:r>
         <w:br/>
-        <w:t xml:space="preserve">        throw new IllegalArgumentException("Number must be between 10 and 99");</w:t>
+        <w:t xml:space="preserve">        throw new </w:t>
+      </w:r>
+      <w:proofErr w:type="spellStart"/>
+      <w:r>
+        <w:t>IllegalArgumentException</w:t>
+      </w:r>
+      <w:proofErr w:type="spellEnd"/>
+      <w:r>
+        <w:t>("Number must be between 10 and 99");</w:t>
       </w:r>
       <w:r>
         <w:br/>
@@ -5469,7 +6040,15 @@
       </w:r>
       <w:r>
         <w:br/>
-        <w:t>private static int getFirstDigit(int number)</w:t>
+        <w:t xml:space="preserve">private static int </w:t>
+      </w:r>
+      <w:proofErr w:type="spellStart"/>
+      <w:r>
+        <w:t>getFirstDigit</w:t>
+      </w:r>
+      <w:proofErr w:type="spellEnd"/>
+      <w:r>
+        <w:t>(int number)</w:t>
       </w:r>
       <w:r>
         <w:br/>
@@ -5507,7 +6086,15 @@
       </w:r>
       <w:r>
         <w:br/>
-        <w:t>private static int getLastDigit(int number)</w:t>
+        <w:t xml:space="preserve">private static int </w:t>
+      </w:r>
+      <w:proofErr w:type="spellStart"/>
+      <w:r>
+        <w:t>getLastDigit</w:t>
+      </w:r>
+      <w:proofErr w:type="spellEnd"/>
+      <w:r>
+        <w:t>(int number)</w:t>
       </w:r>
       <w:r>
         <w:br/>
@@ -5526,7 +6113,15 @@
       </w:r>
       <w:r>
         <w:br/>
-        <w:t>public static int removeFirstDigit(int number)</w:t>
+        <w:t xml:space="preserve">public static int </w:t>
+      </w:r>
+      <w:proofErr w:type="spellStart"/>
+      <w:r>
+        <w:t>removeFirstDigit</w:t>
+      </w:r>
+      <w:proofErr w:type="spellEnd"/>
+      <w:r>
+        <w:t>(int number)</w:t>
       </w:r>
       <w:r>
         <w:br/>
@@ -5731,7 +6326,15 @@
       </w:pPr>
       <w:r>
         <w:lastRenderedPageBreak/>
-        <w:t>9999   -&gt; Nine Thousand Nine Hundred Ninety Nine</w:t>
+        <w:t xml:space="preserve">9999   -&gt; Nine Thousand Nine Hundred </w:t>
+      </w:r>
+      <w:proofErr w:type="spellStart"/>
+      <w:r>
+        <w:t>Ninety</w:t>
+      </w:r>
+      <w:proofErr w:type="spellEnd"/>
+      <w:r>
+        <w:t xml:space="preserve"> Nine</w:t>
       </w:r>
     </w:p>
     <w:p>
@@ -5798,6 +6401,24 @@
       </w:r>
     </w:p>
     <w:p>
+      <w:r>
+        <w:t xml:space="preserve">Tribonacci is very similar to Fibonacci, so I just updated the </w:t>
+      </w:r>
+      <w:proofErr w:type="spellStart"/>
+      <w:r>
+        <w:t>memoized</w:t>
+      </w:r>
+      <w:proofErr w:type="spellEnd"/>
+      <w:r>
+        <w:t xml:space="preserve"> Fibonacci methods for Tribonacci. </w:t>
+      </w:r>
+    </w:p>
+    <w:p>
+      <w:r>
+        <w:t>Added new base conditions: n &lt;= 1 -&gt; 0; n &lt;= 3 -&gt; 1</w:t>
+      </w:r>
+    </w:p>
+    <w:p>
       <w:pPr>
         <w:pStyle w:val="Heading2"/>
       </w:pPr>
@@ -5807,13 +6428,444 @@
     </w:p>
     <w:p>
       <w:pPr>
+        <w:pStyle w:val="Pseoudocode"/>
+      </w:pPr>
+      <w:r>
+        <w:t xml:space="preserve">private static int </w:t>
+      </w:r>
+      <w:proofErr w:type="spellStart"/>
+      <w:r>
+        <w:t>tribonacciMemoized</w:t>
+      </w:r>
+      <w:proofErr w:type="spellEnd"/>
+      <w:r>
+        <w:t>(int n, int[] memo)</w:t>
+      </w:r>
+      <w:r>
+        <w:br/>
+        <w:t>{</w:t>
+      </w:r>
+      <w:r>
+        <w:br/>
+        <w:t xml:space="preserve">    if (n &lt;= 1)</w:t>
+      </w:r>
+      <w:r>
+        <w:br/>
+        <w:t xml:space="preserve">    {</w:t>
+      </w:r>
+      <w:r>
+        <w:br/>
+        <w:t xml:space="preserve">        return 0;</w:t>
+      </w:r>
+      <w:r>
+        <w:br/>
+        <w:t xml:space="preserve">    }</w:t>
+      </w:r>
+      <w:r>
+        <w:br/>
+      </w:r>
+      <w:r>
+        <w:br/>
+        <w:t xml:space="preserve">    if (n &lt;= 3)</w:t>
+      </w:r>
+      <w:r>
+        <w:br/>
+        <w:t xml:space="preserve">    {</w:t>
+      </w:r>
+      <w:r>
+        <w:br/>
+        <w:t xml:space="preserve">        return 1;</w:t>
+      </w:r>
+      <w:r>
+        <w:br/>
+        <w:t xml:space="preserve">    }</w:t>
+      </w:r>
+      <w:r>
+        <w:br/>
+      </w:r>
+      <w:r>
+        <w:br/>
+        <w:t xml:space="preserve">    if (n &gt;= </w:t>
+      </w:r>
+      <w:proofErr w:type="spellStart"/>
+      <w:r>
+        <w:t>memo.length</w:t>
+      </w:r>
+      <w:proofErr w:type="spellEnd"/>
+      <w:r>
+        <w:t>)</w:t>
+      </w:r>
+      <w:r>
+        <w:br/>
+        <w:t xml:space="preserve">    {</w:t>
+      </w:r>
+      <w:r>
+        <w:br/>
+        <w:t xml:space="preserve">        return </w:t>
+      </w:r>
+      <w:proofErr w:type="spellStart"/>
+      <w:r>
+        <w:rPr>
+          <w:i/>
+          <w:iCs/>
+        </w:rPr>
+        <w:t>tribonacciMemoized</w:t>
+      </w:r>
+      <w:proofErr w:type="spellEnd"/>
+      <w:r>
+        <w:t xml:space="preserve">(n - 1, memo) + </w:t>
+      </w:r>
+      <w:proofErr w:type="spellStart"/>
+      <w:r>
+        <w:rPr>
+          <w:i/>
+          <w:iCs/>
+        </w:rPr>
+        <w:t>tribonacciMemoized</w:t>
+      </w:r>
+      <w:proofErr w:type="spellEnd"/>
+      <w:r>
+        <w:t xml:space="preserve">(n - 2, memo) + </w:t>
+      </w:r>
+      <w:proofErr w:type="spellStart"/>
+      <w:r>
+        <w:rPr>
+          <w:i/>
+          <w:iCs/>
+        </w:rPr>
+        <w:t>tribonacciMemoized</w:t>
+      </w:r>
+      <w:proofErr w:type="spellEnd"/>
+      <w:r>
+        <w:t>(n - 3, memo);</w:t>
+      </w:r>
+      <w:r>
+        <w:br/>
+        <w:t xml:space="preserve">    }</w:t>
+      </w:r>
+      <w:r>
+        <w:br/>
+        <w:t xml:space="preserve">    if (memo[n] != 0)</w:t>
+      </w:r>
+      <w:r>
+        <w:br/>
+        <w:t xml:space="preserve">    {</w:t>
+      </w:r>
+      <w:r>
+        <w:br/>
+        <w:t xml:space="preserve">        return memo[n];</w:t>
+      </w:r>
+      <w:r>
+        <w:br/>
+        <w:t xml:space="preserve">    }</w:t>
+      </w:r>
+      <w:r>
+        <w:br/>
+        <w:t xml:space="preserve">    else</w:t>
+      </w:r>
+      <w:r>
+        <w:br/>
+        <w:t xml:space="preserve">    {</w:t>
+      </w:r>
+      <w:r>
+        <w:br/>
+        <w:t xml:space="preserve">        memo[n] = </w:t>
+      </w:r>
+      <w:proofErr w:type="spellStart"/>
+      <w:r>
+        <w:rPr>
+          <w:i/>
+          <w:iCs/>
+        </w:rPr>
+        <w:t>tribonacciMemoized</w:t>
+      </w:r>
+      <w:proofErr w:type="spellEnd"/>
+      <w:r>
+        <w:t xml:space="preserve">(n - 1, memo) + </w:t>
+      </w:r>
+      <w:proofErr w:type="spellStart"/>
+      <w:r>
+        <w:rPr>
+          <w:i/>
+          <w:iCs/>
+        </w:rPr>
+        <w:t>tribonacciMemoized</w:t>
+      </w:r>
+      <w:proofErr w:type="spellEnd"/>
+      <w:r>
+        <w:t xml:space="preserve">(n - 2, memo) + </w:t>
+      </w:r>
+      <w:proofErr w:type="spellStart"/>
+      <w:r>
+        <w:rPr>
+          <w:i/>
+          <w:iCs/>
+        </w:rPr>
+        <w:t>tribonacciMemoized</w:t>
+      </w:r>
+      <w:proofErr w:type="spellEnd"/>
+      <w:r>
+        <w:t>(n - 3, memo);</w:t>
+      </w:r>
+      <w:r>
+        <w:br/>
+        <w:t xml:space="preserve">        return memo[n];</w:t>
+      </w:r>
+      <w:r>
+        <w:br/>
+        <w:t xml:space="preserve">    }</w:t>
+      </w:r>
+      <w:r>
+        <w:br/>
+        <w:t>}</w:t>
+      </w:r>
+    </w:p>
+    <w:p>
+      <w:pPr>
+        <w:pStyle w:val="Caption"/>
+      </w:pPr>
+      <w:r>
+        <w:t xml:space="preserve">Figure </w:t>
+      </w:r>
+      <w:r>
+        <w:fldChar w:fldCharType="begin"/>
+      </w:r>
+      <w:r>
+        <w:instrText xml:space="preserve"> SEQ Figure \* ARABIC </w:instrText>
+      </w:r>
+      <w:r>
+        <w:fldChar w:fldCharType="separate"/>
+      </w:r>
+      <w:r>
+        <w:rPr>
+          <w:noProof/>
+        </w:rPr>
+        <w:t>11</w:t>
+      </w:r>
+      <w:r>
+        <w:fldChar w:fldCharType="end"/>
+      </w:r>
+      <w:r>
+        <w:t>: Tribonacci</w:t>
+      </w:r>
+    </w:p>
+    <w:p>
+      <w:pPr>
+        <w:rPr>
+          <w:lang w:val="en-AT"/>
+        </w:rPr>
+      </w:pPr>
+    </w:p>
+    <w:p>
+      <w:pPr>
         <w:pStyle w:val="Heading2"/>
       </w:pPr>
       <w:r>
         <w:t>Test</w:t>
       </w:r>
     </w:p>
-    <w:p/>
+    <w:p>
+      <w:pPr>
+        <w:pStyle w:val="Pseoudocode"/>
+      </w:pPr>
+      <w:r>
+        <w:t>==================================================</w:t>
+      </w:r>
+    </w:p>
+    <w:p>
+      <w:pPr>
+        <w:pStyle w:val="Pseoudocode"/>
+      </w:pPr>
+      <w:r>
+        <w:t xml:space="preserve">=== </w:t>
+      </w:r>
+      <w:proofErr w:type="spellStart"/>
+      <w:r>
+        <w:t>Tribonacci</w:t>
+      </w:r>
+      <w:proofErr w:type="spellEnd"/>
+      <w:r>
+        <w:t xml:space="preserve"> </w:t>
+      </w:r>
+      <w:proofErr w:type="spellStart"/>
+      <w:r>
+        <w:t>Sequence</w:t>
+      </w:r>
+      <w:proofErr w:type="spellEnd"/>
+      <w:r>
+        <w:t xml:space="preserve"> ===</w:t>
+      </w:r>
+    </w:p>
+    <w:p>
+      <w:pPr>
+        <w:pStyle w:val="Pseoudocode"/>
+      </w:pPr>
+      <w:r>
+        <w:t>==================================================</w:t>
+      </w:r>
+    </w:p>
+    <w:p>
+      <w:pPr>
+        <w:pStyle w:val="Pseoudocode"/>
+      </w:pPr>
+    </w:p>
+    <w:p>
+      <w:pPr>
+        <w:pStyle w:val="Pseoudocode"/>
+      </w:pPr>
+      <w:r>
+        <w:t>T(0) = 0</w:t>
+      </w:r>
+    </w:p>
+    <w:p>
+      <w:pPr>
+        <w:pStyle w:val="Pseoudocode"/>
+      </w:pPr>
+      <w:r>
+        <w:t>T(1) = 0</w:t>
+      </w:r>
+    </w:p>
+    <w:p>
+      <w:pPr>
+        <w:pStyle w:val="Pseoudocode"/>
+      </w:pPr>
+      <w:r>
+        <w:t>T(2) = 1</w:t>
+      </w:r>
+    </w:p>
+    <w:p>
+      <w:pPr>
+        <w:pStyle w:val="Pseoudocode"/>
+      </w:pPr>
+      <w:r>
+        <w:t>T(3) = 1</w:t>
+      </w:r>
+    </w:p>
+    <w:p>
+      <w:pPr>
+        <w:pStyle w:val="Pseoudocode"/>
+      </w:pPr>
+      <w:r>
+        <w:t>T(4) = 2</w:t>
+      </w:r>
+    </w:p>
+    <w:p>
+      <w:pPr>
+        <w:pStyle w:val="Pseoudocode"/>
+      </w:pPr>
+      <w:r>
+        <w:t>T(5) = 4</w:t>
+      </w:r>
+    </w:p>
+    <w:p>
+      <w:pPr>
+        <w:pStyle w:val="Pseoudocode"/>
+      </w:pPr>
+      <w:r>
+        <w:t>T(6) = 7</w:t>
+      </w:r>
+    </w:p>
+    <w:p>
+      <w:pPr>
+        <w:pStyle w:val="Pseoudocode"/>
+      </w:pPr>
+      <w:r>
+        <w:t>T(7) = 13</w:t>
+      </w:r>
+    </w:p>
+    <w:p>
+      <w:pPr>
+        <w:pStyle w:val="Pseoudocode"/>
+      </w:pPr>
+      <w:r>
+        <w:t>T(8) = 24</w:t>
+      </w:r>
+    </w:p>
+    <w:p>
+      <w:pPr>
+        <w:pStyle w:val="Pseoudocode"/>
+      </w:pPr>
+      <w:r>
+        <w:t>T(9) = 44</w:t>
+      </w:r>
+    </w:p>
+    <w:p>
+      <w:pPr>
+        <w:pStyle w:val="Pseoudocode"/>
+      </w:pPr>
+      <w:r>
+        <w:t>T(10) = 81</w:t>
+      </w:r>
+    </w:p>
+    <w:p>
+      <w:pPr>
+        <w:pStyle w:val="Pseoudocode"/>
+      </w:pPr>
+      <w:r>
+        <w:t>T(11) = 149</w:t>
+      </w:r>
+    </w:p>
+    <w:p>
+      <w:pPr>
+        <w:pStyle w:val="Pseoudocode"/>
+      </w:pPr>
+      <w:r>
+        <w:t>T(12) = 274</w:t>
+      </w:r>
+    </w:p>
+    <w:p>
+      <w:pPr>
+        <w:pStyle w:val="Pseoudocode"/>
+      </w:pPr>
+      <w:r>
+        <w:t>T(13) = 504</w:t>
+      </w:r>
+    </w:p>
+    <w:p>
+      <w:pPr>
+        <w:pStyle w:val="Pseoudocode"/>
+      </w:pPr>
+      <w:r>
+        <w:t>T(14) = 927</w:t>
+      </w:r>
+    </w:p>
+    <w:p>
+      <w:pPr>
+        <w:pStyle w:val="Caption"/>
+      </w:pPr>
+      <w:r>
+        <w:t xml:space="preserve">Figure </w:t>
+      </w:r>
+      <w:r>
+        <w:fldChar w:fldCharType="begin"/>
+      </w:r>
+      <w:r>
+        <w:instrText xml:space="preserve"> SEQ Figure \* ARABIC </w:instrText>
+      </w:r>
+      <w:r>
+        <w:fldChar w:fldCharType="separate"/>
+      </w:r>
+      <w:r>
+        <w:rPr>
+          <w:noProof/>
+        </w:rPr>
+        <w:t>12</w:t>
+      </w:r>
+      <w:r>
+        <w:fldChar w:fldCharType="end"/>
+      </w:r>
+      <w:r>
+        <w:t xml:space="preserve">: </w:t>
+      </w:r>
+      <w:proofErr w:type="spellStart"/>
+      <w:r>
+        <w:t>tribonacci</w:t>
+      </w:r>
+      <w:proofErr w:type="spellEnd"/>
+      <w:r>
+        <w:t xml:space="preserve"> test</w:t>
+      </w:r>
+    </w:p>
     <w:sectPr>
       <w:headerReference w:type="default" r:id="rId8"/>
       <w:footerReference w:type="default" r:id="rId9"/>

</xml_diff>

<commit_message>
Update Protocol files for Recursion assignment
Updated Protocol.docx, added Protocol.pdf, and removed temporary ~$otocol.docx file in the Recursion assignment folder.
</commit_message>
<xml_diff>
--- a/Modules/Semester_1/Modern Code/Aufgaben/06_Recursion/Protocol.docx
+++ b/Modules/Semester_1/Modern Code/Aufgaben/06_Recursion/Protocol.docx
@@ -291,7 +291,7 @@
                                   <w:t>:</w:t>
                                 </w:r>
                                 <w:r>
-                                  <w:t>25</w:t>
+                                  <w:t>19</w:t>
                                 </w:r>
                                 <w:r>
                                   <w:t>:</w:t>
@@ -413,7 +413,7 @@
                             <w:t>:</w:t>
                           </w:r>
                           <w:r>
-                            <w:t>25</w:t>
+                            <w:t>19</w:t>
                           </w:r>
                           <w:r>
                             <w:t>:</w:t>
@@ -436,7 +436,7 @@
         </w:p>
       </w:sdtContent>
     </w:sdt>
-    <w:bookmarkStart w:id="0" w:name="_Toc217732352" w:displacedByCustomXml="next"/>
+    <w:bookmarkStart w:id="0" w:name="_Toc219892573" w:displacedByCustomXml="next"/>
     <w:sdt>
       <w:sdtPr>
         <w:rPr>
@@ -488,7 +488,7 @@
           <w:r>
             <w:fldChar w:fldCharType="separate"/>
           </w:r>
-          <w:hyperlink w:anchor="_Toc217732352" w:history="1">
+          <w:hyperlink w:anchor="_Toc219892573" w:history="1">
             <w:r>
               <w:rPr>
                 <w:rStyle w:val="Hyperlink"/>
@@ -515,7 +515,7 @@
                 <w:noProof/>
                 <w:webHidden/>
               </w:rPr>
-              <w:instrText xml:space="preserve"> PAGEREF _Toc217732352 \h </w:instrText>
+              <w:instrText xml:space="preserve"> PAGEREF _Toc219892573 \h </w:instrText>
             </w:r>
             <w:r>
               <w:rPr>
@@ -558,7 +558,7 @@
               <w:lang w:val="en-AT" w:eastAsia="en-AT"/>
             </w:rPr>
           </w:pPr>
-          <w:hyperlink w:anchor="_Toc217732353" w:history="1">
+          <w:hyperlink w:anchor="_Toc219892574" w:history="1">
             <w:r>
               <w:rPr>
                 <w:rStyle w:val="Hyperlink"/>
@@ -585,7 +585,7 @@
                 <w:noProof/>
                 <w:webHidden/>
               </w:rPr>
-              <w:instrText xml:space="preserve"> PAGEREF _Toc217732353 \h </w:instrText>
+              <w:instrText xml:space="preserve"> PAGEREF _Toc219892574 \h </w:instrText>
             </w:r>
             <w:r>
               <w:rPr>
@@ -628,13 +628,13 @@
               <w:lang w:val="en-AT" w:eastAsia="en-AT"/>
             </w:rPr>
           </w:pPr>
-          <w:hyperlink w:anchor="_Toc217732354" w:history="1">
+          <w:hyperlink w:anchor="_Toc219892575" w:history="1">
             <w:r>
               <w:rPr>
                 <w:rStyle w:val="Hyperlink"/>
                 <w:noProof/>
               </w:rPr>
-              <w:t>Exercise 1 – File I/O and Error Handling</w:t>
+              <w:t>Exercise 1 – Fibonacci</w:t>
             </w:r>
             <w:r>
               <w:rPr>
@@ -655,7 +655,7 @@
                 <w:noProof/>
                 <w:webHidden/>
               </w:rPr>
-              <w:instrText xml:space="preserve"> PAGEREF _Toc217732354 \h </w:instrText>
+              <w:instrText xml:space="preserve"> PAGEREF _Toc219892575 \h </w:instrText>
             </w:r>
             <w:r>
               <w:rPr>
@@ -698,7 +698,7 @@
               <w:lang w:val="en-AT" w:eastAsia="en-AT"/>
             </w:rPr>
           </w:pPr>
-          <w:hyperlink w:anchor="_Toc217732355" w:history="1">
+          <w:hyperlink w:anchor="_Toc219892576" w:history="1">
             <w:r>
               <w:rPr>
                 <w:rStyle w:val="Hyperlink"/>
@@ -725,7 +725,7 @@
                 <w:noProof/>
                 <w:webHidden/>
               </w:rPr>
-              <w:instrText xml:space="preserve"> PAGEREF _Toc217732355 \h </w:instrText>
+              <w:instrText xml:space="preserve"> PAGEREF _Toc219892576 \h </w:instrText>
             </w:r>
             <w:r>
               <w:rPr>
@@ -768,7 +768,7 @@
               <w:lang w:val="en-AT" w:eastAsia="en-AT"/>
             </w:rPr>
           </w:pPr>
-          <w:hyperlink w:anchor="_Toc217732356" w:history="1">
+          <w:hyperlink w:anchor="_Toc219892577" w:history="1">
             <w:r>
               <w:rPr>
                 <w:rStyle w:val="Hyperlink"/>
@@ -795,7 +795,7 @@
                 <w:noProof/>
                 <w:webHidden/>
               </w:rPr>
-              <w:instrText xml:space="preserve"> PAGEREF _Toc217732356 \h </w:instrText>
+              <w:instrText xml:space="preserve"> PAGEREF _Toc219892577 \h </w:instrText>
             </w:r>
             <w:r>
               <w:rPr>
@@ -838,7 +838,7 @@
               <w:lang w:val="en-AT" w:eastAsia="en-AT"/>
             </w:rPr>
           </w:pPr>
-          <w:hyperlink w:anchor="_Toc217732357" w:history="1">
+          <w:hyperlink w:anchor="_Toc219892578" w:history="1">
             <w:r>
               <w:rPr>
                 <w:rStyle w:val="Hyperlink"/>
@@ -865,7 +865,7 @@
                 <w:noProof/>
                 <w:webHidden/>
               </w:rPr>
-              <w:instrText xml:space="preserve"> PAGEREF _Toc217732357 \h </w:instrText>
+              <w:instrText xml:space="preserve"> PAGEREF _Toc219892578 \h </w:instrText>
             </w:r>
             <w:r>
               <w:rPr>
@@ -885,7 +885,7 @@
                 <w:noProof/>
                 <w:webHidden/>
               </w:rPr>
-              <w:t>4</w:t>
+              <w:t>5</w:t>
             </w:r>
             <w:r>
               <w:rPr>
@@ -908,13 +908,13 @@
               <w:lang w:val="en-AT" w:eastAsia="en-AT"/>
             </w:rPr>
           </w:pPr>
-          <w:hyperlink w:anchor="_Toc217732358" w:history="1">
+          <w:hyperlink w:anchor="_Toc219892579" w:history="1">
             <w:r>
               <w:rPr>
                 <w:rStyle w:val="Hyperlink"/>
                 <w:noProof/>
               </w:rPr>
-              <w:t>Exercise 2 – Input Validation</w:t>
+              <w:t>Exercise 2 – Tower of Hanoi</w:t>
             </w:r>
             <w:r>
               <w:rPr>
@@ -935,7 +935,7 @@
                 <w:noProof/>
                 <w:webHidden/>
               </w:rPr>
-              <w:instrText xml:space="preserve"> PAGEREF _Toc217732358 \h </w:instrText>
+              <w:instrText xml:space="preserve"> PAGEREF _Toc219892579 \h </w:instrText>
             </w:r>
             <w:r>
               <w:rPr>
@@ -955,7 +955,7 @@
                 <w:noProof/>
                 <w:webHidden/>
               </w:rPr>
-              <w:t>6</w:t>
+              <w:t>7</w:t>
             </w:r>
             <w:r>
               <w:rPr>
@@ -978,7 +978,7 @@
               <w:lang w:val="en-AT" w:eastAsia="en-AT"/>
             </w:rPr>
           </w:pPr>
-          <w:hyperlink w:anchor="_Toc217732359" w:history="1">
+          <w:hyperlink w:anchor="_Toc219892580" w:history="1">
             <w:r>
               <w:rPr>
                 <w:rStyle w:val="Hyperlink"/>
@@ -1005,7 +1005,7 @@
                 <w:noProof/>
                 <w:webHidden/>
               </w:rPr>
-              <w:instrText xml:space="preserve"> PAGEREF _Toc217732359 \h </w:instrText>
+              <w:instrText xml:space="preserve"> PAGEREF _Toc219892580 \h </w:instrText>
             </w:r>
             <w:r>
               <w:rPr>
@@ -1025,7 +1025,7 @@
                 <w:noProof/>
                 <w:webHidden/>
               </w:rPr>
-              <w:t>6</w:t>
+              <w:t>7</w:t>
             </w:r>
             <w:r>
               <w:rPr>
@@ -1048,7 +1048,7 @@
               <w:lang w:val="en-AT" w:eastAsia="en-AT"/>
             </w:rPr>
           </w:pPr>
-          <w:hyperlink w:anchor="_Toc217732360" w:history="1">
+          <w:hyperlink w:anchor="_Toc219892581" w:history="1">
             <w:r>
               <w:rPr>
                 <w:rStyle w:val="Hyperlink"/>
@@ -1075,7 +1075,7 @@
                 <w:noProof/>
                 <w:webHidden/>
               </w:rPr>
-              <w:instrText xml:space="preserve"> PAGEREF _Toc217732360 \h </w:instrText>
+              <w:instrText xml:space="preserve"> PAGEREF _Toc219892581 \h </w:instrText>
             </w:r>
             <w:r>
               <w:rPr>
@@ -1095,7 +1095,7 @@
                 <w:noProof/>
                 <w:webHidden/>
               </w:rPr>
-              <w:t>6</w:t>
+              <w:t>7</w:t>
             </w:r>
             <w:r>
               <w:rPr>
@@ -1118,7 +1118,7 @@
               <w:lang w:val="en-AT" w:eastAsia="en-AT"/>
             </w:rPr>
           </w:pPr>
-          <w:hyperlink w:anchor="_Toc217732361" w:history="1">
+          <w:hyperlink w:anchor="_Toc219892582" w:history="1">
             <w:r>
               <w:rPr>
                 <w:rStyle w:val="Hyperlink"/>
@@ -1145,7 +1145,7 @@
                 <w:noProof/>
                 <w:webHidden/>
               </w:rPr>
-              <w:instrText xml:space="preserve"> PAGEREF _Toc217732361 \h </w:instrText>
+              <w:instrText xml:space="preserve"> PAGEREF _Toc219892582 \h </w:instrText>
             </w:r>
             <w:r>
               <w:rPr>
@@ -1188,13 +1188,13 @@
               <w:lang w:val="en-AT" w:eastAsia="en-AT"/>
             </w:rPr>
           </w:pPr>
-          <w:hyperlink w:anchor="_Toc217732362" w:history="1">
+          <w:hyperlink w:anchor="_Toc219892583" w:history="1">
             <w:r>
               <w:rPr>
                 <w:rStyle w:val="Hyperlink"/>
                 <w:noProof/>
               </w:rPr>
-              <w:t>Exercise 3 -Feedback Calculation</w:t>
+              <w:t>Exercise 3 – Decimal to Binary</w:t>
             </w:r>
             <w:r>
               <w:rPr>
@@ -1215,7 +1215,7 @@
                 <w:noProof/>
                 <w:webHidden/>
               </w:rPr>
-              <w:instrText xml:space="preserve"> PAGEREF _Toc217732362 \h </w:instrText>
+              <w:instrText xml:space="preserve"> PAGEREF _Toc219892583 \h </w:instrText>
             </w:r>
             <w:r>
               <w:rPr>
@@ -1235,7 +1235,7 @@
                 <w:noProof/>
                 <w:webHidden/>
               </w:rPr>
-              <w:t>9</w:t>
+              <w:t>10</w:t>
             </w:r>
             <w:r>
               <w:rPr>
@@ -1258,7 +1258,7 @@
               <w:lang w:val="en-AT" w:eastAsia="en-AT"/>
             </w:rPr>
           </w:pPr>
-          <w:hyperlink w:anchor="_Toc217732363" w:history="1">
+          <w:hyperlink w:anchor="_Toc219892584" w:history="1">
             <w:r>
               <w:rPr>
                 <w:rStyle w:val="Hyperlink"/>
@@ -1285,7 +1285,7 @@
                 <w:noProof/>
                 <w:webHidden/>
               </w:rPr>
-              <w:instrText xml:space="preserve"> PAGEREF _Toc217732363 \h </w:instrText>
+              <w:instrText xml:space="preserve"> PAGEREF _Toc219892584 \h </w:instrText>
             </w:r>
             <w:r>
               <w:rPr>
@@ -1305,7 +1305,7 @@
                 <w:noProof/>
                 <w:webHidden/>
               </w:rPr>
-              <w:t>9</w:t>
+              <w:t>10</w:t>
             </w:r>
             <w:r>
               <w:rPr>
@@ -1328,7 +1328,7 @@
               <w:lang w:val="en-AT" w:eastAsia="en-AT"/>
             </w:rPr>
           </w:pPr>
-          <w:hyperlink w:anchor="_Toc217732364" w:history="1">
+          <w:hyperlink w:anchor="_Toc219892585" w:history="1">
             <w:r>
               <w:rPr>
                 <w:rStyle w:val="Hyperlink"/>
@@ -1355,7 +1355,7 @@
                 <w:noProof/>
                 <w:webHidden/>
               </w:rPr>
-              <w:instrText xml:space="preserve"> PAGEREF _Toc217732364 \h </w:instrText>
+              <w:instrText xml:space="preserve"> PAGEREF _Toc219892585 \h </w:instrText>
             </w:r>
             <w:r>
               <w:rPr>
@@ -1375,7 +1375,7 @@
                 <w:noProof/>
                 <w:webHidden/>
               </w:rPr>
-              <w:t>9</w:t>
+              <w:t>10</w:t>
             </w:r>
             <w:r>
               <w:rPr>
@@ -1398,7 +1398,7 @@
               <w:lang w:val="en-AT" w:eastAsia="en-AT"/>
             </w:rPr>
           </w:pPr>
-          <w:hyperlink w:anchor="_Toc217732365" w:history="1">
+          <w:hyperlink w:anchor="_Toc219892586" w:history="1">
             <w:r>
               <w:rPr>
                 <w:rStyle w:val="Hyperlink"/>
@@ -1425,7 +1425,7 @@
                 <w:noProof/>
                 <w:webHidden/>
               </w:rPr>
-              <w:instrText xml:space="preserve"> PAGEREF _Toc217732365 \h </w:instrText>
+              <w:instrText xml:space="preserve"> PAGEREF _Toc219892586 \h </w:instrText>
             </w:r>
             <w:r>
               <w:rPr>
@@ -1445,7 +1445,7 @@
                 <w:noProof/>
                 <w:webHidden/>
               </w:rPr>
-              <w:t>11</w:t>
+              <w:t>10</w:t>
             </w:r>
             <w:r>
               <w:rPr>
@@ -1468,13 +1468,13 @@
               <w:lang w:val="en-AT" w:eastAsia="en-AT"/>
             </w:rPr>
           </w:pPr>
-          <w:hyperlink w:anchor="_Toc217732366" w:history="1">
+          <w:hyperlink w:anchor="_Toc219892587" w:history="1">
             <w:r>
               <w:rPr>
                 <w:rStyle w:val="Hyperlink"/>
                 <w:noProof/>
               </w:rPr>
-              <w:t>Exercise 4 – Autosolve Feature</w:t>
+              <w:t>Exercise 4 – Number to Words</w:t>
             </w:r>
             <w:r>
               <w:rPr>
@@ -1495,7 +1495,7 @@
                 <w:noProof/>
                 <w:webHidden/>
               </w:rPr>
-              <w:instrText xml:space="preserve"> PAGEREF _Toc217732366 \h </w:instrText>
+              <w:instrText xml:space="preserve"> PAGEREF _Toc219892587 \h </w:instrText>
             </w:r>
             <w:r>
               <w:rPr>
@@ -1538,7 +1538,7 @@
               <w:lang w:val="en-AT" w:eastAsia="en-AT"/>
             </w:rPr>
           </w:pPr>
-          <w:hyperlink w:anchor="_Toc217732367" w:history="1">
+          <w:hyperlink w:anchor="_Toc219892588" w:history="1">
             <w:r>
               <w:rPr>
                 <w:rStyle w:val="Hyperlink"/>
@@ -1565,7 +1565,7 @@
                 <w:noProof/>
                 <w:webHidden/>
               </w:rPr>
-              <w:instrText xml:space="preserve"> PAGEREF _Toc217732367 \h </w:instrText>
+              <w:instrText xml:space="preserve"> PAGEREF _Toc219892588 \h </w:instrText>
             </w:r>
             <w:r>
               <w:rPr>
@@ -1608,7 +1608,7 @@
               <w:lang w:val="en-AT" w:eastAsia="en-AT"/>
             </w:rPr>
           </w:pPr>
-          <w:hyperlink w:anchor="_Toc217732368" w:history="1">
+          <w:hyperlink w:anchor="_Toc219892589" w:history="1">
             <w:r>
               <w:rPr>
                 <w:rStyle w:val="Hyperlink"/>
@@ -1635,7 +1635,7 @@
                 <w:noProof/>
                 <w:webHidden/>
               </w:rPr>
-              <w:instrText xml:space="preserve"> PAGEREF _Toc217732368 \h </w:instrText>
+              <w:instrText xml:space="preserve"> PAGEREF _Toc219892589 \h </w:instrText>
             </w:r>
             <w:r>
               <w:rPr>
@@ -1678,7 +1678,7 @@
               <w:lang w:val="en-AT" w:eastAsia="en-AT"/>
             </w:rPr>
           </w:pPr>
-          <w:hyperlink w:anchor="_Toc217732369" w:history="1">
+          <w:hyperlink w:anchor="_Toc219892590" w:history="1">
             <w:r>
               <w:rPr>
                 <w:rStyle w:val="Hyperlink"/>
@@ -1705,7 +1705,7 @@
                 <w:noProof/>
                 <w:webHidden/>
               </w:rPr>
-              <w:instrText xml:space="preserve"> PAGEREF _Toc217732369 \h </w:instrText>
+              <w:instrText xml:space="preserve"> PAGEREF _Toc219892590 \h </w:instrText>
             </w:r>
             <w:r>
               <w:rPr>
@@ -1725,7 +1725,7 @@
                 <w:noProof/>
                 <w:webHidden/>
               </w:rPr>
-              <w:t>13</w:t>
+              <w:t>15</w:t>
             </w:r>
             <w:r>
               <w:rPr>
@@ -1748,13 +1748,13 @@
               <w:lang w:val="en-AT" w:eastAsia="en-AT"/>
             </w:rPr>
           </w:pPr>
-          <w:hyperlink w:anchor="_Toc217732370" w:history="1">
+          <w:hyperlink w:anchor="_Toc219892591" w:history="1">
             <w:r>
               <w:rPr>
                 <w:rStyle w:val="Hyperlink"/>
                 <w:noProof/>
               </w:rPr>
-              <w:t>Exercise 5 – Complete Game Implementation</w:t>
+              <w:t>Exercise 5 – Tribonacci</w:t>
             </w:r>
             <w:r>
               <w:rPr>
@@ -1775,7 +1775,7 @@
                 <w:noProof/>
                 <w:webHidden/>
               </w:rPr>
-              <w:instrText xml:space="preserve"> PAGEREF _Toc217732370 \h </w:instrText>
+              <w:instrText xml:space="preserve"> PAGEREF _Toc219892591 \h </w:instrText>
             </w:r>
             <w:r>
               <w:rPr>
@@ -1795,7 +1795,217 @@
                 <w:noProof/>
                 <w:webHidden/>
               </w:rPr>
-              <w:t>15</w:t>
+              <w:t>17</w:t>
+            </w:r>
+            <w:r>
+              <w:rPr>
+                <w:noProof/>
+                <w:webHidden/>
+              </w:rPr>
+              <w:fldChar w:fldCharType="end"/>
+            </w:r>
+          </w:hyperlink>
+        </w:p>
+        <w:p>
+          <w:pPr>
+            <w:pStyle w:val="TOC2"/>
+            <w:tabs>
+              <w:tab w:val="right" w:leader="dot" w:pos="8152"/>
+            </w:tabs>
+            <w:rPr>
+              <w:rFonts w:asciiTheme="minorHAnsi" w:eastAsiaTheme="minorEastAsia" w:hAnsiTheme="minorHAnsi"/>
+              <w:noProof/>
+              <w:lang w:val="en-AT" w:eastAsia="en-AT"/>
+            </w:rPr>
+          </w:pPr>
+          <w:hyperlink w:anchor="_Toc219892592" w:history="1">
+            <w:r>
+              <w:rPr>
+                <w:rStyle w:val="Hyperlink"/>
+                <w:noProof/>
+              </w:rPr>
+              <w:t>Solution Idea</w:t>
+            </w:r>
+            <w:r>
+              <w:rPr>
+                <w:noProof/>
+                <w:webHidden/>
+              </w:rPr>
+              <w:tab/>
+            </w:r>
+            <w:r>
+              <w:rPr>
+                <w:noProof/>
+                <w:webHidden/>
+              </w:rPr>
+              <w:fldChar w:fldCharType="begin"/>
+            </w:r>
+            <w:r>
+              <w:rPr>
+                <w:noProof/>
+                <w:webHidden/>
+              </w:rPr>
+              <w:instrText xml:space="preserve"> PAGEREF _Toc219892592 \h </w:instrText>
+            </w:r>
+            <w:r>
+              <w:rPr>
+                <w:noProof/>
+                <w:webHidden/>
+              </w:rPr>
+            </w:r>
+            <w:r>
+              <w:rPr>
+                <w:noProof/>
+                <w:webHidden/>
+              </w:rPr>
+              <w:fldChar w:fldCharType="separate"/>
+            </w:r>
+            <w:r>
+              <w:rPr>
+                <w:noProof/>
+                <w:webHidden/>
+              </w:rPr>
+              <w:t>17</w:t>
+            </w:r>
+            <w:r>
+              <w:rPr>
+                <w:noProof/>
+                <w:webHidden/>
+              </w:rPr>
+              <w:fldChar w:fldCharType="end"/>
+            </w:r>
+          </w:hyperlink>
+        </w:p>
+        <w:p>
+          <w:pPr>
+            <w:pStyle w:val="TOC2"/>
+            <w:tabs>
+              <w:tab w:val="right" w:leader="dot" w:pos="8152"/>
+            </w:tabs>
+            <w:rPr>
+              <w:rFonts w:asciiTheme="minorHAnsi" w:eastAsiaTheme="minorEastAsia" w:hAnsiTheme="minorHAnsi"/>
+              <w:noProof/>
+              <w:lang w:val="en-AT" w:eastAsia="en-AT"/>
+            </w:rPr>
+          </w:pPr>
+          <w:hyperlink w:anchor="_Toc219892593" w:history="1">
+            <w:r>
+              <w:rPr>
+                <w:rStyle w:val="Hyperlink"/>
+                <w:noProof/>
+              </w:rPr>
+              <w:t>Code</w:t>
+            </w:r>
+            <w:r>
+              <w:rPr>
+                <w:noProof/>
+                <w:webHidden/>
+              </w:rPr>
+              <w:tab/>
+            </w:r>
+            <w:r>
+              <w:rPr>
+                <w:noProof/>
+                <w:webHidden/>
+              </w:rPr>
+              <w:fldChar w:fldCharType="begin"/>
+            </w:r>
+            <w:r>
+              <w:rPr>
+                <w:noProof/>
+                <w:webHidden/>
+              </w:rPr>
+              <w:instrText xml:space="preserve"> PAGEREF _Toc219892593 \h </w:instrText>
+            </w:r>
+            <w:r>
+              <w:rPr>
+                <w:noProof/>
+                <w:webHidden/>
+              </w:rPr>
+            </w:r>
+            <w:r>
+              <w:rPr>
+                <w:noProof/>
+                <w:webHidden/>
+              </w:rPr>
+              <w:fldChar w:fldCharType="separate"/>
+            </w:r>
+            <w:r>
+              <w:rPr>
+                <w:noProof/>
+                <w:webHidden/>
+              </w:rPr>
+              <w:t>17</w:t>
+            </w:r>
+            <w:r>
+              <w:rPr>
+                <w:noProof/>
+                <w:webHidden/>
+              </w:rPr>
+              <w:fldChar w:fldCharType="end"/>
+            </w:r>
+          </w:hyperlink>
+        </w:p>
+        <w:p>
+          <w:pPr>
+            <w:pStyle w:val="TOC2"/>
+            <w:tabs>
+              <w:tab w:val="right" w:leader="dot" w:pos="8152"/>
+            </w:tabs>
+            <w:rPr>
+              <w:rFonts w:asciiTheme="minorHAnsi" w:eastAsiaTheme="minorEastAsia" w:hAnsiTheme="minorHAnsi"/>
+              <w:noProof/>
+              <w:lang w:val="en-AT" w:eastAsia="en-AT"/>
+            </w:rPr>
+          </w:pPr>
+          <w:hyperlink w:anchor="_Toc219892594" w:history="1">
+            <w:r>
+              <w:rPr>
+                <w:rStyle w:val="Hyperlink"/>
+                <w:noProof/>
+              </w:rPr>
+              <w:t>Test</w:t>
+            </w:r>
+            <w:r>
+              <w:rPr>
+                <w:noProof/>
+                <w:webHidden/>
+              </w:rPr>
+              <w:tab/>
+            </w:r>
+            <w:r>
+              <w:rPr>
+                <w:noProof/>
+                <w:webHidden/>
+              </w:rPr>
+              <w:fldChar w:fldCharType="begin"/>
+            </w:r>
+            <w:r>
+              <w:rPr>
+                <w:noProof/>
+                <w:webHidden/>
+              </w:rPr>
+              <w:instrText xml:space="preserve"> PAGEREF _Toc219892594 \h </w:instrText>
+            </w:r>
+            <w:r>
+              <w:rPr>
+                <w:noProof/>
+                <w:webHidden/>
+              </w:rPr>
+            </w:r>
+            <w:r>
+              <w:rPr>
+                <w:noProof/>
+                <w:webHidden/>
+              </w:rPr>
+              <w:fldChar w:fldCharType="separate"/>
+            </w:r>
+            <w:r>
+              <w:rPr>
+                <w:noProof/>
+                <w:webHidden/>
+              </w:rPr>
+              <w:t>18</w:t>
             </w:r>
             <w:r>
               <w:rPr>
@@ -1829,7 +2039,7 @@
       <w:pPr>
         <w:pStyle w:val="Heading1"/>
       </w:pPr>
-      <w:bookmarkStart w:id="1" w:name="_Toc217732353"/>
+      <w:bookmarkStart w:id="1" w:name="_Toc219892574"/>
       <w:r>
         <w:lastRenderedPageBreak/>
         <w:t xml:space="preserve">Table of </w:t>
@@ -1860,13 +2070,13 @@
       <w:r>
         <w:fldChar w:fldCharType="separate"/>
       </w:r>
-      <w:hyperlink w:anchor="_Toc217732371" w:history="1">
+      <w:hyperlink w:anchor="_Toc219892561" w:history="1">
         <w:r>
           <w:rPr>
             <w:rStyle w:val="Hyperlink"/>
             <w:noProof/>
           </w:rPr>
-          <w:t>Figure 1: Read Words</w:t>
+          <w:t>Figure 1: fibonacci iterative</w:t>
         </w:r>
         <w:r>
           <w:rPr>
@@ -1887,7 +2097,7 @@
             <w:noProof/>
             <w:webHidden/>
           </w:rPr>
-          <w:instrText xml:space="preserve"> PAGEREF _Toc217732371 \h </w:instrText>
+          <w:instrText xml:space="preserve"> PAGEREF _Toc219892561 \h </w:instrText>
         </w:r>
         <w:r>
           <w:rPr>
@@ -1907,7 +2117,7 @@
             <w:noProof/>
             <w:webHidden/>
           </w:rPr>
-          <w:t>4</w:t>
+          <w:t>3</w:t>
         </w:r>
         <w:r>
           <w:rPr>
@@ -1930,13 +2140,13 @@
           <w:lang w:val="en-AT" w:eastAsia="en-AT"/>
         </w:rPr>
       </w:pPr>
-      <w:hyperlink w:anchor="_Toc217732372" w:history="1">
+      <w:hyperlink w:anchor="_Toc219892562" w:history="1">
         <w:r>
           <w:rPr>
             <w:rStyle w:val="Hyperlink"/>
             <w:noProof/>
           </w:rPr>
-          <w:t>Figure 2: Global Words Class</w:t>
+          <w:t>Figure 2: Fibonacci Recursive</w:t>
         </w:r>
         <w:r>
           <w:rPr>
@@ -1957,7 +2167,7 @@
             <w:noProof/>
             <w:webHidden/>
           </w:rPr>
-          <w:instrText xml:space="preserve"> PAGEREF _Toc217732372 \h </w:instrText>
+          <w:instrText xml:space="preserve"> PAGEREF _Toc219892562 \h </w:instrText>
         </w:r>
         <w:r>
           <w:rPr>
@@ -2000,13 +2210,13 @@
           <w:lang w:val="en-AT" w:eastAsia="en-AT"/>
         </w:rPr>
       </w:pPr>
-      <w:hyperlink w:anchor="_Toc217732373" w:history="1">
+      <w:hyperlink w:anchor="_Toc219892563" w:history="1">
         <w:r>
           <w:rPr>
             <w:rStyle w:val="Hyperlink"/>
             <w:noProof/>
           </w:rPr>
-          <w:t>Figure 3: reading words</w:t>
+          <w:t>Figure 3: memoized</w:t>
         </w:r>
         <w:r>
           <w:rPr>
@@ -2027,7 +2237,7 @@
             <w:noProof/>
             <w:webHidden/>
           </w:rPr>
-          <w:instrText xml:space="preserve"> PAGEREF _Toc217732373 \h </w:instrText>
+          <w:instrText xml:space="preserve"> PAGEREF _Toc219892563 \h </w:instrText>
         </w:r>
         <w:r>
           <w:rPr>
@@ -2070,13 +2280,13 @@
           <w:lang w:val="en-AT" w:eastAsia="en-AT"/>
         </w:rPr>
       </w:pPr>
-      <w:hyperlink w:anchor="_Toc217732374" w:history="1">
+      <w:hyperlink w:anchor="_Toc219892564" w:history="1">
         <w:r>
           <w:rPr>
             <w:rStyle w:val="Hyperlink"/>
             <w:noProof/>
           </w:rPr>
-          <w:t>Figure 4: Reading Words</w:t>
+          <w:t>Figure 4: Results of Fibonacci</w:t>
         </w:r>
         <w:r>
           <w:rPr>
@@ -2097,7 +2307,7 @@
             <w:noProof/>
             <w:webHidden/>
           </w:rPr>
-          <w:instrText xml:space="preserve"> PAGEREF _Toc217732374 \h </w:instrText>
+          <w:instrText xml:space="preserve"> PAGEREF _Toc219892564 \h </w:instrText>
         </w:r>
         <w:r>
           <w:rPr>
@@ -2117,7 +2327,7 @@
             <w:noProof/>
             <w:webHidden/>
           </w:rPr>
-          <w:t>5</w:t>
+          <w:t>6</w:t>
         </w:r>
         <w:r>
           <w:rPr>
@@ -2140,13 +2350,13 @@
           <w:lang w:val="en-AT" w:eastAsia="en-AT"/>
         </w:rPr>
       </w:pPr>
-      <w:hyperlink w:anchor="_Toc217732375" w:history="1">
+      <w:hyperlink w:anchor="_Toc219892565" w:history="1">
         <w:r>
           <w:rPr>
             <w:rStyle w:val="Hyperlink"/>
             <w:noProof/>
           </w:rPr>
-          <w:t>Figure 5: Word Reading Failure</w:t>
+          <w:t>Figure 5: Tower of Hanoi</w:t>
         </w:r>
         <w:r>
           <w:rPr>
@@ -2167,7 +2377,7 @@
             <w:noProof/>
             <w:webHidden/>
           </w:rPr>
-          <w:instrText xml:space="preserve"> PAGEREF _Toc217732375 \h </w:instrText>
+          <w:instrText xml:space="preserve"> PAGEREF _Toc219892565 \h </w:instrText>
         </w:r>
         <w:r>
           <w:rPr>
@@ -2187,7 +2397,7 @@
             <w:noProof/>
             <w:webHidden/>
           </w:rPr>
-          <w:t>5</w:t>
+          <w:t>7</w:t>
         </w:r>
         <w:r>
           <w:rPr>
@@ -2210,13 +2420,13 @@
           <w:lang w:val="en-AT" w:eastAsia="en-AT"/>
         </w:rPr>
       </w:pPr>
-      <w:hyperlink w:anchor="_Toc217732376" w:history="1">
+      <w:hyperlink w:anchor="_Toc219892566" w:history="1">
         <w:r>
           <w:rPr>
             <w:rStyle w:val="Hyperlink"/>
             <w:noProof/>
           </w:rPr>
-          <w:t>Figure 6: getStringInput Method</w:t>
+          <w:t>Figure 6: Tower of Hanoi test</w:t>
         </w:r>
         <w:r>
           <w:rPr>
@@ -2237,7 +2447,7 @@
             <w:noProof/>
             <w:webHidden/>
           </w:rPr>
-          <w:instrText xml:space="preserve"> PAGEREF _Toc217732376 \h </w:instrText>
+          <w:instrText xml:space="preserve"> PAGEREF _Toc219892566 \h </w:instrText>
         </w:r>
         <w:r>
           <w:rPr>
@@ -2257,7 +2467,7 @@
             <w:noProof/>
             <w:webHidden/>
           </w:rPr>
-          <w:t>7</w:t>
+          <w:t>9</w:t>
         </w:r>
         <w:r>
           <w:rPr>
@@ -2280,13 +2490,13 @@
           <w:lang w:val="en-AT" w:eastAsia="en-AT"/>
         </w:rPr>
       </w:pPr>
-      <w:hyperlink w:anchor="_Toc217732377" w:history="1">
+      <w:hyperlink w:anchor="_Toc219892567" w:history="1">
         <w:r>
           <w:rPr>
             <w:rStyle w:val="Hyperlink"/>
             <w:noProof/>
           </w:rPr>
-          <w:t>Figure 7: validateGuess Method</w:t>
+          <w:t>Figure 7: decimalToBinary</w:t>
         </w:r>
         <w:r>
           <w:rPr>
@@ -2307,7 +2517,7 @@
             <w:noProof/>
             <w:webHidden/>
           </w:rPr>
-          <w:instrText xml:space="preserve"> PAGEREF _Toc217732377 \h </w:instrText>
+          <w:instrText xml:space="preserve"> PAGEREF _Toc219892567 \h </w:instrText>
         </w:r>
         <w:r>
           <w:rPr>
@@ -2327,7 +2537,7 @@
             <w:noProof/>
             <w:webHidden/>
           </w:rPr>
-          <w:t>7</w:t>
+          <w:t>10</w:t>
         </w:r>
         <w:r>
           <w:rPr>
@@ -2350,13 +2560,13 @@
           <w:lang w:val="en-AT" w:eastAsia="en-AT"/>
         </w:rPr>
       </w:pPr>
-      <w:hyperlink w:anchor="_Toc217732378" w:history="1">
+      <w:hyperlink w:anchor="_Toc219892568" w:history="1">
         <w:r>
           <w:rPr>
             <w:rStyle w:val="Hyperlink"/>
             <w:noProof/>
           </w:rPr>
-          <w:t>Figure 8: enterGuess Method</w:t>
+          <w:t>Figure 8: Binary Conversion test</w:t>
         </w:r>
         <w:r>
           <w:rPr>
@@ -2377,7 +2587,7 @@
             <w:noProof/>
             <w:webHidden/>
           </w:rPr>
-          <w:instrText xml:space="preserve"> PAGEREF _Toc217732378 \h </w:instrText>
+          <w:instrText xml:space="preserve"> PAGEREF _Toc219892568 \h </w:instrText>
         </w:r>
         <w:r>
           <w:rPr>
@@ -2397,7 +2607,7 @@
             <w:noProof/>
             <w:webHidden/>
           </w:rPr>
-          <w:t>8</w:t>
+          <w:t>11</w:t>
         </w:r>
         <w:r>
           <w:rPr>
@@ -2420,13 +2630,13 @@
           <w:lang w:val="en-AT" w:eastAsia="en-AT"/>
         </w:rPr>
       </w:pPr>
-      <w:hyperlink w:anchor="_Toc217732379" w:history="1">
+      <w:hyperlink w:anchor="_Toc219892569" w:history="1">
         <w:r>
           <w:rPr>
             <w:rStyle w:val="Hyperlink"/>
             <w:noProof/>
           </w:rPr>
-          <w:t>Figure 9: Guessing Tests</w:t>
+          <w:t>Figure 9: Convert number to words</w:t>
         </w:r>
         <w:r>
           <w:rPr>
@@ -2447,7 +2657,7 @@
             <w:noProof/>
             <w:webHidden/>
           </w:rPr>
-          <w:instrText xml:space="preserve"> PAGEREF _Toc217732379 \h </w:instrText>
+          <w:instrText xml:space="preserve"> PAGEREF _Toc219892569 \h </w:instrText>
         </w:r>
         <w:r>
           <w:rPr>
@@ -2467,7 +2677,7 @@
             <w:noProof/>
             <w:webHidden/>
           </w:rPr>
-          <w:t>8</w:t>
+          <w:t>15</w:t>
         </w:r>
         <w:r>
           <w:rPr>
@@ -2490,13 +2700,13 @@
           <w:lang w:val="en-AT" w:eastAsia="en-AT"/>
         </w:rPr>
       </w:pPr>
-      <w:hyperlink w:anchor="_Toc217732380" w:history="1">
+      <w:hyperlink w:anchor="_Toc219892570" w:history="1">
         <w:r>
           <w:rPr>
             <w:rStyle w:val="Hyperlink"/>
             <w:noProof/>
           </w:rPr>
-          <w:t>Figure 10: computeGuess</w:t>
+          <w:t>Figure 10: number conversion test</w:t>
         </w:r>
         <w:r>
           <w:rPr>
@@ -2517,7 +2727,7 @@
             <w:noProof/>
             <w:webHidden/>
           </w:rPr>
-          <w:instrText xml:space="preserve"> PAGEREF _Toc217732380 \h </w:instrText>
+          <w:instrText xml:space="preserve"> PAGEREF _Toc219892570 \h </w:instrText>
         </w:r>
         <w:r>
           <w:rPr>
@@ -2537,7 +2747,7 @@
             <w:noProof/>
             <w:webHidden/>
           </w:rPr>
-          <w:t>10</w:t>
+          <w:t>16</w:t>
         </w:r>
         <w:r>
           <w:rPr>
@@ -2560,13 +2770,13 @@
           <w:lang w:val="en-AT" w:eastAsia="en-AT"/>
         </w:rPr>
       </w:pPr>
-      <w:hyperlink w:anchor="_Toc217732381" w:history="1">
+      <w:hyperlink w:anchor="_Toc219892571" w:history="1">
         <w:r>
           <w:rPr>
             <w:rStyle w:val="Hyperlink"/>
             <w:noProof/>
           </w:rPr>
-          <w:t>Figure 11: Guess</w:t>
+          <w:t>Figure 11: Tribonacci</w:t>
         </w:r>
         <w:r>
           <w:rPr>
@@ -2587,7 +2797,7 @@
             <w:noProof/>
             <w:webHidden/>
           </w:rPr>
-          <w:instrText xml:space="preserve"> PAGEREF _Toc217732381 \h </w:instrText>
+          <w:instrText xml:space="preserve"> PAGEREF _Toc219892571 \h </w:instrText>
         </w:r>
         <w:r>
           <w:rPr>
@@ -2607,7 +2817,7 @@
             <w:noProof/>
             <w:webHidden/>
           </w:rPr>
-          <w:t>11</w:t>
+          <w:t>18</w:t>
         </w:r>
         <w:r>
           <w:rPr>
@@ -2630,13 +2840,13 @@
           <w:lang w:val="en-AT" w:eastAsia="en-AT"/>
         </w:rPr>
       </w:pPr>
-      <w:hyperlink w:anchor="_Toc217732382" w:history="1">
+      <w:hyperlink w:anchor="_Toc219892572" w:history="1">
         <w:r>
           <w:rPr>
             <w:rStyle w:val="Hyperlink"/>
             <w:noProof/>
           </w:rPr>
-          <w:t>Figure 12: Wordle</w:t>
+          <w:t>Figure 12: tribonacci test</w:t>
         </w:r>
         <w:r>
           <w:rPr>
@@ -2657,7 +2867,7 @@
             <w:noProof/>
             <w:webHidden/>
           </w:rPr>
-          <w:instrText xml:space="preserve"> PAGEREF _Toc217732382 \h </w:instrText>
+          <w:instrText xml:space="preserve"> PAGEREF _Toc219892572 \h </w:instrText>
         </w:r>
         <w:r>
           <w:rPr>
@@ -2677,7 +2887,7 @@
             <w:noProof/>
             <w:webHidden/>
           </w:rPr>
-          <w:t>11</w:t>
+          <w:t>18</w:t>
         </w:r>
         <w:r>
           <w:rPr>
@@ -2690,426 +2900,6 @@
     </w:p>
     <w:p>
       <w:pPr>
-        <w:pStyle w:val="TableofFigures"/>
-        <w:tabs>
-          <w:tab w:val="right" w:leader="dot" w:pos="8152"/>
-        </w:tabs>
-        <w:rPr>
-          <w:rFonts w:asciiTheme="minorHAnsi" w:eastAsiaTheme="minorEastAsia" w:hAnsiTheme="minorHAnsi"/>
-          <w:noProof/>
-          <w:lang w:val="en-AT" w:eastAsia="en-AT"/>
-        </w:rPr>
-      </w:pPr>
-      <w:hyperlink w:anchor="_Toc217732383" w:history="1">
-        <w:r>
-          <w:rPr>
-            <w:rStyle w:val="Hyperlink"/>
-            <w:noProof/>
-          </w:rPr>
-          <w:t>Figure 13: finding Hints</w:t>
-        </w:r>
-        <w:r>
-          <w:rPr>
-            <w:noProof/>
-            <w:webHidden/>
-          </w:rPr>
-          <w:tab/>
-        </w:r>
-        <w:r>
-          <w:rPr>
-            <w:noProof/>
-            <w:webHidden/>
-          </w:rPr>
-          <w:fldChar w:fldCharType="begin"/>
-        </w:r>
-        <w:r>
-          <w:rPr>
-            <w:noProof/>
-            <w:webHidden/>
-          </w:rPr>
-          <w:instrText xml:space="preserve"> PAGEREF _Toc217732383 \h </w:instrText>
-        </w:r>
-        <w:r>
-          <w:rPr>
-            <w:noProof/>
-            <w:webHidden/>
-          </w:rPr>
-        </w:r>
-        <w:r>
-          <w:rPr>
-            <w:noProof/>
-            <w:webHidden/>
-          </w:rPr>
-          <w:fldChar w:fldCharType="separate"/>
-        </w:r>
-        <w:r>
-          <w:rPr>
-            <w:noProof/>
-            <w:webHidden/>
-          </w:rPr>
-          <w:t>13</w:t>
-        </w:r>
-        <w:r>
-          <w:rPr>
-            <w:noProof/>
-            <w:webHidden/>
-          </w:rPr>
-          <w:fldChar w:fldCharType="end"/>
-        </w:r>
-      </w:hyperlink>
-    </w:p>
-    <w:p>
-      <w:pPr>
-        <w:pStyle w:val="TableofFigures"/>
-        <w:tabs>
-          <w:tab w:val="right" w:leader="dot" w:pos="8152"/>
-        </w:tabs>
-        <w:rPr>
-          <w:rFonts w:asciiTheme="minorHAnsi" w:eastAsiaTheme="minorEastAsia" w:hAnsiTheme="minorHAnsi"/>
-          <w:noProof/>
-          <w:lang w:val="en-AT" w:eastAsia="en-AT"/>
-        </w:rPr>
-      </w:pPr>
-      <w:hyperlink w:anchor="_Toc217732384" w:history="1">
-        <w:r>
-          <w:rPr>
-            <w:rStyle w:val="Hyperlink"/>
-            <w:noProof/>
-          </w:rPr>
-          <w:t>Figure 14: HELP!</w:t>
-        </w:r>
-        <w:r>
-          <w:rPr>
-            <w:noProof/>
-            <w:webHidden/>
-          </w:rPr>
-          <w:tab/>
-        </w:r>
-        <w:r>
-          <w:rPr>
-            <w:noProof/>
-            <w:webHidden/>
-          </w:rPr>
-          <w:fldChar w:fldCharType="begin"/>
-        </w:r>
-        <w:r>
-          <w:rPr>
-            <w:noProof/>
-            <w:webHidden/>
-          </w:rPr>
-          <w:instrText xml:space="preserve"> PAGEREF _Toc217732384 \h </w:instrText>
-        </w:r>
-        <w:r>
-          <w:rPr>
-            <w:noProof/>
-            <w:webHidden/>
-          </w:rPr>
-        </w:r>
-        <w:r>
-          <w:rPr>
-            <w:noProof/>
-            <w:webHidden/>
-          </w:rPr>
-          <w:fldChar w:fldCharType="separate"/>
-        </w:r>
-        <w:r>
-          <w:rPr>
-            <w:noProof/>
-            <w:webHidden/>
-          </w:rPr>
-          <w:t>13</w:t>
-        </w:r>
-        <w:r>
-          <w:rPr>
-            <w:noProof/>
-            <w:webHidden/>
-          </w:rPr>
-          <w:fldChar w:fldCharType="end"/>
-        </w:r>
-      </w:hyperlink>
-    </w:p>
-    <w:p>
-      <w:pPr>
-        <w:pStyle w:val="TableofFigures"/>
-        <w:tabs>
-          <w:tab w:val="right" w:leader="dot" w:pos="8152"/>
-        </w:tabs>
-        <w:rPr>
-          <w:rFonts w:asciiTheme="minorHAnsi" w:eastAsiaTheme="minorEastAsia" w:hAnsiTheme="minorHAnsi"/>
-          <w:noProof/>
-          <w:lang w:val="en-AT" w:eastAsia="en-AT"/>
-        </w:rPr>
-      </w:pPr>
-      <w:hyperlink w:anchor="_Toc217732385" w:history="1">
-        <w:r>
-          <w:rPr>
-            <w:rStyle w:val="Hyperlink"/>
-            <w:noProof/>
-          </w:rPr>
-          <w:t>Figure 15: TWANG</w:t>
-        </w:r>
-        <w:r>
-          <w:rPr>
-            <w:noProof/>
-            <w:webHidden/>
-          </w:rPr>
-          <w:tab/>
-        </w:r>
-        <w:r>
-          <w:rPr>
-            <w:noProof/>
-            <w:webHidden/>
-          </w:rPr>
-          <w:fldChar w:fldCharType="begin"/>
-        </w:r>
-        <w:r>
-          <w:rPr>
-            <w:noProof/>
-            <w:webHidden/>
-          </w:rPr>
-          <w:instrText xml:space="preserve"> PAGEREF _Toc217732385 \h </w:instrText>
-        </w:r>
-        <w:r>
-          <w:rPr>
-            <w:noProof/>
-            <w:webHidden/>
-          </w:rPr>
-        </w:r>
-        <w:r>
-          <w:rPr>
-            <w:noProof/>
-            <w:webHidden/>
-          </w:rPr>
-          <w:fldChar w:fldCharType="separate"/>
-        </w:r>
-        <w:r>
-          <w:rPr>
-            <w:noProof/>
-            <w:webHidden/>
-          </w:rPr>
-          <w:t>14</w:t>
-        </w:r>
-        <w:r>
-          <w:rPr>
-            <w:noProof/>
-            <w:webHidden/>
-          </w:rPr>
-          <w:fldChar w:fldCharType="end"/>
-        </w:r>
-      </w:hyperlink>
-    </w:p>
-    <w:p>
-      <w:pPr>
-        <w:pStyle w:val="TableofFigures"/>
-        <w:tabs>
-          <w:tab w:val="right" w:leader="dot" w:pos="8152"/>
-        </w:tabs>
-        <w:rPr>
-          <w:rFonts w:asciiTheme="minorHAnsi" w:eastAsiaTheme="minorEastAsia" w:hAnsiTheme="minorHAnsi"/>
-          <w:noProof/>
-          <w:lang w:val="en-AT" w:eastAsia="en-AT"/>
-        </w:rPr>
-      </w:pPr>
-      <w:hyperlink w:anchor="_Toc217732386" w:history="1">
-        <w:r>
-          <w:rPr>
-            <w:rStyle w:val="Hyperlink"/>
-            <w:noProof/>
-          </w:rPr>
-          <w:t>Figure 16: Main Menu</w:t>
-        </w:r>
-        <w:r>
-          <w:rPr>
-            <w:noProof/>
-            <w:webHidden/>
-          </w:rPr>
-          <w:tab/>
-        </w:r>
-        <w:r>
-          <w:rPr>
-            <w:noProof/>
-            <w:webHidden/>
-          </w:rPr>
-          <w:fldChar w:fldCharType="begin"/>
-        </w:r>
-        <w:r>
-          <w:rPr>
-            <w:noProof/>
-            <w:webHidden/>
-          </w:rPr>
-          <w:instrText xml:space="preserve"> PAGEREF _Toc217732386 \h </w:instrText>
-        </w:r>
-        <w:r>
-          <w:rPr>
-            <w:noProof/>
-            <w:webHidden/>
-          </w:rPr>
-        </w:r>
-        <w:r>
-          <w:rPr>
-            <w:noProof/>
-            <w:webHidden/>
-          </w:rPr>
-          <w:fldChar w:fldCharType="separate"/>
-        </w:r>
-        <w:r>
-          <w:rPr>
-            <w:noProof/>
-            <w:webHidden/>
-          </w:rPr>
-          <w:t>15</w:t>
-        </w:r>
-        <w:r>
-          <w:rPr>
-            <w:noProof/>
-            <w:webHidden/>
-          </w:rPr>
-          <w:fldChar w:fldCharType="end"/>
-        </w:r>
-      </w:hyperlink>
-    </w:p>
-    <w:p>
-      <w:pPr>
-        <w:pStyle w:val="TableofFigures"/>
-        <w:tabs>
-          <w:tab w:val="right" w:leader="dot" w:pos="8152"/>
-        </w:tabs>
-        <w:rPr>
-          <w:rFonts w:asciiTheme="minorHAnsi" w:eastAsiaTheme="minorEastAsia" w:hAnsiTheme="minorHAnsi"/>
-          <w:noProof/>
-          <w:lang w:val="en-AT" w:eastAsia="en-AT"/>
-        </w:rPr>
-      </w:pPr>
-      <w:hyperlink w:anchor="_Toc217732387" w:history="1">
-        <w:r>
-          <w:rPr>
-            <w:rStyle w:val="Hyperlink"/>
-            <w:noProof/>
-          </w:rPr>
-          <w:t>Figure 17: Help</w:t>
-        </w:r>
-        <w:r>
-          <w:rPr>
-            <w:noProof/>
-            <w:webHidden/>
-          </w:rPr>
-          <w:tab/>
-        </w:r>
-        <w:r>
-          <w:rPr>
-            <w:noProof/>
-            <w:webHidden/>
-          </w:rPr>
-          <w:fldChar w:fldCharType="begin"/>
-        </w:r>
-        <w:r>
-          <w:rPr>
-            <w:noProof/>
-            <w:webHidden/>
-          </w:rPr>
-          <w:instrText xml:space="preserve"> PAGEREF _Toc217732387 \h </w:instrText>
-        </w:r>
-        <w:r>
-          <w:rPr>
-            <w:noProof/>
-            <w:webHidden/>
-          </w:rPr>
-        </w:r>
-        <w:r>
-          <w:rPr>
-            <w:noProof/>
-            <w:webHidden/>
-          </w:rPr>
-          <w:fldChar w:fldCharType="separate"/>
-        </w:r>
-        <w:r>
-          <w:rPr>
-            <w:noProof/>
-            <w:webHidden/>
-          </w:rPr>
-          <w:t>15</w:t>
-        </w:r>
-        <w:r>
-          <w:rPr>
-            <w:noProof/>
-            <w:webHidden/>
-          </w:rPr>
-          <w:fldChar w:fldCharType="end"/>
-        </w:r>
-      </w:hyperlink>
-    </w:p>
-    <w:p>
-      <w:pPr>
-        <w:pStyle w:val="TableofFigures"/>
-        <w:tabs>
-          <w:tab w:val="right" w:leader="dot" w:pos="8152"/>
-        </w:tabs>
-        <w:rPr>
-          <w:rFonts w:asciiTheme="minorHAnsi" w:eastAsiaTheme="minorEastAsia" w:hAnsiTheme="minorHAnsi"/>
-          <w:noProof/>
-          <w:lang w:val="en-AT" w:eastAsia="en-AT"/>
-        </w:rPr>
-      </w:pPr>
-      <w:hyperlink w:anchor="_Toc217732388" w:history="1">
-        <w:r>
-          <w:rPr>
-            <w:rStyle w:val="Hyperlink"/>
-            <w:noProof/>
-          </w:rPr>
-          <w:t>Figure 18: Wordle</w:t>
-        </w:r>
-        <w:r>
-          <w:rPr>
-            <w:noProof/>
-            <w:webHidden/>
-          </w:rPr>
-          <w:tab/>
-        </w:r>
-        <w:r>
-          <w:rPr>
-            <w:noProof/>
-            <w:webHidden/>
-          </w:rPr>
-          <w:fldChar w:fldCharType="begin"/>
-        </w:r>
-        <w:r>
-          <w:rPr>
-            <w:noProof/>
-            <w:webHidden/>
-          </w:rPr>
-          <w:instrText xml:space="preserve"> PAGEREF _Toc217732388 \h </w:instrText>
-        </w:r>
-        <w:r>
-          <w:rPr>
-            <w:noProof/>
-            <w:webHidden/>
-          </w:rPr>
-        </w:r>
-        <w:r>
-          <w:rPr>
-            <w:noProof/>
-            <w:webHidden/>
-          </w:rPr>
-          <w:fldChar w:fldCharType="separate"/>
-        </w:r>
-        <w:r>
-          <w:rPr>
-            <w:noProof/>
-            <w:webHidden/>
-          </w:rPr>
-          <w:t>16</w:t>
-        </w:r>
-        <w:r>
-          <w:rPr>
-            <w:noProof/>
-            <w:webHidden/>
-          </w:rPr>
-          <w:fldChar w:fldCharType="end"/>
-        </w:r>
-      </w:hyperlink>
-    </w:p>
-    <w:p>
-      <w:pPr>
         <w:jc w:val="left"/>
       </w:pPr>
       <w:r>
@@ -3128,21 +2918,21 @@
       <w:pPr>
         <w:pStyle w:val="Heading1"/>
       </w:pPr>
-      <w:bookmarkStart w:id="2" w:name="_Toc217732354"/>
+      <w:bookmarkStart w:id="2" w:name="_Toc219892575"/>
       <w:r>
         <w:lastRenderedPageBreak/>
         <w:t xml:space="preserve">Exercise 1 – </w:t>
       </w:r>
+      <w:r>
+        <w:t>Fibonacci</w:t>
+      </w:r>
       <w:bookmarkEnd w:id="2"/>
-      <w:r>
-        <w:t>Fibonacci</w:t>
-      </w:r>
     </w:p>
     <w:p>
       <w:pPr>
         <w:pStyle w:val="Heading2"/>
       </w:pPr>
-      <w:bookmarkStart w:id="3" w:name="_Toc217732355"/>
+      <w:bookmarkStart w:id="3" w:name="_Toc219892576"/>
       <w:r>
         <w:t>Solution Idea</w:t>
       </w:r>
@@ -3160,22 +2950,14 @@
     </w:p>
     <w:p>
       <w:r>
-        <w:t xml:space="preserve">The </w:t>
-      </w:r>
-      <w:proofErr w:type="spellStart"/>
-      <w:r>
-        <w:t>memoized</w:t>
-      </w:r>
-      <w:proofErr w:type="spellEnd"/>
-      <w:r>
-        <w:t xml:space="preserve"> approach uses an external array that gets passed along. First I check if n is outside the bounds of the array, then I check is the value for n is already calculated, otherwise is calculate the value and add it to the array.</w:t>
+        <w:t>The memoized approach uses an external array that gets passed along. First I check if n is outside the bounds of the array, then I check is the value for n is already calculated, otherwise is calculate the value and add it to the array.</w:t>
       </w:r>
     </w:p>
     <w:p>
       <w:pPr>
         <w:pStyle w:val="Heading2"/>
       </w:pPr>
-      <w:bookmarkStart w:id="4" w:name="_Toc217732356"/>
+      <w:bookmarkStart w:id="4" w:name="_Toc219892577"/>
       <w:r>
         <w:t>Code</w:t>
       </w:r>
@@ -3186,15 +2968,7 @@
         <w:pStyle w:val="Pseoudocode"/>
       </w:pPr>
       <w:r>
-        <w:t xml:space="preserve">public int </w:t>
-      </w:r>
-      <w:proofErr w:type="spellStart"/>
-      <w:r>
-        <w:t>fibonacciIterative</w:t>
-      </w:r>
-      <w:proofErr w:type="spellEnd"/>
-      <w:r>
-        <w:t>(int n)</w:t>
+        <w:t>public int fibonacciIterative(int n)</w:t>
       </w:r>
       <w:r>
         <w:br/>
@@ -3272,6 +3046,7 @@
           <w:lang w:val="en-AT"/>
         </w:rPr>
       </w:pPr>
+      <w:bookmarkStart w:id="5" w:name="_Toc219892561"/>
       <w:r>
         <w:t xml:space="preserve">Figure </w:t>
       </w:r>
@@ -3294,16 +3069,9 @@
         <w:fldChar w:fldCharType="end"/>
       </w:r>
       <w:r>
-        <w:t xml:space="preserve">: </w:t>
-      </w:r>
-      <w:proofErr w:type="spellStart"/>
-      <w:r>
-        <w:t>fibonacci</w:t>
-      </w:r>
-      <w:proofErr w:type="spellEnd"/>
-      <w:r>
-        <w:t xml:space="preserve"> iterative</w:t>
-      </w:r>
+        <w:t>: fibonacci iterative</w:t>
+      </w:r>
+      <w:bookmarkEnd w:id="5"/>
     </w:p>
     <w:p>
       <w:pPr>
@@ -3317,15 +3085,7 @@
         <w:pStyle w:val="Pseoudocode"/>
       </w:pPr>
       <w:r>
-        <w:t xml:space="preserve">public int </w:t>
-      </w:r>
-      <w:proofErr w:type="spellStart"/>
-      <w:r>
-        <w:t>fibonacciRecursive</w:t>
-      </w:r>
-      <w:proofErr w:type="spellEnd"/>
-      <w:r>
-        <w:t>(int n)</w:t>
+        <w:t>public int fibonacciRecursive(int n)</w:t>
       </w:r>
       <w:r>
         <w:br/>
@@ -3355,23 +3115,7 @@
       </w:r>
       <w:r>
         <w:br/>
-        <w:t xml:space="preserve">    return </w:t>
-      </w:r>
-      <w:proofErr w:type="spellStart"/>
-      <w:r>
-        <w:t>fibonacciRecursive</w:t>
-      </w:r>
-      <w:proofErr w:type="spellEnd"/>
-      <w:r>
-        <w:t xml:space="preserve">(n - 1) + </w:t>
-      </w:r>
-      <w:proofErr w:type="spellStart"/>
-      <w:r>
-        <w:t>fibonacciRecursive</w:t>
-      </w:r>
-      <w:proofErr w:type="spellEnd"/>
-      <w:r>
-        <w:t>(n - 2);</w:t>
+        <w:t xml:space="preserve">    return fibonacciRecursive(n - 1) + fibonacciRecursive(n - 2);</w:t>
       </w:r>
       <w:r>
         <w:br/>
@@ -3382,6 +3126,7 @@
       <w:pPr>
         <w:pStyle w:val="Caption"/>
       </w:pPr>
+      <w:bookmarkStart w:id="6" w:name="_Toc219892562"/>
       <w:r>
         <w:t xml:space="preserve">Figure </w:t>
       </w:r>
@@ -3406,6 +3151,7 @@
       <w:r>
         <w:t>: Fibonacci Recursive</w:t>
       </w:r>
+      <w:bookmarkEnd w:id="6"/>
     </w:p>
     <w:p>
       <w:pPr>
@@ -3419,23 +3165,7 @@
         <w:pStyle w:val="Pseoudocode"/>
       </w:pPr>
       <w:r>
-        <w:t xml:space="preserve">public int </w:t>
-      </w:r>
-      <w:proofErr w:type="spellStart"/>
-      <w:r>
-        <w:t>fibonacciMemoized</w:t>
-      </w:r>
-      <w:proofErr w:type="spellEnd"/>
-      <w:r>
-        <w:t xml:space="preserve">(int n, int </w:t>
-      </w:r>
-      <w:proofErr w:type="spellStart"/>
-      <w:r>
-        <w:t>memoSize</w:t>
-      </w:r>
-      <w:proofErr w:type="spellEnd"/>
-      <w:r>
-        <w:t>)</w:t>
+        <w:t>public int fibonacciMemoized(int n, int memoSize)</w:t>
       </w:r>
       <w:r>
         <w:br/>
@@ -3443,38 +3173,14 @@
       </w:r>
       <w:r>
         <w:br/>
-        <w:t xml:space="preserve">    int[] memo = new </w:t>
-      </w:r>
-      <w:proofErr w:type="spellStart"/>
-      <w:r>
-        <w:t>int</w:t>
-      </w:r>
-      <w:proofErr w:type="spellEnd"/>
-      <w:r>
-        <w:t>[</w:t>
-      </w:r>
-      <w:proofErr w:type="spellStart"/>
-      <w:r>
-        <w:t>memoSize</w:t>
-      </w:r>
-      <w:proofErr w:type="spellEnd"/>
-      <w:r>
-        <w:t>];</w:t>
-      </w:r>
-      <w:r>
-        <w:br/>
-      </w:r>
-      <w:r>
-        <w:br/>
-        <w:t xml:space="preserve">    return </w:t>
-      </w:r>
-      <w:proofErr w:type="spellStart"/>
-      <w:r>
-        <w:t>fibonacciMemoized</w:t>
-      </w:r>
-      <w:proofErr w:type="spellEnd"/>
-      <w:r>
-        <w:t>(n, memo);</w:t>
+        <w:t xml:space="preserve">    int[] memo = new int[memoSize];</w:t>
+      </w:r>
+      <w:r>
+        <w:br/>
+      </w:r>
+      <w:r>
+        <w:br/>
+        <w:t xml:space="preserve">    return fibonacciMemoized(n, memo);</w:t>
       </w:r>
       <w:r>
         <w:br/>
@@ -3485,15 +3191,7 @@
       </w:r>
       <w:r>
         <w:br/>
-        <w:t xml:space="preserve">private int </w:t>
-      </w:r>
-      <w:proofErr w:type="spellStart"/>
-      <w:r>
-        <w:t>fibonacciMemoized</w:t>
-      </w:r>
-      <w:proofErr w:type="spellEnd"/>
-      <w:r>
-        <w:t>(int n, int[] memo)</w:t>
+        <w:t>private int fibonacciMemoized(int n, int[] memo)</w:t>
       </w:r>
       <w:r>
         <w:br/>
@@ -3520,15 +3218,7 @@
       </w:r>
       <w:r>
         <w:br/>
-        <w:t xml:space="preserve">    if (n &gt;= </w:t>
-      </w:r>
-      <w:proofErr w:type="spellStart"/>
-      <w:r>
-        <w:t>memo.length</w:t>
-      </w:r>
-      <w:proofErr w:type="spellEnd"/>
-      <w:r>
-        <w:t>)</w:t>
+        <w:t xml:space="preserve">    if (n &gt;= memo.length)</w:t>
       </w:r>
       <w:r>
         <w:br/>
@@ -3536,23 +3226,7 @@
       </w:r>
       <w:r>
         <w:br/>
-        <w:t xml:space="preserve">        return </w:t>
-      </w:r>
-      <w:proofErr w:type="spellStart"/>
-      <w:r>
-        <w:t>fibonacciMemoized</w:t>
-      </w:r>
-      <w:proofErr w:type="spellEnd"/>
-      <w:r>
-        <w:t xml:space="preserve">(n - 1, memo) + </w:t>
-      </w:r>
-      <w:proofErr w:type="spellStart"/>
-      <w:r>
-        <w:t>fibonacciMemoized</w:t>
-      </w:r>
-      <w:proofErr w:type="spellEnd"/>
-      <w:r>
-        <w:t>(n - 2, memo);</w:t>
+        <w:t xml:space="preserve">        return fibonacciMemoized(n - 1, memo) + fibonacciMemoized(n - 2, memo);</w:t>
       </w:r>
       <w:r>
         <w:br/>
@@ -3584,23 +3258,7 @@
       </w:r>
       <w:r>
         <w:br/>
-        <w:t xml:space="preserve">        memo[n] = </w:t>
-      </w:r>
-      <w:proofErr w:type="spellStart"/>
-      <w:r>
-        <w:t>fibonacciMemoized</w:t>
-      </w:r>
-      <w:proofErr w:type="spellEnd"/>
-      <w:r>
-        <w:t xml:space="preserve">(n - 1, memo) + </w:t>
-      </w:r>
-      <w:proofErr w:type="spellStart"/>
-      <w:r>
-        <w:t>fibonacciMemoized</w:t>
-      </w:r>
-      <w:proofErr w:type="spellEnd"/>
-      <w:r>
-        <w:t>(n - 2, memo);</w:t>
+        <w:t xml:space="preserve">        memo[n] = fibonacciMemoized(n - 1, memo) + fibonacciMemoized(n - 2, memo);</w:t>
       </w:r>
       <w:r>
         <w:br/>
@@ -3620,15 +3278,7 @@
       <w:r>
         <w:lastRenderedPageBreak/>
         <w:br/>
-        <w:t xml:space="preserve">public int </w:t>
-      </w:r>
-      <w:proofErr w:type="spellStart"/>
-      <w:r>
-        <w:t>fibonacciMemoized</w:t>
-      </w:r>
-      <w:proofErr w:type="spellEnd"/>
-      <w:r>
-        <w:t>(int n)</w:t>
+        <w:t>public int fibonacciMemoized(int n)</w:t>
       </w:r>
       <w:r>
         <w:br/>
@@ -3636,15 +3286,7 @@
       </w:r>
       <w:r>
         <w:br/>
-        <w:t xml:space="preserve">    return </w:t>
-      </w:r>
-      <w:proofErr w:type="spellStart"/>
-      <w:r>
-        <w:t>fibonacciMemoized</w:t>
-      </w:r>
-      <w:proofErr w:type="spellEnd"/>
-      <w:r>
-        <w:t>(n, n + 1);</w:t>
+        <w:t xml:space="preserve">    return fibonacciMemoized(n, n + 1);</w:t>
       </w:r>
       <w:r>
         <w:br/>
@@ -3658,6 +3300,7 @@
           <w:lang w:val="en-AT"/>
         </w:rPr>
       </w:pPr>
+      <w:bookmarkStart w:id="7" w:name="_Toc219892563"/>
       <w:r>
         <w:t xml:space="preserve">Figure </w:t>
       </w:r>
@@ -3680,21 +3323,19 @@
         <w:fldChar w:fldCharType="end"/>
       </w:r>
       <w:r>
-        <w:t xml:space="preserve">: </w:t>
-      </w:r>
-      <w:proofErr w:type="spellStart"/>
-      <w:r>
-        <w:t>memoized</w:t>
-      </w:r>
-      <w:proofErr w:type="spellEnd"/>
+        <w:t>: memoized</w:t>
+      </w:r>
+      <w:bookmarkEnd w:id="7"/>
     </w:p>
     <w:p>
       <w:pPr>
         <w:pStyle w:val="Heading2"/>
       </w:pPr>
+      <w:bookmarkStart w:id="8" w:name="_Toc219892578"/>
       <w:r>
         <w:t>Test</w:t>
       </w:r>
+      <w:bookmarkEnd w:id="8"/>
     </w:p>
     <w:p/>
     <w:p>
@@ -3884,13 +3525,8 @@
       <w:pPr>
         <w:pStyle w:val="Pseoudocode"/>
       </w:pPr>
-      <w:proofErr w:type="spellStart"/>
-      <w:r>
-        <w:t>Memoized</w:t>
-      </w:r>
-      <w:proofErr w:type="spellEnd"/>
-      <w:r>
-        <w:t xml:space="preserve"> Approach:</w:t>
+      <w:r>
+        <w:t>Memoized Approach:</w:t>
       </w:r>
     </w:p>
     <w:p>
@@ -4007,52 +3643,32 @@
       <w:pPr>
         <w:pStyle w:val="Pseoudocode"/>
       </w:pPr>
-      <w:proofErr w:type="spellStart"/>
-      <w:r>
-        <w:t>Memoized</w:t>
-      </w:r>
-      <w:proofErr w:type="spellEnd"/>
-      <w:r>
-        <w:t xml:space="preserve"> (medium memo : 15) result: 102334155, Time: 1867100 ns</w:t>
-      </w:r>
-    </w:p>
-    <w:p>
-      <w:pPr>
-        <w:pStyle w:val="Pseoudocode"/>
-      </w:pPr>
-      <w:proofErr w:type="spellStart"/>
-      <w:r>
-        <w:t>Memoized</w:t>
-      </w:r>
-      <w:proofErr w:type="spellEnd"/>
-      <w:r>
-        <w:t xml:space="preserve"> result (n + 1 memo): 102334155, Time: 16800 ns</w:t>
-      </w:r>
-    </w:p>
-    <w:p>
-      <w:pPr>
-        <w:pStyle w:val="Pseoudocode"/>
-      </w:pPr>
-      <w:proofErr w:type="spellStart"/>
-      <w:r>
-        <w:t>Memoized</w:t>
-      </w:r>
-      <w:proofErr w:type="spellEnd"/>
-      <w:r>
-        <w:t xml:space="preserve"> (large memo : 30) result: 102334155, Time: 134300 ns</w:t>
-      </w:r>
-    </w:p>
-    <w:p>
-      <w:pPr>
-        <w:pStyle w:val="Pseoudocode"/>
-      </w:pPr>
-      <w:proofErr w:type="spellStart"/>
-      <w:r>
-        <w:t>Memoized</w:t>
-      </w:r>
-      <w:proofErr w:type="spellEnd"/>
-      <w:r>
-        <w:t xml:space="preserve"> (small memo : 5) result: 102334155, Time: 56583400 ns</w:t>
+      <w:r>
+        <w:t>Memoized (medium memo : 15) result: 102334155, Time: 1867100 ns</w:t>
+      </w:r>
+    </w:p>
+    <w:p>
+      <w:pPr>
+        <w:pStyle w:val="Pseoudocode"/>
+      </w:pPr>
+      <w:r>
+        <w:t>Memoized result (n + 1 memo): 102334155, Time: 16800 ns</w:t>
+      </w:r>
+    </w:p>
+    <w:p>
+      <w:pPr>
+        <w:pStyle w:val="Pseoudocode"/>
+      </w:pPr>
+      <w:r>
+        <w:t>Memoized (large memo : 30) result: 102334155, Time: 134300 ns</w:t>
+      </w:r>
+    </w:p>
+    <w:p>
+      <w:pPr>
+        <w:pStyle w:val="Pseoudocode"/>
+      </w:pPr>
+      <w:r>
+        <w:t>Memoized (small memo : 5) result: 102334155, Time: 56583400 ns</w:t>
       </w:r>
     </w:p>
     <w:p>
@@ -4075,6 +3691,7 @@
       <w:pPr>
         <w:pStyle w:val="Caption"/>
       </w:pPr>
+      <w:bookmarkStart w:id="9" w:name="_Toc219892564"/>
       <w:r>
         <w:t xml:space="preserve">Figure </w:t>
       </w:r>
@@ -4099,18 +3716,11 @@
       <w:r>
         <w:t>: Results of Fibonacci</w:t>
       </w:r>
-    </w:p>
-    <w:p>
-      <w:r>
-        <w:t xml:space="preserve">As expected, the iterative result is the most efficient. </w:t>
-      </w:r>
-      <w:proofErr w:type="spellStart"/>
-      <w:r>
-        <w:t>Memoization</w:t>
-      </w:r>
-      <w:proofErr w:type="spellEnd"/>
-      <w:r>
-        <w:t xml:space="preserve"> helps a lot with the recursive solution.</w:t>
+      <w:bookmarkEnd w:id="9"/>
+    </w:p>
+    <w:p>
+      <w:r>
+        <w:t>As expected, the iterative result is the most efficient. Memoization helps a lot with the recursive solution.</w:t>
       </w:r>
     </w:p>
     <w:p/>
@@ -4126,6 +3736,7 @@
       <w:pPr>
         <w:pStyle w:val="Heading1"/>
       </w:pPr>
+      <w:bookmarkStart w:id="10" w:name="_Toc219892579"/>
       <w:r>
         <w:lastRenderedPageBreak/>
         <w:t xml:space="preserve">Exercise </w:t>
@@ -4139,14 +3750,17 @@
       <w:r>
         <w:t>Tower of Hanoi</w:t>
       </w:r>
+      <w:bookmarkEnd w:id="10"/>
     </w:p>
     <w:p>
       <w:pPr>
         <w:pStyle w:val="Heading2"/>
       </w:pPr>
+      <w:bookmarkStart w:id="11" w:name="_Toc219892580"/>
       <w:r>
         <w:t>Solution Idea</w:t>
       </w:r>
+      <w:bookmarkEnd w:id="11"/>
     </w:p>
     <w:p>
       <w:r>
@@ -4160,9 +3774,11 @@
       <w:pPr>
         <w:pStyle w:val="Heading2"/>
       </w:pPr>
+      <w:bookmarkStart w:id="12" w:name="_Toc219892581"/>
       <w:r>
         <w:t>Code</w:t>
       </w:r>
+      <w:bookmarkEnd w:id="12"/>
     </w:p>
     <w:p/>
     <w:p>
@@ -4170,15 +3786,7 @@
         <w:pStyle w:val="Pseoudocode"/>
       </w:pPr>
       <w:r>
-        <w:t xml:space="preserve">public </w:t>
-      </w:r>
-      <w:proofErr w:type="spellStart"/>
-      <w:r>
-        <w:t>TowerOfHanoi</w:t>
-      </w:r>
-      <w:proofErr w:type="spellEnd"/>
-      <w:r>
-        <w:t>(int disks)</w:t>
+        <w:t>public TowerOfHanoi(int disks)</w:t>
       </w:r>
       <w:r>
         <w:br/>
@@ -4186,26 +3794,14 @@
       </w:r>
       <w:r>
         <w:br/>
-        <w:t xml:space="preserve">    </w:t>
-      </w:r>
-      <w:proofErr w:type="spellStart"/>
-      <w:r>
-        <w:t>setDisks</w:t>
-      </w:r>
-      <w:proofErr w:type="spellEnd"/>
-      <w:r>
-        <w:t>(disks);</w:t>
-      </w:r>
-      <w:r>
-        <w:br/>
-      </w:r>
-      <w:r>
-        <w:br/>
-        <w:t xml:space="preserve">    </w:t>
-      </w:r>
-      <w:proofErr w:type="spellStart"/>
-      <w:r>
-        <w:t>UI.</w:t>
+        <w:t xml:space="preserve">    setDisks(disks);</w:t>
+      </w:r>
+      <w:r>
+        <w:br/>
+      </w:r>
+      <w:r>
+        <w:br/>
+        <w:t xml:space="preserve">    UI.</w:t>
       </w:r>
       <w:r>
         <w:rPr>
@@ -4214,29 +3810,12 @@
         </w:rPr>
         <w:t>printlnBlue</w:t>
       </w:r>
-      <w:proofErr w:type="spellEnd"/>
-      <w:r>
-        <w:t xml:space="preserve">("Solving Tower of Hanoi with " + </w:t>
-      </w:r>
-      <w:proofErr w:type="spellStart"/>
-      <w:r>
-        <w:t>getDisks</w:t>
-      </w:r>
-      <w:proofErr w:type="spellEnd"/>
-      <w:r>
-        <w:t>() + " disks:");</w:t>
-      </w:r>
-      <w:r>
-        <w:br/>
-        <w:t xml:space="preserve">    solve(</w:t>
-      </w:r>
-      <w:proofErr w:type="spellStart"/>
-      <w:r>
-        <w:t>getDisks</w:t>
-      </w:r>
-      <w:proofErr w:type="spellEnd"/>
-      <w:r>
-        <w:t>(), 'A', 'C', 'B');</w:t>
+      <w:r>
+        <w:t>("Solving Tower of Hanoi with " + getDisks() + " disks:");</w:t>
+      </w:r>
+      <w:r>
+        <w:br/>
+        <w:t xml:space="preserve">    solve(getDisks(), 'A', 'C', 'B');</w:t>
       </w:r>
       <w:r>
         <w:br/>
@@ -4247,31 +3826,7 @@
       </w:r>
       <w:r>
         <w:br/>
-        <w:t xml:space="preserve">private void solve(int n, char </w:t>
-      </w:r>
-      <w:proofErr w:type="spellStart"/>
-      <w:r>
-        <w:t>fromPeg</w:t>
-      </w:r>
-      <w:proofErr w:type="spellEnd"/>
-      <w:r>
-        <w:t xml:space="preserve">, char </w:t>
-      </w:r>
-      <w:proofErr w:type="spellStart"/>
-      <w:r>
-        <w:t>toPeg</w:t>
-      </w:r>
-      <w:proofErr w:type="spellEnd"/>
-      <w:r>
-        <w:t xml:space="preserve">, char </w:t>
-      </w:r>
-      <w:proofErr w:type="spellStart"/>
-      <w:r>
-        <w:t>auxPeg</w:t>
-      </w:r>
-      <w:proofErr w:type="spellEnd"/>
-      <w:r>
-        <w:t>)</w:t>
+        <w:t>private void solve(int n, char fromPeg, char toPeg, char auxPeg)</w:t>
       </w:r>
       <w:r>
         <w:br/>
@@ -4298,42 +3853,14 @@
       </w:r>
       <w:r>
         <w:br/>
-        <w:t xml:space="preserve">    solve(n - 1, </w:t>
-      </w:r>
-      <w:proofErr w:type="spellStart"/>
-      <w:r>
-        <w:t>fromPeg</w:t>
-      </w:r>
-      <w:proofErr w:type="spellEnd"/>
-      <w:r>
-        <w:t xml:space="preserve">, </w:t>
-      </w:r>
-      <w:proofErr w:type="spellStart"/>
-      <w:r>
-        <w:t>auxPeg</w:t>
-      </w:r>
-      <w:proofErr w:type="spellEnd"/>
-      <w:r>
-        <w:t xml:space="preserve">, </w:t>
-      </w:r>
-      <w:proofErr w:type="spellStart"/>
-      <w:r>
-        <w:t>toPeg</w:t>
-      </w:r>
-      <w:proofErr w:type="spellEnd"/>
-      <w:r>
-        <w:t>);</w:t>
-      </w:r>
-      <w:r>
-        <w:br/>
-      </w:r>
-      <w:r>
-        <w:br/>
-        <w:t xml:space="preserve">    </w:t>
-      </w:r>
-      <w:proofErr w:type="spellStart"/>
-      <w:r>
-        <w:t>UI.</w:t>
+        <w:t xml:space="preserve">    solve(n - 1, fromPeg, auxPeg, toPeg);</w:t>
+      </w:r>
+      <w:r>
+        <w:br/>
+      </w:r>
+      <w:r>
+        <w:br/>
+        <w:t xml:space="preserve">    UI.</w:t>
       </w:r>
       <w:r>
         <w:rPr>
@@ -4342,56 +3869,15 @@
         </w:rPr>
         <w:t>printlnGreen</w:t>
       </w:r>
-      <w:proofErr w:type="spellEnd"/>
-      <w:r>
-        <w:t xml:space="preserve">("Move disk " + n + " from peg " + </w:t>
-      </w:r>
-      <w:proofErr w:type="spellStart"/>
-      <w:r>
-        <w:t>fromPeg</w:t>
-      </w:r>
-      <w:proofErr w:type="spellEnd"/>
-      <w:r>
-        <w:t xml:space="preserve"> + " to peg " + </w:t>
-      </w:r>
-      <w:proofErr w:type="spellStart"/>
-      <w:r>
-        <w:t>toPeg</w:t>
-      </w:r>
-      <w:proofErr w:type="spellEnd"/>
-      <w:r>
-        <w:t>);</w:t>
-      </w:r>
-      <w:r>
-        <w:br/>
-      </w:r>
-      <w:r>
-        <w:br/>
-        <w:t xml:space="preserve">    solve(n - 1, </w:t>
-      </w:r>
-      <w:proofErr w:type="spellStart"/>
-      <w:r>
-        <w:t>auxPeg</w:t>
-      </w:r>
-      <w:proofErr w:type="spellEnd"/>
-      <w:r>
-        <w:t xml:space="preserve">, </w:t>
-      </w:r>
-      <w:proofErr w:type="spellStart"/>
-      <w:r>
-        <w:t>toPeg</w:t>
-      </w:r>
-      <w:proofErr w:type="spellEnd"/>
-      <w:r>
-        <w:t xml:space="preserve">, </w:t>
-      </w:r>
-      <w:proofErr w:type="spellStart"/>
-      <w:r>
-        <w:t>fromPeg</w:t>
-      </w:r>
-      <w:proofErr w:type="spellEnd"/>
-      <w:r>
-        <w:t>);</w:t>
+      <w:r>
+        <w:t>("Move disk " + n + " from peg " + fromPeg + " to peg " + toPeg);</w:t>
+      </w:r>
+      <w:r>
+        <w:br/>
+      </w:r>
+      <w:r>
+        <w:br/>
+        <w:t xml:space="preserve">    solve(n - 1, auxPeg, toPeg, fromPeg);</w:t>
       </w:r>
       <w:r>
         <w:br/>
@@ -4405,6 +3891,7 @@
           <w:lang w:val="en-AT"/>
         </w:rPr>
       </w:pPr>
+      <w:bookmarkStart w:id="13" w:name="_Toc219892565"/>
       <w:r>
         <w:t xml:space="preserve">Figure </w:t>
       </w:r>
@@ -4429,16 +3916,19 @@
       <w:r>
         <w:t>: Tower of Hanoi</w:t>
       </w:r>
+      <w:bookmarkEnd w:id="13"/>
     </w:p>
     <w:p/>
     <w:p>
       <w:pPr>
         <w:pStyle w:val="Heading2"/>
       </w:pPr>
+      <w:bookmarkStart w:id="14" w:name="_Toc219892582"/>
       <w:r>
         <w:lastRenderedPageBreak/>
         <w:t>Test</w:t>
       </w:r>
+      <w:bookmarkEnd w:id="14"/>
     </w:p>
     <w:p>
       <w:pPr>
@@ -4896,21 +4386,14 @@
         <w:pStyle w:val="Pseoudocode"/>
       </w:pPr>
       <w:r>
-        <w:t xml:space="preserve">Move disk 1 from peg A to </w:t>
-      </w:r>
-      <w:proofErr w:type="spellStart"/>
-      <w:r>
-        <w:t>peg</w:t>
-      </w:r>
-      <w:proofErr w:type="spellEnd"/>
-      <w:r>
-        <w:t xml:space="preserve"> C</w:t>
+        <w:t>Move disk 1 from peg A to peg C</w:t>
       </w:r>
     </w:p>
     <w:p>
       <w:pPr>
         <w:pStyle w:val="Caption"/>
       </w:pPr>
+      <w:bookmarkStart w:id="15" w:name="_Toc219892566"/>
       <w:r>
         <w:t xml:space="preserve">Figure </w:t>
       </w:r>
@@ -4935,6 +4418,7 @@
       <w:r>
         <w:t>: Tower of Hanoi test</w:t>
       </w:r>
+      <w:bookmarkEnd w:id="15"/>
     </w:p>
     <w:p>
       <w:pPr>
@@ -4948,6 +4432,7 @@
       <w:pPr>
         <w:pStyle w:val="Heading1"/>
       </w:pPr>
+      <w:bookmarkStart w:id="16" w:name="_Toc219892583"/>
       <w:r>
         <w:lastRenderedPageBreak/>
         <w:t xml:space="preserve">Exercise </w:t>
@@ -4961,50 +4446,39 @@
       <w:r>
         <w:t>Decimal to Binary</w:t>
       </w:r>
+      <w:bookmarkEnd w:id="16"/>
     </w:p>
     <w:p>
       <w:pPr>
         <w:pStyle w:val="Heading2"/>
       </w:pPr>
+      <w:bookmarkStart w:id="17" w:name="_Toc219892584"/>
       <w:r>
         <w:t>Solution Idea</w:t>
       </w:r>
-    </w:p>
-    <w:p>
-      <w:r>
-        <w:t xml:space="preserve">Using a </w:t>
-      </w:r>
-      <w:proofErr w:type="spellStart"/>
-      <w:r>
-        <w:t>Stringbuilder</w:t>
-      </w:r>
-      <w:proofErr w:type="spellEnd"/>
-      <w:r>
-        <w:t>, I append the modulus of 2 of the decimal number, before recursing using the half of the decimal number. The base case is decimal == 0 and to check for decimal == 0, I first check if the string is empty to return “0”.</w:t>
+      <w:bookmarkEnd w:id="17"/>
+    </w:p>
+    <w:p>
+      <w:r>
+        <w:t>Using a Stringbuilder, I append the modulus of 2 of the decimal number, before recursing using the half of the decimal number. The base case is decimal == 0 and to check for decimal == 0, I first check if the string is empty to return “0”.</w:t>
       </w:r>
     </w:p>
     <w:p>
       <w:pPr>
         <w:pStyle w:val="Heading2"/>
       </w:pPr>
+      <w:bookmarkStart w:id="18" w:name="_Toc219892585"/>
       <w:r>
         <w:t>Code</w:t>
       </w:r>
-    </w:p>
-    <w:p>
-      <w:pPr>
-        <w:pStyle w:val="Pseoudocode"/>
-      </w:pPr>
-      <w:r>
-        <w:t xml:space="preserve">private static String </w:t>
-      </w:r>
-      <w:proofErr w:type="spellStart"/>
-      <w:r>
-        <w:t>decimalToBinary</w:t>
-      </w:r>
-      <w:proofErr w:type="spellEnd"/>
-      <w:r>
-        <w:t>(int decimal, StringBuilder binary)</w:t>
+      <w:bookmarkEnd w:id="18"/>
+    </w:p>
+    <w:p>
+      <w:pPr>
+        <w:pStyle w:val="Pseoudocode"/>
+      </w:pPr>
+      <w:r>
+        <w:t>private static String decimalToBinary(int decimal, StringBuilder binary)</w:t>
       </w:r>
       <w:r>
         <w:br/>
@@ -5028,15 +4502,7 @@
       </w:r>
       <w:r>
         <w:br/>
-        <w:t xml:space="preserve">        if (</w:t>
-      </w:r>
-      <w:proofErr w:type="spellStart"/>
-      <w:r>
-        <w:t>binary.isEmpty</w:t>
-      </w:r>
-      <w:proofErr w:type="spellEnd"/>
-      <w:r>
-        <w:t>())</w:t>
+        <w:t xml:space="preserve">        if (binary.isEmpty())</w:t>
       </w:r>
       <w:r>
         <w:br/>
@@ -5059,23 +4525,7 @@
       </w:r>
       <w:r>
         <w:br/>
-        <w:t xml:space="preserve">        return </w:t>
-      </w:r>
-      <w:proofErr w:type="spellStart"/>
-      <w:r>
-        <w:t>binary.reverse</w:t>
-      </w:r>
-      <w:proofErr w:type="spellEnd"/>
-      <w:r>
-        <w:t>().</w:t>
-      </w:r>
-      <w:proofErr w:type="spellStart"/>
-      <w:r>
-        <w:t>toString</w:t>
-      </w:r>
-      <w:proofErr w:type="spellEnd"/>
-      <w:r>
-        <w:t>();</w:t>
+        <w:t xml:space="preserve">        return binary.reverse().toString();</w:t>
       </w:r>
       <w:r>
         <w:br/>
@@ -5086,15 +4536,7 @@
       </w:r>
       <w:r>
         <w:br/>
-        <w:t xml:space="preserve">    </w:t>
-      </w:r>
-      <w:proofErr w:type="spellStart"/>
-      <w:r>
-        <w:t>binary.append</w:t>
-      </w:r>
-      <w:proofErr w:type="spellEnd"/>
-      <w:r>
-        <w:t>(decimal % 2);</w:t>
+        <w:t xml:space="preserve">    binary.append(decimal % 2);</w:t>
       </w:r>
       <w:r>
         <w:br/>
@@ -5103,7 +4545,6 @@
         <w:br/>
         <w:t xml:space="preserve">    return </w:t>
       </w:r>
-      <w:proofErr w:type="spellStart"/>
       <w:r>
         <w:rPr>
           <w:i/>
@@ -5111,7 +4552,6 @@
         </w:rPr>
         <w:t>decimalToBinary</w:t>
       </w:r>
-      <w:proofErr w:type="spellEnd"/>
       <w:r>
         <w:t>(decimal / 2, binary);</w:t>
       </w:r>
@@ -5127,6 +4567,7 @@
           <w:lang w:val="en-AT"/>
         </w:rPr>
       </w:pPr>
+      <w:bookmarkStart w:id="19" w:name="_Toc219892567"/>
       <w:r>
         <w:t xml:space="preserve">Figure </w:t>
       </w:r>
@@ -5149,21 +4590,19 @@
         <w:fldChar w:fldCharType="end"/>
       </w:r>
       <w:r>
-        <w:t xml:space="preserve">: </w:t>
-      </w:r>
-      <w:proofErr w:type="spellStart"/>
-      <w:r>
-        <w:t>decimalToBinary</w:t>
-      </w:r>
-      <w:proofErr w:type="spellEnd"/>
+        <w:t>: decimalToBinary</w:t>
+      </w:r>
+      <w:bookmarkEnd w:id="19"/>
     </w:p>
     <w:p>
       <w:pPr>
         <w:pStyle w:val="Heading2"/>
       </w:pPr>
+      <w:bookmarkStart w:id="20" w:name="_Toc219892586"/>
       <w:r>
         <w:t>Test</w:t>
       </w:r>
+      <w:bookmarkEnd w:id="20"/>
     </w:p>
     <w:p>
       <w:pPr>
@@ -5227,21 +4666,14 @@
         <w:pStyle w:val="Pseoudocode"/>
       </w:pPr>
       <w:r>
-        <w:t xml:space="preserve">Decimal: 255 -&gt; </w:t>
-      </w:r>
-      <w:proofErr w:type="spellStart"/>
-      <w:r>
-        <w:t>Binary</w:t>
-      </w:r>
-      <w:proofErr w:type="spellEnd"/>
-      <w:r>
-        <w:t>: 11111111</w:t>
+        <w:t>Decimal: 255 -&gt; Binary: 11111111</w:t>
       </w:r>
     </w:p>
     <w:p>
       <w:pPr>
         <w:pStyle w:val="Caption"/>
       </w:pPr>
+      <w:bookmarkStart w:id="21" w:name="_Toc219892568"/>
       <w:r>
         <w:t xml:space="preserve">Figure </w:t>
       </w:r>
@@ -5266,6 +4698,7 @@
       <w:r>
         <w:t>: Binary Conversion test</w:t>
       </w:r>
+      <w:bookmarkEnd w:id="21"/>
     </w:p>
     <w:p>
       <w:pPr>
@@ -5279,6 +4712,7 @@
       <w:pPr>
         <w:pStyle w:val="Heading1"/>
       </w:pPr>
+      <w:bookmarkStart w:id="22" w:name="_Toc219892587"/>
       <w:r>
         <w:lastRenderedPageBreak/>
         <w:t xml:space="preserve">Exercise </w:t>
@@ -5292,14 +4726,17 @@
       <w:r>
         <w:t>Number to Words</w:t>
       </w:r>
+      <w:bookmarkEnd w:id="22"/>
     </w:p>
     <w:p>
       <w:pPr>
         <w:pStyle w:val="Heading2"/>
       </w:pPr>
+      <w:bookmarkStart w:id="23" w:name="_Toc219892588"/>
       <w:r>
         <w:t>Solution Idea</w:t>
       </w:r>
+      <w:bookmarkEnd w:id="23"/>
     </w:p>
     <w:p>
       <w:r>
@@ -5310,9 +4747,11 @@
       <w:pPr>
         <w:pStyle w:val="Heading2"/>
       </w:pPr>
+      <w:bookmarkStart w:id="24" w:name="_Toc219892589"/>
       <w:r>
         <w:t>Code</w:t>
       </w:r>
+      <w:bookmarkEnd w:id="24"/>
     </w:p>
     <w:p/>
     <w:p>
@@ -5320,15 +4759,7 @@
         <w:pStyle w:val="Pseoudocode"/>
       </w:pPr>
       <w:r>
-        <w:t xml:space="preserve">private static String </w:t>
-      </w:r>
-      <w:proofErr w:type="spellStart"/>
-      <w:r>
-        <w:t>numberToWords</w:t>
-      </w:r>
-      <w:proofErr w:type="spellEnd"/>
-      <w:r>
-        <w:t>(int number, StringBuilder str)</w:t>
+        <w:t>private static String numberToWords(int number, StringBuilder str)</w:t>
       </w:r>
       <w:r>
         <w:br/>
@@ -5354,15 +4785,7 @@
       </w:r>
       <w:r>
         <w:br/>
-        <w:t xml:space="preserve">        throw new </w:t>
-      </w:r>
-      <w:proofErr w:type="spellStart"/>
-      <w:r>
-        <w:t>IllegalArgumentException</w:t>
-      </w:r>
-      <w:proofErr w:type="spellEnd"/>
-      <w:r>
-        <w:t xml:space="preserve">("Number must be between 0 and " + </w:t>
+        <w:t xml:space="preserve">        throw new IllegalArgumentException("Number must be between 0 and " + </w:t>
       </w:r>
       <w:r>
         <w:rPr>
@@ -5398,17 +4821,8 @@
       </w:r>
       <w:r>
         <w:br/>
-        <w:t xml:space="preserve">        </w:t>
-      </w:r>
-      <w:proofErr w:type="spellStart"/>
-      <w:r>
-        <w:t>str.append</w:t>
-      </w:r>
-      <w:proofErr w:type="spellEnd"/>
-      <w:r>
-        <w:t>(</w:t>
-      </w:r>
-      <w:proofErr w:type="spellStart"/>
+        <w:t xml:space="preserve">        str.append(</w:t>
+      </w:r>
       <w:r>
         <w:rPr>
           <w:i/>
@@ -5416,11 +4830,9 @@
         </w:rPr>
         <w:t>convertNumberToWord</w:t>
       </w:r>
-      <w:proofErr w:type="spellEnd"/>
       <w:r>
         <w:t>(</w:t>
       </w:r>
-      <w:proofErr w:type="spellStart"/>
       <w:r>
         <w:rPr>
           <w:i/>
@@ -5428,7 +4840,6 @@
         </w:rPr>
         <w:t>getFirstDigit</w:t>
       </w:r>
-      <w:proofErr w:type="spellEnd"/>
       <w:r>
         <w:t>(number))).append(" Thousand ");</w:t>
       </w:r>
@@ -5439,7 +4850,6 @@
         <w:br/>
         <w:t xml:space="preserve">        return </w:t>
       </w:r>
-      <w:proofErr w:type="spellStart"/>
       <w:r>
         <w:rPr>
           <w:i/>
@@ -5447,11 +4857,9 @@
         </w:rPr>
         <w:t>numberToWords</w:t>
       </w:r>
-      <w:proofErr w:type="spellEnd"/>
       <w:r>
         <w:t>(</w:t>
       </w:r>
-      <w:proofErr w:type="spellStart"/>
       <w:r>
         <w:rPr>
           <w:i/>
@@ -5459,7 +4867,6 @@
         </w:rPr>
         <w:t>removeFirstDigit</w:t>
       </w:r>
-      <w:proofErr w:type="spellEnd"/>
       <w:r>
         <w:t>(number), str);</w:t>
       </w:r>
@@ -5484,17 +4891,8 @@
       </w:r>
       <w:r>
         <w:br/>
-        <w:t xml:space="preserve">        </w:t>
-      </w:r>
-      <w:proofErr w:type="spellStart"/>
-      <w:r>
-        <w:t>str.append</w:t>
-      </w:r>
-      <w:proofErr w:type="spellEnd"/>
-      <w:r>
-        <w:t>(</w:t>
-      </w:r>
-      <w:proofErr w:type="spellStart"/>
+        <w:t xml:space="preserve">        str.append(</w:t>
+      </w:r>
       <w:r>
         <w:rPr>
           <w:i/>
@@ -5502,11 +4900,9 @@
         </w:rPr>
         <w:t>convertNumberToWord</w:t>
       </w:r>
-      <w:proofErr w:type="spellEnd"/>
       <w:r>
         <w:t>(</w:t>
       </w:r>
-      <w:proofErr w:type="spellStart"/>
       <w:r>
         <w:rPr>
           <w:i/>
@@ -5514,7 +4910,6 @@
         </w:rPr>
         <w:t>getFirstDigit</w:t>
       </w:r>
-      <w:proofErr w:type="spellEnd"/>
       <w:r>
         <w:t>(number))).append(" Hundred ");</w:t>
       </w:r>
@@ -5522,7 +4917,6 @@
         <w:br/>
         <w:t xml:space="preserve">        return </w:t>
       </w:r>
-      <w:proofErr w:type="spellStart"/>
       <w:r>
         <w:rPr>
           <w:i/>
@@ -5530,11 +4924,9 @@
         </w:rPr>
         <w:t>numberToWords</w:t>
       </w:r>
-      <w:proofErr w:type="spellEnd"/>
       <w:r>
         <w:t>(</w:t>
       </w:r>
-      <w:proofErr w:type="spellStart"/>
       <w:r>
         <w:rPr>
           <w:i/>
@@ -5542,7 +4934,6 @@
         </w:rPr>
         <w:t>removeFirstDigit</w:t>
       </w:r>
-      <w:proofErr w:type="spellEnd"/>
       <w:r>
         <w:t>(number), str);</w:t>
       </w:r>
@@ -5570,17 +4961,8 @@
       </w:r>
       <w:r>
         <w:br/>
-        <w:t xml:space="preserve">        </w:t>
-      </w:r>
-      <w:proofErr w:type="spellStart"/>
-      <w:r>
-        <w:t>str.append</w:t>
-      </w:r>
-      <w:proofErr w:type="spellEnd"/>
-      <w:r>
-        <w:t>(</w:t>
-      </w:r>
-      <w:proofErr w:type="spellStart"/>
+        <w:t xml:space="preserve">        str.append(</w:t>
+      </w:r>
       <w:r>
         <w:rPr>
           <w:i/>
@@ -5588,7 +4970,6 @@
         </w:rPr>
         <w:t>convertTensToWord</w:t>
       </w:r>
-      <w:proofErr w:type="spellEnd"/>
       <w:r>
         <w:t>(number)).append(" ");</w:t>
       </w:r>
@@ -5596,7 +4977,6 @@
         <w:br/>
         <w:t xml:space="preserve">        return </w:t>
       </w:r>
-      <w:proofErr w:type="spellStart"/>
       <w:r>
         <w:rPr>
           <w:i/>
@@ -5604,11 +4984,9 @@
         </w:rPr>
         <w:t>numberToWords</w:t>
       </w:r>
-      <w:proofErr w:type="spellEnd"/>
       <w:r>
         <w:t>(</w:t>
       </w:r>
-      <w:proofErr w:type="spellStart"/>
       <w:r>
         <w:rPr>
           <w:i/>
@@ -5616,7 +4994,6 @@
         </w:rPr>
         <w:t>removeFirstDigit</w:t>
       </w:r>
-      <w:proofErr w:type="spellEnd"/>
       <w:r>
         <w:t>(number), str);</w:t>
       </w:r>
@@ -5641,17 +5018,8 @@
       </w:r>
       <w:r>
         <w:br/>
-        <w:t xml:space="preserve">        </w:t>
-      </w:r>
-      <w:proofErr w:type="spellStart"/>
-      <w:r>
-        <w:t>str.append</w:t>
-      </w:r>
-      <w:proofErr w:type="spellEnd"/>
-      <w:r>
-        <w:t>(</w:t>
-      </w:r>
-      <w:proofErr w:type="spellStart"/>
+        <w:t xml:space="preserve">        str.append(</w:t>
+      </w:r>
       <w:r>
         <w:rPr>
           <w:i/>
@@ -5659,21 +5027,12 @@
         </w:rPr>
         <w:t>convertTeensToWord</w:t>
       </w:r>
-      <w:proofErr w:type="spellEnd"/>
       <w:r>
         <w:t>(number)).append(" ");</w:t>
       </w:r>
       <w:r>
         <w:br/>
-        <w:t xml:space="preserve">        return </w:t>
-      </w:r>
-      <w:proofErr w:type="spellStart"/>
-      <w:r>
-        <w:t>str.toString</w:t>
-      </w:r>
-      <w:proofErr w:type="spellEnd"/>
-      <w:r>
-        <w:t>().trim();</w:t>
+        <w:t xml:space="preserve">        return str.toString().trim();</w:t>
       </w:r>
       <w:r>
         <w:br/>
@@ -5696,17 +5055,8 @@
       </w:r>
       <w:r>
         <w:br/>
-        <w:t xml:space="preserve">        </w:t>
-      </w:r>
-      <w:proofErr w:type="spellStart"/>
-      <w:r>
-        <w:t>str.append</w:t>
-      </w:r>
-      <w:proofErr w:type="spellEnd"/>
-      <w:r>
-        <w:t>(</w:t>
-      </w:r>
-      <w:proofErr w:type="spellStart"/>
+        <w:t xml:space="preserve">        str.append(</w:t>
+      </w:r>
       <w:r>
         <w:rPr>
           <w:i/>
@@ -5714,21 +5064,12 @@
         </w:rPr>
         <w:t>convertNumberToWord</w:t>
       </w:r>
-      <w:proofErr w:type="spellEnd"/>
       <w:r>
         <w:t>(number)).append(" ");</w:t>
       </w:r>
       <w:r>
         <w:br/>
-        <w:t xml:space="preserve">        return </w:t>
-      </w:r>
-      <w:proofErr w:type="spellStart"/>
-      <w:r>
-        <w:t>str.toString</w:t>
-      </w:r>
-      <w:proofErr w:type="spellEnd"/>
-      <w:r>
-        <w:t>().trim();</w:t>
+        <w:t xml:space="preserve">        return str.toString().trim();</w:t>
       </w:r>
       <w:r>
         <w:br/>
@@ -5739,15 +5080,7 @@
       </w:r>
       <w:r>
         <w:br/>
-        <w:t xml:space="preserve">    if (</w:t>
-      </w:r>
-      <w:proofErr w:type="spellStart"/>
-      <w:r>
-        <w:t>str.isEmpty</w:t>
-      </w:r>
-      <w:proofErr w:type="spellEnd"/>
-      <w:r>
-        <w:t>())</w:t>
+        <w:t xml:space="preserve">    if (str.isEmpty())</w:t>
       </w:r>
       <w:r>
         <w:br/>
@@ -5755,17 +5088,8 @@
       </w:r>
       <w:r>
         <w:br/>
-        <w:t xml:space="preserve">        </w:t>
-      </w:r>
-      <w:proofErr w:type="spellStart"/>
-      <w:r>
-        <w:t>str.append</w:t>
-      </w:r>
-      <w:proofErr w:type="spellEnd"/>
-      <w:r>
-        <w:t>(</w:t>
-      </w:r>
-      <w:proofErr w:type="spellStart"/>
+        <w:t xml:space="preserve">        str.append(</w:t>
+      </w:r>
       <w:r>
         <w:rPr>
           <w:i/>
@@ -5773,21 +5097,12 @@
         </w:rPr>
         <w:t>convertNumberToWord</w:t>
       </w:r>
-      <w:proofErr w:type="spellEnd"/>
       <w:r>
         <w:t>(0)).append(" ");</w:t>
       </w:r>
       <w:r>
         <w:br/>
-        <w:t xml:space="preserve">        return </w:t>
-      </w:r>
-      <w:proofErr w:type="spellStart"/>
-      <w:r>
-        <w:t>str.toString</w:t>
-      </w:r>
-      <w:proofErr w:type="spellEnd"/>
-      <w:r>
-        <w:t>().trim();</w:t>
+        <w:t xml:space="preserve">        return str.toString().trim();</w:t>
       </w:r>
       <w:r>
         <w:br/>
@@ -5798,15 +5113,7 @@
       </w:r>
       <w:r>
         <w:br/>
-        <w:t xml:space="preserve">    return </w:t>
-      </w:r>
-      <w:proofErr w:type="spellStart"/>
-      <w:r>
-        <w:t>str.toString</w:t>
-      </w:r>
-      <w:proofErr w:type="spellEnd"/>
-      <w:r>
-        <w:t>().trim();</w:t>
+        <w:t xml:space="preserve">    return str.toString().trim();</w:t>
       </w:r>
       <w:r>
         <w:br/>
@@ -5818,15 +5125,7 @@
         <w:pStyle w:val="Pseoudocode"/>
       </w:pPr>
       <w:r>
-        <w:t xml:space="preserve">private static String </w:t>
-      </w:r>
-      <w:proofErr w:type="spellStart"/>
-      <w:r>
-        <w:t>convertNumberToWord</w:t>
-      </w:r>
-      <w:proofErr w:type="spellEnd"/>
-      <w:r>
-        <w:t>(int number)</w:t>
+        <w:t>private static String convertNumberToWord(int number)</w:t>
       </w:r>
       <w:r>
         <w:br/>
@@ -5842,15 +5141,7 @@
       </w:r>
       <w:r>
         <w:br/>
-        <w:t xml:space="preserve">        throw new </w:t>
-      </w:r>
-      <w:proofErr w:type="spellStart"/>
-      <w:r>
-        <w:t>IllegalArgumentException</w:t>
-      </w:r>
-      <w:proofErr w:type="spellEnd"/>
-      <w:r>
-        <w:t>("Number must be between 0 and 9");</w:t>
+        <w:t xml:space="preserve">        throw new IllegalArgumentException("Number must be between 0 and 9");</w:t>
       </w:r>
       <w:r>
         <w:br/>
@@ -5894,15 +5185,7 @@
       </w:r>
       <w:r>
         <w:br/>
-        <w:t xml:space="preserve">private static String </w:t>
-      </w:r>
-      <w:proofErr w:type="spellStart"/>
-      <w:r>
-        <w:t>convertTeensToWord</w:t>
-      </w:r>
-      <w:proofErr w:type="spellEnd"/>
-      <w:r>
-        <w:t>(int number)</w:t>
+        <w:t>private static String convertTeensToWord(int number)</w:t>
       </w:r>
       <w:r>
         <w:br/>
@@ -5918,15 +5201,7 @@
       </w:r>
       <w:r>
         <w:br/>
-        <w:t xml:space="preserve">        throw new </w:t>
-      </w:r>
-      <w:proofErr w:type="spellStart"/>
-      <w:r>
-        <w:t>IllegalArgumentException</w:t>
-      </w:r>
-      <w:proofErr w:type="spellEnd"/>
-      <w:r>
-        <w:t>("Number must be between 10 and 19");</w:t>
+        <w:t xml:space="preserve">        throw new IllegalArgumentException("Number must be between 10 and 19");</w:t>
       </w:r>
       <w:r>
         <w:br/>
@@ -5967,15 +5242,7 @@
       </w:r>
       <w:r>
         <w:br/>
-        <w:t xml:space="preserve">private static String </w:t>
-      </w:r>
-      <w:proofErr w:type="spellStart"/>
-      <w:r>
-        <w:t>convertTensToWord</w:t>
-      </w:r>
-      <w:proofErr w:type="spellEnd"/>
-      <w:r>
-        <w:t>(int number)</w:t>
+        <w:t>private static String convertTensToWord(int number)</w:t>
       </w:r>
       <w:r>
         <w:br/>
@@ -5991,15 +5258,7 @@
       </w:r>
       <w:r>
         <w:br/>
-        <w:t xml:space="preserve">        throw new </w:t>
-      </w:r>
-      <w:proofErr w:type="spellStart"/>
-      <w:r>
-        <w:t>IllegalArgumentException</w:t>
-      </w:r>
-      <w:proofErr w:type="spellEnd"/>
-      <w:r>
-        <w:t>("Number must be between 10 and 99");</w:t>
+        <w:t xml:space="preserve">        throw new IllegalArgumentException("Number must be between 10 and 99");</w:t>
       </w:r>
       <w:r>
         <w:br/>
@@ -6040,15 +5299,7 @@
       </w:r>
       <w:r>
         <w:br/>
-        <w:t xml:space="preserve">private static int </w:t>
-      </w:r>
-      <w:proofErr w:type="spellStart"/>
-      <w:r>
-        <w:t>getFirstDigit</w:t>
-      </w:r>
-      <w:proofErr w:type="spellEnd"/>
-      <w:r>
-        <w:t>(int number)</w:t>
+        <w:t>private static int getFirstDigit(int number)</w:t>
       </w:r>
       <w:r>
         <w:br/>
@@ -6086,15 +5337,7 @@
       </w:r>
       <w:r>
         <w:br/>
-        <w:t xml:space="preserve">private static int </w:t>
-      </w:r>
-      <w:proofErr w:type="spellStart"/>
-      <w:r>
-        <w:t>getLastDigit</w:t>
-      </w:r>
-      <w:proofErr w:type="spellEnd"/>
-      <w:r>
-        <w:t>(int number)</w:t>
+        <w:t>private static int getLastDigit(int number)</w:t>
       </w:r>
       <w:r>
         <w:br/>
@@ -6113,15 +5356,7 @@
       </w:r>
       <w:r>
         <w:br/>
-        <w:t xml:space="preserve">public static int </w:t>
-      </w:r>
-      <w:proofErr w:type="spellStart"/>
-      <w:r>
-        <w:t>removeFirstDigit</w:t>
-      </w:r>
-      <w:proofErr w:type="spellEnd"/>
-      <w:r>
-        <w:t>(int number)</w:t>
+        <w:t>public static int removeFirstDigit(int number)</w:t>
       </w:r>
       <w:r>
         <w:br/>
@@ -6169,6 +5404,7 @@
           <w:lang w:val="en-AT"/>
         </w:rPr>
       </w:pPr>
+      <w:bookmarkStart w:id="25" w:name="_Toc219892569"/>
       <w:r>
         <w:t xml:space="preserve">Figure </w:t>
       </w:r>
@@ -6193,15 +5429,18 @@
       <w:r>
         <w:t>: Convert number to words</w:t>
       </w:r>
+      <w:bookmarkEnd w:id="25"/>
     </w:p>
     <w:p/>
     <w:p>
       <w:pPr>
         <w:pStyle w:val="Heading2"/>
       </w:pPr>
+      <w:bookmarkStart w:id="26" w:name="_Toc219892590"/>
       <w:r>
         <w:t>Test</w:t>
       </w:r>
+      <w:bookmarkEnd w:id="26"/>
     </w:p>
     <w:p>
       <w:pPr>
@@ -6326,21 +5565,14 @@
       </w:pPr>
       <w:r>
         <w:lastRenderedPageBreak/>
-        <w:t xml:space="preserve">9999   -&gt; Nine Thousand Nine Hundred </w:t>
-      </w:r>
-      <w:proofErr w:type="spellStart"/>
-      <w:r>
-        <w:t>Ninety</w:t>
-      </w:r>
-      <w:proofErr w:type="spellEnd"/>
-      <w:r>
-        <w:t xml:space="preserve"> Nine</w:t>
+        <w:t>9999   -&gt; Nine Thousand Nine Hundred Ninety Nine</w:t>
       </w:r>
     </w:p>
     <w:p>
       <w:pPr>
         <w:pStyle w:val="Caption"/>
       </w:pPr>
+      <w:bookmarkStart w:id="27" w:name="_Toc219892570"/>
       <w:r>
         <w:t xml:space="preserve">Figure </w:t>
       </w:r>
@@ -6365,6 +5597,7 @@
       <w:r>
         <w:t>: number conversion test</w:t>
       </w:r>
+      <w:bookmarkEnd w:id="27"/>
     </w:p>
     <w:p>
       <w:pPr>
@@ -6378,6 +5611,7 @@
       <w:pPr>
         <w:pStyle w:val="Heading1"/>
       </w:pPr>
+      <w:bookmarkStart w:id="28" w:name="_Toc219892591"/>
       <w:r>
         <w:lastRenderedPageBreak/>
         <w:t xml:space="preserve">Exercise </w:t>
@@ -6391,26 +5625,21 @@
       <w:r>
         <w:t>Tribonacci</w:t>
       </w:r>
+      <w:bookmarkEnd w:id="28"/>
     </w:p>
     <w:p>
       <w:pPr>
         <w:pStyle w:val="Heading2"/>
       </w:pPr>
+      <w:bookmarkStart w:id="29" w:name="_Toc219892592"/>
       <w:r>
         <w:t>Solution Idea</w:t>
       </w:r>
-    </w:p>
-    <w:p>
-      <w:r>
-        <w:t xml:space="preserve">Tribonacci is very similar to Fibonacci, so I just updated the </w:t>
-      </w:r>
-      <w:proofErr w:type="spellStart"/>
-      <w:r>
-        <w:t>memoized</w:t>
-      </w:r>
-      <w:proofErr w:type="spellEnd"/>
-      <w:r>
-        <w:t xml:space="preserve"> Fibonacci methods for Tribonacci. </w:t>
+      <w:bookmarkEnd w:id="29"/>
+    </w:p>
+    <w:p>
+      <w:r>
+        <w:t xml:space="preserve">Tribonacci is very similar to Fibonacci, so I just updated the memoized Fibonacci methods for Tribonacci. </w:t>
       </w:r>
     </w:p>
     <w:p>
@@ -6422,24 +5651,18 @@
       <w:pPr>
         <w:pStyle w:val="Heading2"/>
       </w:pPr>
+      <w:bookmarkStart w:id="30" w:name="_Toc219892593"/>
       <w:r>
         <w:t>Code</w:t>
       </w:r>
-    </w:p>
-    <w:p>
-      <w:pPr>
-        <w:pStyle w:val="Pseoudocode"/>
-      </w:pPr>
-      <w:r>
-        <w:t xml:space="preserve">private static int </w:t>
-      </w:r>
-      <w:proofErr w:type="spellStart"/>
-      <w:r>
-        <w:t>tribonacciMemoized</w:t>
-      </w:r>
-      <w:proofErr w:type="spellEnd"/>
-      <w:r>
-        <w:t>(int n, int[] memo)</w:t>
+      <w:bookmarkEnd w:id="30"/>
+    </w:p>
+    <w:p>
+      <w:pPr>
+        <w:pStyle w:val="Pseoudocode"/>
+      </w:pPr>
+      <w:r>
+        <w:t>private static int tribonacciMemoized(int n, int[] memo)</w:t>
       </w:r>
       <w:r>
         <w:br/>
@@ -6485,15 +5708,7 @@
       </w:r>
       <w:r>
         <w:br/>
-        <w:t xml:space="preserve">    if (n &gt;= </w:t>
-      </w:r>
-      <w:proofErr w:type="spellStart"/>
-      <w:r>
-        <w:t>memo.length</w:t>
-      </w:r>
-      <w:proofErr w:type="spellEnd"/>
-      <w:r>
-        <w:t>)</w:t>
+        <w:t xml:space="preserve">    if (n &gt;= memo.length)</w:t>
       </w:r>
       <w:r>
         <w:br/>
@@ -6503,7 +5718,6 @@
         <w:br/>
         <w:t xml:space="preserve">        return </w:t>
       </w:r>
-      <w:proofErr w:type="spellStart"/>
       <w:r>
         <w:rPr>
           <w:i/>
@@ -6511,11 +5725,9 @@
         </w:rPr>
         <w:t>tribonacciMemoized</w:t>
       </w:r>
-      <w:proofErr w:type="spellEnd"/>
       <w:r>
         <w:t xml:space="preserve">(n - 1, memo) + </w:t>
       </w:r>
-      <w:proofErr w:type="spellStart"/>
       <w:r>
         <w:rPr>
           <w:i/>
@@ -6523,11 +5735,9 @@
         </w:rPr>
         <w:t>tribonacciMemoized</w:t>
       </w:r>
-      <w:proofErr w:type="spellEnd"/>
       <w:r>
         <w:t xml:space="preserve">(n - 2, memo) + </w:t>
       </w:r>
-      <w:proofErr w:type="spellStart"/>
       <w:r>
         <w:rPr>
           <w:i/>
@@ -6535,7 +5745,6 @@
         </w:rPr>
         <w:t>tribonacciMemoized</w:t>
       </w:r>
-      <w:proofErr w:type="spellEnd"/>
       <w:r>
         <w:t>(n - 3, memo);</w:t>
       </w:r>
@@ -6571,7 +5780,6 @@
         <w:br/>
         <w:t xml:space="preserve">        memo[n] = </w:t>
       </w:r>
-      <w:proofErr w:type="spellStart"/>
       <w:r>
         <w:rPr>
           <w:i/>
@@ -6579,11 +5787,9 @@
         </w:rPr>
         <w:t>tribonacciMemoized</w:t>
       </w:r>
-      <w:proofErr w:type="spellEnd"/>
       <w:r>
         <w:t xml:space="preserve">(n - 1, memo) + </w:t>
       </w:r>
-      <w:proofErr w:type="spellStart"/>
       <w:r>
         <w:rPr>
           <w:i/>
@@ -6591,11 +5797,9 @@
         </w:rPr>
         <w:t>tribonacciMemoized</w:t>
       </w:r>
-      <w:proofErr w:type="spellEnd"/>
       <w:r>
         <w:t xml:space="preserve">(n - 2, memo) + </w:t>
       </w:r>
-      <w:proofErr w:type="spellStart"/>
       <w:r>
         <w:rPr>
           <w:i/>
@@ -6603,7 +5807,6 @@
         </w:rPr>
         <w:t>tribonacciMemoized</w:t>
       </w:r>
-      <w:proofErr w:type="spellEnd"/>
       <w:r>
         <w:t>(n - 3, memo);</w:t>
       </w:r>
@@ -6624,6 +5827,7 @@
       <w:pPr>
         <w:pStyle w:val="Caption"/>
       </w:pPr>
+      <w:bookmarkStart w:id="31" w:name="_Toc219892571"/>
       <w:r>
         <w:t xml:space="preserve">Figure </w:t>
       </w:r>
@@ -6648,6 +5852,7 @@
       <w:r>
         <w:t>: Tribonacci</w:t>
       </w:r>
+      <w:bookmarkEnd w:id="31"/>
     </w:p>
     <w:p>
       <w:pPr>
@@ -6660,9 +5865,11 @@
       <w:pPr>
         <w:pStyle w:val="Heading2"/>
       </w:pPr>
+      <w:bookmarkStart w:id="32" w:name="_Toc219892594"/>
       <w:r>
         <w:t>Test</w:t>
       </w:r>
+      <w:bookmarkEnd w:id="32"/>
     </w:p>
     <w:p>
       <w:pPr>
@@ -6677,23 +5884,7 @@
         <w:pStyle w:val="Pseoudocode"/>
       </w:pPr>
       <w:r>
-        <w:t xml:space="preserve">=== </w:t>
-      </w:r>
-      <w:proofErr w:type="spellStart"/>
-      <w:r>
-        <w:t>Tribonacci</w:t>
-      </w:r>
-      <w:proofErr w:type="spellEnd"/>
-      <w:r>
-        <w:t xml:space="preserve"> </w:t>
-      </w:r>
-      <w:proofErr w:type="spellStart"/>
-      <w:r>
-        <w:t>Sequence</w:t>
-      </w:r>
-      <w:proofErr w:type="spellEnd"/>
-      <w:r>
-        <w:t xml:space="preserve"> ===</w:t>
+        <w:t>=== Tribonacci Sequence ===</w:t>
       </w:r>
     </w:p>
     <w:p>
@@ -6833,6 +6024,7 @@
       <w:pPr>
         <w:pStyle w:val="Caption"/>
       </w:pPr>
+      <w:bookmarkStart w:id="33" w:name="_Toc219892572"/>
       <w:r>
         <w:t xml:space="preserve">Figure </w:t>
       </w:r>
@@ -6855,16 +6047,9 @@
         <w:fldChar w:fldCharType="end"/>
       </w:r>
       <w:r>
-        <w:t xml:space="preserve">: </w:t>
-      </w:r>
-      <w:proofErr w:type="spellStart"/>
-      <w:r>
-        <w:t>tribonacci</w:t>
-      </w:r>
-      <w:proofErr w:type="spellEnd"/>
-      <w:r>
-        <w:t xml:space="preserve"> test</w:t>
-      </w:r>
+        <w:t>: tribonacci test</w:t>
+      </w:r>
+      <w:bookmarkEnd w:id="33"/>
     </w:p>
     <w:sectPr>
       <w:headerReference w:type="default" r:id="rId8"/>

</xml_diff>